<commit_message>
Add faculty guide name to internship report
Co-Authored-By: Claude Opus 5.5 <noreply@anthropic.com>
</commit_message>
<xml_diff>
--- a/Rutuja_Soundale_Internship_Report.docx
+++ b/Rutuja_Soundale_Internship_Report.docx
@@ -168,7 +168,7 @@
         <w:jc w:val="center"/>
       </w:pPr>
       <w:r>
-        <w:t>[Faculty Guide Name]          Faculty Guide</w:t>
+        <w:t>Dr. Parshuram Arotale          Faculty Guide</w:t>
       </w:r>
     </w:p>
     <w:p>
@@ -252,7 +252,7 @@
         <w:pageBreakBefore/>
         <w:jc w:val="center"/>
       </w:pPr>
-      <w:bookmarkStart w:id="0" w:name="_Toc243774062"/>
+      <w:bookmarkStart w:id="0" w:name="_Toc243774488"/>
       <w:r>
         <w:lastRenderedPageBreak/>
         <w:t>CERTIFICATE</w:t>
@@ -333,7 +333,7 @@
       </w:r>
       <w:r>
         <w:tab/>
-        <w:t>[Faculty Guide Name]</w:t>
+        <w:t>Dr. Parshuram Arotale</w:t>
       </w:r>
     </w:p>
     <w:p>
@@ -455,7 +455,7 @@
         <w:pageBreakBefore/>
         <w:jc w:val="center"/>
       </w:pPr>
-      <w:bookmarkStart w:id="1" w:name="_Toc243774063"/>
+      <w:bookmarkStart w:id="1" w:name="_Toc243774489"/>
       <w:r>
         <w:lastRenderedPageBreak/>
         <w:t>ACKNOWLEDGEMENT</w:t>
@@ -486,7 +486,7 @@
         <w:jc w:val="both"/>
       </w:pPr>
       <w:r>
-        <w:t>I am grateful to my faculty guide, [Faculty Guide Name], for the guidance and encouragement given during the internship and in the preparation of this report.</w:t>
+        <w:t>I am grateful to my faculty guide, Dr. Parshuram Arotale, for the guidance and encouragement given during the internship and in the preparation of this report.</w:t>
       </w:r>
     </w:p>
     <w:p>
@@ -528,7 +528,7 @@
         <w:pageBreakBefore/>
         <w:jc w:val="center"/>
       </w:pPr>
-      <w:bookmarkStart w:id="2" w:name="_Toc243774064"/>
+      <w:bookmarkStart w:id="2" w:name="_Toc243774490"/>
       <w:r>
         <w:lastRenderedPageBreak/>
         <w:t>ABSTRACT</w:t>
@@ -599,7 +599,7 @@
         <w:pageBreakBefore/>
         <w:jc w:val="center"/>
       </w:pPr>
-      <w:bookmarkStart w:id="3" w:name="_Toc243774065"/>
+      <w:bookmarkStart w:id="3" w:name="_Toc243774491"/>
       <w:r>
         <w:lastRenderedPageBreak/>
         <w:t>DECLARATION</w:t>
@@ -671,7 +671,7 @@
         <w:pageBreakBefore/>
         <w:jc w:val="center"/>
       </w:pPr>
-      <w:bookmarkStart w:id="4" w:name="_Toc243774066"/>
+      <w:bookmarkStart w:id="4" w:name="_Toc243774492"/>
       <w:r>
         <w:lastRenderedPageBreak/>
         <w:t>CONTENTS</w:t>
@@ -681,7 +681,7 @@
     <w:sdt>
       <w:sdtPr>
         <w:alias w:val="Contents"/>
-        <w:id w:val="-968666063"/>
+        <w:id w:val="1899009902"/>
       </w:sdtPr>
       <w:sdtEndPr/>
       <w:sdtContent>
@@ -707,7 +707,7 @@
           <w:r>
             <w:fldChar w:fldCharType="separate"/>
           </w:r>
-          <w:hyperlink w:anchor="_Toc243774062" w:history="1">
+          <w:hyperlink w:anchor="_Toc243774488" w:history="1">
             <w:r>
               <w:rPr>
                 <w:rStyle w:val="Hyperlink"/>
@@ -731,7 +731,7 @@
               <w:rPr>
                 <w:noProof/>
               </w:rPr>
-              <w:instrText xml:space="preserve"> PAGEREF _Toc243774062 \h </w:instrText>
+              <w:instrText xml:space="preserve"> PAGEREF _Toc243774488 \h </w:instrText>
             </w:r>
             <w:r>
               <w:rPr>
@@ -771,7 +771,7 @@
               <w14:ligatures w14:val="standardContextual"/>
             </w:rPr>
           </w:pPr>
-          <w:hyperlink w:anchor="_Toc243774063" w:history="1">
+          <w:hyperlink w:anchor="_Toc243774489" w:history="1">
             <w:r>
               <w:rPr>
                 <w:rStyle w:val="Hyperlink"/>
@@ -795,7 +795,7 @@
               <w:rPr>
                 <w:noProof/>
               </w:rPr>
-              <w:instrText xml:space="preserve"> PAGEREF _Toc243774063 \h </w:instrText>
+              <w:instrText xml:space="preserve"> PAGEREF _Toc243774489 \h </w:instrText>
             </w:r>
             <w:r>
               <w:rPr>
@@ -835,7 +835,7 @@
               <w14:ligatures w14:val="standardContextual"/>
             </w:rPr>
           </w:pPr>
-          <w:hyperlink w:anchor="_Toc243774064" w:history="1">
+          <w:hyperlink w:anchor="_Toc243774490" w:history="1">
             <w:r>
               <w:rPr>
                 <w:rStyle w:val="Hyperlink"/>
@@ -859,7 +859,7 @@
               <w:rPr>
                 <w:noProof/>
               </w:rPr>
-              <w:instrText xml:space="preserve"> PAGEREF _Toc243774064 \h </w:instrText>
+              <w:instrText xml:space="preserve"> PAGEREF _Toc243774490 \h </w:instrText>
             </w:r>
             <w:r>
               <w:rPr>
@@ -899,7 +899,7 @@
               <w14:ligatures w14:val="standardContextual"/>
             </w:rPr>
           </w:pPr>
-          <w:hyperlink w:anchor="_Toc243774065" w:history="1">
+          <w:hyperlink w:anchor="_Toc243774491" w:history="1">
             <w:r>
               <w:rPr>
                 <w:rStyle w:val="Hyperlink"/>
@@ -923,7 +923,7 @@
               <w:rPr>
                 <w:noProof/>
               </w:rPr>
-              <w:instrText xml:space="preserve"> PAGEREF _Toc243774065 \h </w:instrText>
+              <w:instrText xml:space="preserve"> PAGEREF _Toc243774491 \h </w:instrText>
             </w:r>
             <w:r>
               <w:rPr>
@@ -963,7 +963,7 @@
               <w14:ligatures w14:val="standardContextual"/>
             </w:rPr>
           </w:pPr>
-          <w:hyperlink w:anchor="_Toc243774066" w:history="1">
+          <w:hyperlink w:anchor="_Toc243774492" w:history="1">
             <w:r>
               <w:rPr>
                 <w:rStyle w:val="Hyperlink"/>
@@ -987,7 +987,7 @@
               <w:rPr>
                 <w:noProof/>
               </w:rPr>
-              <w:instrText xml:space="preserve"> PAGEREF _Toc243774066 \h </w:instrText>
+              <w:instrText xml:space="preserve"> PAGEREF _Toc243774492 \h </w:instrText>
             </w:r>
             <w:r>
               <w:rPr>
@@ -1027,7 +1027,7 @@
               <w14:ligatures w14:val="standardContextual"/>
             </w:rPr>
           </w:pPr>
-          <w:hyperlink w:anchor="_Toc243774067" w:history="1">
+          <w:hyperlink w:anchor="_Toc243774493" w:history="1">
             <w:r>
               <w:rPr>
                 <w:rStyle w:val="Hyperlink"/>
@@ -1051,7 +1051,7 @@
               <w:rPr>
                 <w:noProof/>
               </w:rPr>
-              <w:instrText xml:space="preserve"> PAGEREF _Toc243774067 \h </w:instrText>
+              <w:instrText xml:space="preserve"> PAGEREF _Toc243774493 \h </w:instrText>
             </w:r>
             <w:r>
               <w:rPr>
@@ -1091,7 +1091,7 @@
               <w14:ligatures w14:val="standardContextual"/>
             </w:rPr>
           </w:pPr>
-          <w:hyperlink w:anchor="_Toc243774068" w:history="1">
+          <w:hyperlink w:anchor="_Toc243774494" w:history="1">
             <w:r>
               <w:rPr>
                 <w:rStyle w:val="Hyperlink"/>
@@ -1115,7 +1115,7 @@
               <w:rPr>
                 <w:noProof/>
               </w:rPr>
-              <w:instrText xml:space="preserve"> PAGEREF _Toc243774068 \h </w:instrText>
+              <w:instrText xml:space="preserve"> PAGEREF _Toc243774494 \h </w:instrText>
             </w:r>
             <w:r>
               <w:rPr>
@@ -1155,7 +1155,7 @@
               <w14:ligatures w14:val="standardContextual"/>
             </w:rPr>
           </w:pPr>
-          <w:hyperlink w:anchor="_Toc243774069" w:history="1">
+          <w:hyperlink w:anchor="_Toc243774495" w:history="1">
             <w:r>
               <w:rPr>
                 <w:rStyle w:val="Hyperlink"/>
@@ -1179,7 +1179,7 @@
               <w:rPr>
                 <w:noProof/>
               </w:rPr>
-              <w:instrText xml:space="preserve"> PAGEREF _Toc243774069 \h </w:instrText>
+              <w:instrText xml:space="preserve"> PAGEREF _Toc243774495 \h </w:instrText>
             </w:r>
             <w:r>
               <w:rPr>
@@ -1219,7 +1219,7 @@
               <w14:ligatures w14:val="standardContextual"/>
             </w:rPr>
           </w:pPr>
-          <w:hyperlink w:anchor="_Toc243774070" w:history="1">
+          <w:hyperlink w:anchor="_Toc243774496" w:history="1">
             <w:r>
               <w:rPr>
                 <w:rStyle w:val="Hyperlink"/>
@@ -1243,7 +1243,7 @@
               <w:rPr>
                 <w:noProof/>
               </w:rPr>
-              <w:instrText xml:space="preserve"> PAGEREF _Toc243774070 \h </w:instrText>
+              <w:instrText xml:space="preserve"> PAGEREF _Toc243774496 \h </w:instrText>
             </w:r>
             <w:r>
               <w:rPr>
@@ -1283,7 +1283,7 @@
               <w14:ligatures w14:val="standardContextual"/>
             </w:rPr>
           </w:pPr>
-          <w:hyperlink w:anchor="_Toc243774071" w:history="1">
+          <w:hyperlink w:anchor="_Toc243774497" w:history="1">
             <w:r>
               <w:rPr>
                 <w:rStyle w:val="Hyperlink"/>
@@ -1307,7 +1307,7 @@
               <w:rPr>
                 <w:noProof/>
               </w:rPr>
-              <w:instrText xml:space="preserve"> PAGEREF _Toc243774071 \h </w:instrText>
+              <w:instrText xml:space="preserve"> PAGEREF _Toc243774497 \h </w:instrText>
             </w:r>
             <w:r>
               <w:rPr>
@@ -1347,7 +1347,7 @@
               <w14:ligatures w14:val="standardContextual"/>
             </w:rPr>
           </w:pPr>
-          <w:hyperlink w:anchor="_Toc243774072" w:history="1">
+          <w:hyperlink w:anchor="_Toc243774498" w:history="1">
             <w:r>
               <w:rPr>
                 <w:rStyle w:val="Hyperlink"/>
@@ -1371,7 +1371,7 @@
               <w:rPr>
                 <w:noProof/>
               </w:rPr>
-              <w:instrText xml:space="preserve"> PAGEREF _Toc243774072 \h </w:instrText>
+              <w:instrText xml:space="preserve"> PAGEREF _Toc243774498 \h </w:instrText>
             </w:r>
             <w:r>
               <w:rPr>
@@ -1411,7 +1411,7 @@
               <w14:ligatures w14:val="standardContextual"/>
             </w:rPr>
           </w:pPr>
-          <w:hyperlink w:anchor="_Toc243774073" w:history="1">
+          <w:hyperlink w:anchor="_Toc243774499" w:history="1">
             <w:r>
               <w:rPr>
                 <w:rStyle w:val="Hyperlink"/>
@@ -1435,7 +1435,7 @@
               <w:rPr>
                 <w:noProof/>
               </w:rPr>
-              <w:instrText xml:space="preserve"> PAGEREF _Toc243774073 \h </w:instrText>
+              <w:instrText xml:space="preserve"> PAGEREF _Toc243774499 \h </w:instrText>
             </w:r>
             <w:r>
               <w:rPr>
@@ -1475,7 +1475,7 @@
               <w14:ligatures w14:val="standardContextual"/>
             </w:rPr>
           </w:pPr>
-          <w:hyperlink w:anchor="_Toc243774074" w:history="1">
+          <w:hyperlink w:anchor="_Toc243774500" w:history="1">
             <w:r>
               <w:rPr>
                 <w:rStyle w:val="Hyperlink"/>
@@ -1499,7 +1499,7 @@
               <w:rPr>
                 <w:noProof/>
               </w:rPr>
-              <w:instrText xml:space="preserve"> PAGEREF _Toc243774074 \h </w:instrText>
+              <w:instrText xml:space="preserve"> PAGEREF _Toc243774500 \h </w:instrText>
             </w:r>
             <w:r>
               <w:rPr>
@@ -1539,7 +1539,7 @@
               <w14:ligatures w14:val="standardContextual"/>
             </w:rPr>
           </w:pPr>
-          <w:hyperlink w:anchor="_Toc243774075" w:history="1">
+          <w:hyperlink w:anchor="_Toc243774501" w:history="1">
             <w:r>
               <w:rPr>
                 <w:rStyle w:val="Hyperlink"/>
@@ -1563,7 +1563,7 @@
               <w:rPr>
                 <w:noProof/>
               </w:rPr>
-              <w:instrText xml:space="preserve"> PAGEREF _Toc243774075 \h </w:instrText>
+              <w:instrText xml:space="preserve"> PAGEREF _Toc243774501 \h </w:instrText>
             </w:r>
             <w:r>
               <w:rPr>
@@ -1603,7 +1603,7 @@
               <w14:ligatures w14:val="standardContextual"/>
             </w:rPr>
           </w:pPr>
-          <w:hyperlink w:anchor="_Toc243774076" w:history="1">
+          <w:hyperlink w:anchor="_Toc243774502" w:history="1">
             <w:r>
               <w:rPr>
                 <w:rStyle w:val="Hyperlink"/>
@@ -1627,7 +1627,7 @@
               <w:rPr>
                 <w:noProof/>
               </w:rPr>
-              <w:instrText xml:space="preserve"> PAGEREF _Toc243774076 \h </w:instrText>
+              <w:instrText xml:space="preserve"> PAGEREF _Toc243774502 \h </w:instrText>
             </w:r>
             <w:r>
               <w:rPr>
@@ -1667,7 +1667,7 @@
               <w14:ligatures w14:val="standardContextual"/>
             </w:rPr>
           </w:pPr>
-          <w:hyperlink w:anchor="_Toc243774077" w:history="1">
+          <w:hyperlink w:anchor="_Toc243774503" w:history="1">
             <w:r>
               <w:rPr>
                 <w:rStyle w:val="Hyperlink"/>
@@ -1691,7 +1691,7 @@
               <w:rPr>
                 <w:noProof/>
               </w:rPr>
-              <w:instrText xml:space="preserve"> PAGEREF _Toc243774077 \h </w:instrText>
+              <w:instrText xml:space="preserve"> PAGEREF _Toc243774503 \h </w:instrText>
             </w:r>
             <w:r>
               <w:rPr>
@@ -1731,7 +1731,7 @@
               <w14:ligatures w14:val="standardContextual"/>
             </w:rPr>
           </w:pPr>
-          <w:hyperlink w:anchor="_Toc243774078" w:history="1">
+          <w:hyperlink w:anchor="_Toc243774504" w:history="1">
             <w:r>
               <w:rPr>
                 <w:rStyle w:val="Hyperlink"/>
@@ -1755,7 +1755,7 @@
               <w:rPr>
                 <w:noProof/>
               </w:rPr>
-              <w:instrText xml:space="preserve"> PAGEREF _Toc243774078 \h </w:instrText>
+              <w:instrText xml:space="preserve"> PAGEREF _Toc243774504 \h </w:instrText>
             </w:r>
             <w:r>
               <w:rPr>
@@ -1795,7 +1795,7 @@
               <w14:ligatures w14:val="standardContextual"/>
             </w:rPr>
           </w:pPr>
-          <w:hyperlink w:anchor="_Toc243774079" w:history="1">
+          <w:hyperlink w:anchor="_Toc243774505" w:history="1">
             <w:r>
               <w:rPr>
                 <w:rStyle w:val="Hyperlink"/>
@@ -1819,7 +1819,7 @@
               <w:rPr>
                 <w:noProof/>
               </w:rPr>
-              <w:instrText xml:space="preserve"> PAGEREF _Toc243774079 \h </w:instrText>
+              <w:instrText xml:space="preserve"> PAGEREF _Toc243774505 \h </w:instrText>
             </w:r>
             <w:r>
               <w:rPr>
@@ -1859,7 +1859,7 @@
               <w14:ligatures w14:val="standardContextual"/>
             </w:rPr>
           </w:pPr>
-          <w:hyperlink w:anchor="_Toc243774080" w:history="1">
+          <w:hyperlink w:anchor="_Toc243774506" w:history="1">
             <w:r>
               <w:rPr>
                 <w:rStyle w:val="Hyperlink"/>
@@ -1883,7 +1883,7 @@
               <w:rPr>
                 <w:noProof/>
               </w:rPr>
-              <w:instrText xml:space="preserve"> PAGEREF _Toc243774080 \h </w:instrText>
+              <w:instrText xml:space="preserve"> PAGEREF _Toc243774506 \h </w:instrText>
             </w:r>
             <w:r>
               <w:rPr>
@@ -1923,7 +1923,7 @@
               <w14:ligatures w14:val="standardContextual"/>
             </w:rPr>
           </w:pPr>
-          <w:hyperlink w:anchor="_Toc243774081" w:history="1">
+          <w:hyperlink w:anchor="_Toc243774507" w:history="1">
             <w:r>
               <w:rPr>
                 <w:rStyle w:val="Hyperlink"/>
@@ -1947,7 +1947,7 @@
               <w:rPr>
                 <w:noProof/>
               </w:rPr>
-              <w:instrText xml:space="preserve"> PAGEREF _Toc243774081 \h </w:instrText>
+              <w:instrText xml:space="preserve"> PAGEREF _Toc243774507 \h </w:instrText>
             </w:r>
             <w:r>
               <w:rPr>
@@ -1987,7 +1987,7 @@
               <w14:ligatures w14:val="standardContextual"/>
             </w:rPr>
           </w:pPr>
-          <w:hyperlink w:anchor="_Toc243774082" w:history="1">
+          <w:hyperlink w:anchor="_Toc243774508" w:history="1">
             <w:r>
               <w:rPr>
                 <w:rStyle w:val="Hyperlink"/>
@@ -2011,7 +2011,7 @@
               <w:rPr>
                 <w:noProof/>
               </w:rPr>
-              <w:instrText xml:space="preserve"> PAGEREF _Toc243774082 \h </w:instrText>
+              <w:instrText xml:space="preserve"> PAGEREF _Toc243774508 \h </w:instrText>
             </w:r>
             <w:r>
               <w:rPr>
@@ -2051,7 +2051,7 @@
               <w14:ligatures w14:val="standardContextual"/>
             </w:rPr>
           </w:pPr>
-          <w:hyperlink w:anchor="_Toc243774083" w:history="1">
+          <w:hyperlink w:anchor="_Toc243774509" w:history="1">
             <w:r>
               <w:rPr>
                 <w:rStyle w:val="Hyperlink"/>
@@ -2075,7 +2075,7 @@
               <w:rPr>
                 <w:noProof/>
               </w:rPr>
-              <w:instrText xml:space="preserve"> PAGEREF _Toc243774083 \h </w:instrText>
+              <w:instrText xml:space="preserve"> PAGEREF _Toc243774509 \h </w:instrText>
             </w:r>
             <w:r>
               <w:rPr>
@@ -2115,7 +2115,7 @@
               <w14:ligatures w14:val="standardContextual"/>
             </w:rPr>
           </w:pPr>
-          <w:hyperlink w:anchor="_Toc243774084" w:history="1">
+          <w:hyperlink w:anchor="_Toc243774510" w:history="1">
             <w:r>
               <w:rPr>
                 <w:rStyle w:val="Hyperlink"/>
@@ -2139,7 +2139,7 @@
               <w:rPr>
                 <w:noProof/>
               </w:rPr>
-              <w:instrText xml:space="preserve"> PAGEREF _Toc243774084 \h </w:instrText>
+              <w:instrText xml:space="preserve"> PAGEREF _Toc243774510 \h </w:instrText>
             </w:r>
             <w:r>
               <w:rPr>
@@ -2179,7 +2179,7 @@
               <w14:ligatures w14:val="standardContextual"/>
             </w:rPr>
           </w:pPr>
-          <w:hyperlink w:anchor="_Toc243774085" w:history="1">
+          <w:hyperlink w:anchor="_Toc243774511" w:history="1">
             <w:r>
               <w:rPr>
                 <w:rStyle w:val="Hyperlink"/>
@@ -2203,7 +2203,7 @@
               <w:rPr>
                 <w:noProof/>
               </w:rPr>
-              <w:instrText xml:space="preserve"> PAGEREF _Toc243774085 \h </w:instrText>
+              <w:instrText xml:space="preserve"> PAGEREF _Toc243774511 \h </w:instrText>
             </w:r>
             <w:r>
               <w:rPr>
@@ -2243,7 +2243,7 @@
               <w14:ligatures w14:val="standardContextual"/>
             </w:rPr>
           </w:pPr>
-          <w:hyperlink w:anchor="_Toc243774086" w:history="1">
+          <w:hyperlink w:anchor="_Toc243774512" w:history="1">
             <w:r>
               <w:rPr>
                 <w:rStyle w:val="Hyperlink"/>
@@ -2267,7 +2267,7 @@
               <w:rPr>
                 <w:noProof/>
               </w:rPr>
-              <w:instrText xml:space="preserve"> PAGEREF _Toc243774086 \h </w:instrText>
+              <w:instrText xml:space="preserve"> PAGEREF _Toc243774512 \h </w:instrText>
             </w:r>
             <w:r>
               <w:rPr>
@@ -2307,7 +2307,7 @@
               <w14:ligatures w14:val="standardContextual"/>
             </w:rPr>
           </w:pPr>
-          <w:hyperlink w:anchor="_Toc243774087" w:history="1">
+          <w:hyperlink w:anchor="_Toc243774513" w:history="1">
             <w:r>
               <w:rPr>
                 <w:rStyle w:val="Hyperlink"/>
@@ -2331,7 +2331,7 @@
               <w:rPr>
                 <w:noProof/>
               </w:rPr>
-              <w:instrText xml:space="preserve"> PAGEREF _Toc243774087 \h </w:instrText>
+              <w:instrText xml:space="preserve"> PAGEREF _Toc243774513 \h </w:instrText>
             </w:r>
             <w:r>
               <w:rPr>
@@ -2371,7 +2371,7 @@
               <w14:ligatures w14:val="standardContextual"/>
             </w:rPr>
           </w:pPr>
-          <w:hyperlink w:anchor="_Toc243774088" w:history="1">
+          <w:hyperlink w:anchor="_Toc243774514" w:history="1">
             <w:r>
               <w:rPr>
                 <w:rStyle w:val="Hyperlink"/>
@@ -2395,7 +2395,7 @@
               <w:rPr>
                 <w:noProof/>
               </w:rPr>
-              <w:instrText xml:space="preserve"> PAGEREF _Toc243774088 \h </w:instrText>
+              <w:instrText xml:space="preserve"> PAGEREF _Toc243774514 \h </w:instrText>
             </w:r>
             <w:r>
               <w:rPr>
@@ -2435,7 +2435,7 @@
               <w14:ligatures w14:val="standardContextual"/>
             </w:rPr>
           </w:pPr>
-          <w:hyperlink w:anchor="_Toc243774089" w:history="1">
+          <w:hyperlink w:anchor="_Toc243774515" w:history="1">
             <w:r>
               <w:rPr>
                 <w:rStyle w:val="Hyperlink"/>
@@ -2459,7 +2459,7 @@
               <w:rPr>
                 <w:noProof/>
               </w:rPr>
-              <w:instrText xml:space="preserve"> PAGEREF _Toc243774089 \h </w:instrText>
+              <w:instrText xml:space="preserve"> PAGEREF _Toc243774515 \h </w:instrText>
             </w:r>
             <w:r>
               <w:rPr>
@@ -2499,7 +2499,7 @@
               <w14:ligatures w14:val="standardContextual"/>
             </w:rPr>
           </w:pPr>
-          <w:hyperlink w:anchor="_Toc243774090" w:history="1">
+          <w:hyperlink w:anchor="_Toc243774516" w:history="1">
             <w:r>
               <w:rPr>
                 <w:rStyle w:val="Hyperlink"/>
@@ -2523,7 +2523,7 @@
               <w:rPr>
                 <w:noProof/>
               </w:rPr>
-              <w:instrText xml:space="preserve"> PAGEREF _Toc243774090 \h </w:instrText>
+              <w:instrText xml:space="preserve"> PAGEREF _Toc243774516 \h </w:instrText>
             </w:r>
             <w:r>
               <w:rPr>
@@ -2563,7 +2563,7 @@
               <w14:ligatures w14:val="standardContextual"/>
             </w:rPr>
           </w:pPr>
-          <w:hyperlink w:anchor="_Toc243774091" w:history="1">
+          <w:hyperlink w:anchor="_Toc243774517" w:history="1">
             <w:r>
               <w:rPr>
                 <w:rStyle w:val="Hyperlink"/>
@@ -2587,7 +2587,7 @@
               <w:rPr>
                 <w:noProof/>
               </w:rPr>
-              <w:instrText xml:space="preserve"> PAGEREF _Toc243774091 \h </w:instrText>
+              <w:instrText xml:space="preserve"> PAGEREF _Toc243774517 \h </w:instrText>
             </w:r>
             <w:r>
               <w:rPr>
@@ -2627,7 +2627,7 @@
               <w14:ligatures w14:val="standardContextual"/>
             </w:rPr>
           </w:pPr>
-          <w:hyperlink w:anchor="_Toc243774092" w:history="1">
+          <w:hyperlink w:anchor="_Toc243774518" w:history="1">
             <w:r>
               <w:rPr>
                 <w:rStyle w:val="Hyperlink"/>
@@ -2651,7 +2651,7 @@
               <w:rPr>
                 <w:noProof/>
               </w:rPr>
-              <w:instrText xml:space="preserve"> PAGEREF _Toc243774092 \h </w:instrText>
+              <w:instrText xml:space="preserve"> PAGEREF _Toc243774518 \h </w:instrText>
             </w:r>
             <w:r>
               <w:rPr>
@@ -2691,7 +2691,7 @@
               <w14:ligatures w14:val="standardContextual"/>
             </w:rPr>
           </w:pPr>
-          <w:hyperlink w:anchor="_Toc243774093" w:history="1">
+          <w:hyperlink w:anchor="_Toc243774519" w:history="1">
             <w:r>
               <w:rPr>
                 <w:rStyle w:val="Hyperlink"/>
@@ -2715,7 +2715,7 @@
               <w:rPr>
                 <w:noProof/>
               </w:rPr>
-              <w:instrText xml:space="preserve"> PAGEREF _Toc243774093 \h </w:instrText>
+              <w:instrText xml:space="preserve"> PAGEREF _Toc243774519 \h </w:instrText>
             </w:r>
             <w:r>
               <w:rPr>
@@ -2755,7 +2755,7 @@
               <w14:ligatures w14:val="standardContextual"/>
             </w:rPr>
           </w:pPr>
-          <w:hyperlink w:anchor="_Toc243774094" w:history="1">
+          <w:hyperlink w:anchor="_Toc243774520" w:history="1">
             <w:r>
               <w:rPr>
                 <w:rStyle w:val="Hyperlink"/>
@@ -2779,7 +2779,7 @@
               <w:rPr>
                 <w:noProof/>
               </w:rPr>
-              <w:instrText xml:space="preserve"> PAGEREF _Toc243774094 \h </w:instrText>
+              <w:instrText xml:space="preserve"> PAGEREF _Toc243774520 \h </w:instrText>
             </w:r>
             <w:r>
               <w:rPr>
@@ -2819,7 +2819,7 @@
               <w14:ligatures w14:val="standardContextual"/>
             </w:rPr>
           </w:pPr>
-          <w:hyperlink w:anchor="_Toc243774095" w:history="1">
+          <w:hyperlink w:anchor="_Toc243774521" w:history="1">
             <w:r>
               <w:rPr>
                 <w:rStyle w:val="Hyperlink"/>
@@ -2843,7 +2843,7 @@
               <w:rPr>
                 <w:noProof/>
               </w:rPr>
-              <w:instrText xml:space="preserve"> PAGEREF _Toc243774095 \h </w:instrText>
+              <w:instrText xml:space="preserve"> PAGEREF _Toc243774521 \h </w:instrText>
             </w:r>
             <w:r>
               <w:rPr>
@@ -2883,7 +2883,7 @@
               <w14:ligatures w14:val="standardContextual"/>
             </w:rPr>
           </w:pPr>
-          <w:hyperlink w:anchor="_Toc243774096" w:history="1">
+          <w:hyperlink w:anchor="_Toc243774522" w:history="1">
             <w:r>
               <w:rPr>
                 <w:rStyle w:val="Hyperlink"/>
@@ -2907,7 +2907,7 @@
               <w:rPr>
                 <w:noProof/>
               </w:rPr>
-              <w:instrText xml:space="preserve"> PAGEREF _Toc243774096 \h </w:instrText>
+              <w:instrText xml:space="preserve"> PAGEREF _Toc243774522 \h </w:instrText>
             </w:r>
             <w:r>
               <w:rPr>
@@ -2947,7 +2947,7 @@
               <w14:ligatures w14:val="standardContextual"/>
             </w:rPr>
           </w:pPr>
-          <w:hyperlink w:anchor="_Toc243774097" w:history="1">
+          <w:hyperlink w:anchor="_Toc243774523" w:history="1">
             <w:r>
               <w:rPr>
                 <w:rStyle w:val="Hyperlink"/>
@@ -2971,7 +2971,7 @@
               <w:rPr>
                 <w:noProof/>
               </w:rPr>
-              <w:instrText xml:space="preserve"> PAGEREF _Toc243774097 \h </w:instrText>
+              <w:instrText xml:space="preserve"> PAGEREF _Toc243774523 \h </w:instrText>
             </w:r>
             <w:r>
               <w:rPr>
@@ -3011,7 +3011,7 @@
               <w14:ligatures w14:val="standardContextual"/>
             </w:rPr>
           </w:pPr>
-          <w:hyperlink w:anchor="_Toc243774098" w:history="1">
+          <w:hyperlink w:anchor="_Toc243774524" w:history="1">
             <w:r>
               <w:rPr>
                 <w:rStyle w:val="Hyperlink"/>
@@ -3035,7 +3035,7 @@
               <w:rPr>
                 <w:noProof/>
               </w:rPr>
-              <w:instrText xml:space="preserve"> PAGEREF _Toc243774098 \h </w:instrText>
+              <w:instrText xml:space="preserve"> PAGEREF _Toc243774524 \h </w:instrText>
             </w:r>
             <w:r>
               <w:rPr>
@@ -3075,7 +3075,7 @@
               <w14:ligatures w14:val="standardContextual"/>
             </w:rPr>
           </w:pPr>
-          <w:hyperlink w:anchor="_Toc243774099" w:history="1">
+          <w:hyperlink w:anchor="_Toc243774525" w:history="1">
             <w:r>
               <w:rPr>
                 <w:rStyle w:val="Hyperlink"/>
@@ -3099,7 +3099,7 @@
               <w:rPr>
                 <w:noProof/>
               </w:rPr>
-              <w:instrText xml:space="preserve"> PAGEREF _Toc243774099 \h </w:instrText>
+              <w:instrText xml:space="preserve"> PAGEREF _Toc243774525 \h </w:instrText>
             </w:r>
             <w:r>
               <w:rPr>
@@ -3139,7 +3139,7 @@
               <w14:ligatures w14:val="standardContextual"/>
             </w:rPr>
           </w:pPr>
-          <w:hyperlink w:anchor="_Toc243774100" w:history="1">
+          <w:hyperlink w:anchor="_Toc243774526" w:history="1">
             <w:r>
               <w:rPr>
                 <w:rStyle w:val="Hyperlink"/>
@@ -3163,7 +3163,7 @@
               <w:rPr>
                 <w:noProof/>
               </w:rPr>
-              <w:instrText xml:space="preserve"> PAGEREF _Toc243774100 \h </w:instrText>
+              <w:instrText xml:space="preserve"> PAGEREF _Toc243774526 \h </w:instrText>
             </w:r>
             <w:r>
               <w:rPr>
@@ -3203,7 +3203,7 @@
               <w14:ligatures w14:val="standardContextual"/>
             </w:rPr>
           </w:pPr>
-          <w:hyperlink w:anchor="_Toc243774101" w:history="1">
+          <w:hyperlink w:anchor="_Toc243774527" w:history="1">
             <w:r>
               <w:rPr>
                 <w:rStyle w:val="Hyperlink"/>
@@ -3227,7 +3227,7 @@
               <w:rPr>
                 <w:noProof/>
               </w:rPr>
-              <w:instrText xml:space="preserve"> PAGEREF _Toc243774101 \h </w:instrText>
+              <w:instrText xml:space="preserve"> PAGEREF _Toc243774527 \h </w:instrText>
             </w:r>
             <w:r>
               <w:rPr>
@@ -3267,7 +3267,7 @@
               <w14:ligatures w14:val="standardContextual"/>
             </w:rPr>
           </w:pPr>
-          <w:hyperlink w:anchor="_Toc243774102" w:history="1">
+          <w:hyperlink w:anchor="_Toc243774528" w:history="1">
             <w:r>
               <w:rPr>
                 <w:rStyle w:val="Hyperlink"/>
@@ -3291,7 +3291,7 @@
               <w:rPr>
                 <w:noProof/>
               </w:rPr>
-              <w:instrText xml:space="preserve"> PAGEREF _Toc243774102 \h </w:instrText>
+              <w:instrText xml:space="preserve"> PAGEREF _Toc243774528 \h </w:instrText>
             </w:r>
             <w:r>
               <w:rPr>
@@ -3331,7 +3331,7 @@
               <w14:ligatures w14:val="standardContextual"/>
             </w:rPr>
           </w:pPr>
-          <w:hyperlink w:anchor="_Toc243774103" w:history="1">
+          <w:hyperlink w:anchor="_Toc243774529" w:history="1">
             <w:r>
               <w:rPr>
                 <w:rStyle w:val="Hyperlink"/>
@@ -3355,7 +3355,7 @@
               <w:rPr>
                 <w:noProof/>
               </w:rPr>
-              <w:instrText xml:space="preserve"> PAGEREF _Toc243774103 \h </w:instrText>
+              <w:instrText xml:space="preserve"> PAGEREF _Toc243774529 \h </w:instrText>
             </w:r>
             <w:r>
               <w:rPr>
@@ -3395,7 +3395,7 @@
               <w14:ligatures w14:val="standardContextual"/>
             </w:rPr>
           </w:pPr>
-          <w:hyperlink w:anchor="_Toc243774104" w:history="1">
+          <w:hyperlink w:anchor="_Toc243774530" w:history="1">
             <w:r>
               <w:rPr>
                 <w:rStyle w:val="Hyperlink"/>
@@ -3419,7 +3419,7 @@
               <w:rPr>
                 <w:noProof/>
               </w:rPr>
-              <w:instrText xml:space="preserve"> PAGEREF _Toc243774104 \h </w:instrText>
+              <w:instrText xml:space="preserve"> PAGEREF _Toc243774530 \h </w:instrText>
             </w:r>
             <w:r>
               <w:rPr>
@@ -3459,7 +3459,7 @@
               <w14:ligatures w14:val="standardContextual"/>
             </w:rPr>
           </w:pPr>
-          <w:hyperlink w:anchor="_Toc243774105" w:history="1">
+          <w:hyperlink w:anchor="_Toc243774531" w:history="1">
             <w:r>
               <w:rPr>
                 <w:rStyle w:val="Hyperlink"/>
@@ -3483,7 +3483,7 @@
               <w:rPr>
                 <w:noProof/>
               </w:rPr>
-              <w:instrText xml:space="preserve"> PAGEREF _Toc243774105 \h </w:instrText>
+              <w:instrText xml:space="preserve"> PAGEREF _Toc243774531 \h </w:instrText>
             </w:r>
             <w:r>
               <w:rPr>
@@ -3523,7 +3523,7 @@
               <w14:ligatures w14:val="standardContextual"/>
             </w:rPr>
           </w:pPr>
-          <w:hyperlink w:anchor="_Toc243774106" w:history="1">
+          <w:hyperlink w:anchor="_Toc243774532" w:history="1">
             <w:r>
               <w:rPr>
                 <w:rStyle w:val="Hyperlink"/>
@@ -3547,7 +3547,7 @@
               <w:rPr>
                 <w:noProof/>
               </w:rPr>
-              <w:instrText xml:space="preserve"> PAGEREF _Toc243774106 \h </w:instrText>
+              <w:instrText xml:space="preserve"> PAGEREF _Toc243774532 \h </w:instrText>
             </w:r>
             <w:r>
               <w:rPr>
@@ -3587,7 +3587,7 @@
               <w14:ligatures w14:val="standardContextual"/>
             </w:rPr>
           </w:pPr>
-          <w:hyperlink w:anchor="_Toc243774107" w:history="1">
+          <w:hyperlink w:anchor="_Toc243774533" w:history="1">
             <w:r>
               <w:rPr>
                 <w:rStyle w:val="Hyperlink"/>
@@ -3611,7 +3611,7 @@
               <w:rPr>
                 <w:noProof/>
               </w:rPr>
-              <w:instrText xml:space="preserve"> PAGEREF _Toc243774107 \h </w:instrText>
+              <w:instrText xml:space="preserve"> PAGEREF _Toc243774533 \h </w:instrText>
             </w:r>
             <w:r>
               <w:rPr>
@@ -3651,7 +3651,7 @@
               <w14:ligatures w14:val="standardContextual"/>
             </w:rPr>
           </w:pPr>
-          <w:hyperlink w:anchor="_Toc243774108" w:history="1">
+          <w:hyperlink w:anchor="_Toc243774534" w:history="1">
             <w:r>
               <w:rPr>
                 <w:rStyle w:val="Hyperlink"/>
@@ -3675,7 +3675,7 @@
               <w:rPr>
                 <w:noProof/>
               </w:rPr>
-              <w:instrText xml:space="preserve"> PAGEREF _Toc243774108 \h </w:instrText>
+              <w:instrText xml:space="preserve"> PAGEREF _Toc243774534 \h </w:instrText>
             </w:r>
             <w:r>
               <w:rPr>
@@ -3715,7 +3715,7 @@
               <w14:ligatures w14:val="standardContextual"/>
             </w:rPr>
           </w:pPr>
-          <w:hyperlink w:anchor="_Toc243774109" w:history="1">
+          <w:hyperlink w:anchor="_Toc243774535" w:history="1">
             <w:r>
               <w:rPr>
                 <w:rStyle w:val="Hyperlink"/>
@@ -3739,7 +3739,7 @@
               <w:rPr>
                 <w:noProof/>
               </w:rPr>
-              <w:instrText xml:space="preserve"> PAGEREF _Toc243774109 \h </w:instrText>
+              <w:instrText xml:space="preserve"> PAGEREF _Toc243774535 \h </w:instrText>
             </w:r>
             <w:r>
               <w:rPr>
@@ -3779,7 +3779,7 @@
               <w14:ligatures w14:val="standardContextual"/>
             </w:rPr>
           </w:pPr>
-          <w:hyperlink w:anchor="_Toc243774110" w:history="1">
+          <w:hyperlink w:anchor="_Toc243774536" w:history="1">
             <w:r>
               <w:rPr>
                 <w:rStyle w:val="Hyperlink"/>
@@ -3803,7 +3803,7 @@
               <w:rPr>
                 <w:noProof/>
               </w:rPr>
-              <w:instrText xml:space="preserve"> PAGEREF _Toc243774110 \h </w:instrText>
+              <w:instrText xml:space="preserve"> PAGEREF _Toc243774536 \h </w:instrText>
             </w:r>
             <w:r>
               <w:rPr>
@@ -3843,7 +3843,7 @@
               <w14:ligatures w14:val="standardContextual"/>
             </w:rPr>
           </w:pPr>
-          <w:hyperlink w:anchor="_Toc243774111" w:history="1">
+          <w:hyperlink w:anchor="_Toc243774537" w:history="1">
             <w:r>
               <w:rPr>
                 <w:rStyle w:val="Hyperlink"/>
@@ -3867,7 +3867,7 @@
               <w:rPr>
                 <w:noProof/>
               </w:rPr>
-              <w:instrText xml:space="preserve"> PAGEREF _Toc243774111 \h </w:instrText>
+              <w:instrText xml:space="preserve"> PAGEREF _Toc243774537 \h </w:instrText>
             </w:r>
             <w:r>
               <w:rPr>
@@ -3907,7 +3907,7 @@
               <w14:ligatures w14:val="standardContextual"/>
             </w:rPr>
           </w:pPr>
-          <w:hyperlink w:anchor="_Toc243774112" w:history="1">
+          <w:hyperlink w:anchor="_Toc243774538" w:history="1">
             <w:r>
               <w:rPr>
                 <w:rStyle w:val="Hyperlink"/>
@@ -3931,7 +3931,7 @@
               <w:rPr>
                 <w:noProof/>
               </w:rPr>
-              <w:instrText xml:space="preserve"> PAGEREF _Toc243774112 \h </w:instrText>
+              <w:instrText xml:space="preserve"> PAGEREF _Toc243774538 \h </w:instrText>
             </w:r>
             <w:r>
               <w:rPr>
@@ -3971,7 +3971,7 @@
               <w14:ligatures w14:val="standardContextual"/>
             </w:rPr>
           </w:pPr>
-          <w:hyperlink w:anchor="_Toc243774113" w:history="1">
+          <w:hyperlink w:anchor="_Toc243774539" w:history="1">
             <w:r>
               <w:rPr>
                 <w:rStyle w:val="Hyperlink"/>
@@ -3995,7 +3995,7 @@
               <w:rPr>
                 <w:noProof/>
               </w:rPr>
-              <w:instrText xml:space="preserve"> PAGEREF _Toc243774113 \h </w:instrText>
+              <w:instrText xml:space="preserve"> PAGEREF _Toc243774539 \h </w:instrText>
             </w:r>
             <w:r>
               <w:rPr>
@@ -4035,7 +4035,7 @@
               <w14:ligatures w14:val="standardContextual"/>
             </w:rPr>
           </w:pPr>
-          <w:hyperlink w:anchor="_Toc243774114" w:history="1">
+          <w:hyperlink w:anchor="_Toc243774540" w:history="1">
             <w:r>
               <w:rPr>
                 <w:rStyle w:val="Hyperlink"/>
@@ -4059,7 +4059,7 @@
               <w:rPr>
                 <w:noProof/>
               </w:rPr>
-              <w:instrText xml:space="preserve"> PAGEREF _Toc243774114 \h </w:instrText>
+              <w:instrText xml:space="preserve"> PAGEREF _Toc243774540 \h </w:instrText>
             </w:r>
             <w:r>
               <w:rPr>
@@ -4099,7 +4099,7 @@
               <w14:ligatures w14:val="standardContextual"/>
             </w:rPr>
           </w:pPr>
-          <w:hyperlink w:anchor="_Toc243774115" w:history="1">
+          <w:hyperlink w:anchor="_Toc243774541" w:history="1">
             <w:r>
               <w:rPr>
                 <w:rStyle w:val="Hyperlink"/>
@@ -4123,7 +4123,7 @@
               <w:rPr>
                 <w:noProof/>
               </w:rPr>
-              <w:instrText xml:space="preserve"> PAGEREF _Toc243774115 \h </w:instrText>
+              <w:instrText xml:space="preserve"> PAGEREF _Toc243774541 \h </w:instrText>
             </w:r>
             <w:r>
               <w:rPr>
@@ -4163,7 +4163,7 @@
               <w14:ligatures w14:val="standardContextual"/>
             </w:rPr>
           </w:pPr>
-          <w:hyperlink w:anchor="_Toc243774116" w:history="1">
+          <w:hyperlink w:anchor="_Toc243774542" w:history="1">
             <w:r>
               <w:rPr>
                 <w:rStyle w:val="Hyperlink"/>
@@ -4187,7 +4187,7 @@
               <w:rPr>
                 <w:noProof/>
               </w:rPr>
-              <w:instrText xml:space="preserve"> PAGEREF _Toc243774116 \h </w:instrText>
+              <w:instrText xml:space="preserve"> PAGEREF _Toc243774542 \h </w:instrText>
             </w:r>
             <w:r>
               <w:rPr>
@@ -4227,7 +4227,7 @@
               <w14:ligatures w14:val="standardContextual"/>
             </w:rPr>
           </w:pPr>
-          <w:hyperlink w:anchor="_Toc243774117" w:history="1">
+          <w:hyperlink w:anchor="_Toc243774543" w:history="1">
             <w:r>
               <w:rPr>
                 <w:rStyle w:val="Hyperlink"/>
@@ -4251,7 +4251,7 @@
               <w:rPr>
                 <w:noProof/>
               </w:rPr>
-              <w:instrText xml:space="preserve"> PAGEREF _Toc243774117 \h </w:instrText>
+              <w:instrText xml:space="preserve"> PAGEREF _Toc243774543 \h </w:instrText>
             </w:r>
             <w:r>
               <w:rPr>
@@ -4291,7 +4291,7 @@
               <w14:ligatures w14:val="standardContextual"/>
             </w:rPr>
           </w:pPr>
-          <w:hyperlink w:anchor="_Toc243774118" w:history="1">
+          <w:hyperlink w:anchor="_Toc243774544" w:history="1">
             <w:r>
               <w:rPr>
                 <w:rStyle w:val="Hyperlink"/>
@@ -4315,7 +4315,7 @@
               <w:rPr>
                 <w:noProof/>
               </w:rPr>
-              <w:instrText xml:space="preserve"> PAGEREF _Toc243774118 \h </w:instrText>
+              <w:instrText xml:space="preserve"> PAGEREF _Toc243774544 \h </w:instrText>
             </w:r>
             <w:r>
               <w:rPr>
@@ -4355,7 +4355,7 @@
               <w14:ligatures w14:val="standardContextual"/>
             </w:rPr>
           </w:pPr>
-          <w:hyperlink w:anchor="_Toc243774119" w:history="1">
+          <w:hyperlink w:anchor="_Toc243774545" w:history="1">
             <w:r>
               <w:rPr>
                 <w:rStyle w:val="Hyperlink"/>
@@ -4379,7 +4379,7 @@
               <w:rPr>
                 <w:noProof/>
               </w:rPr>
-              <w:instrText xml:space="preserve"> PAGEREF _Toc243774119 \h </w:instrText>
+              <w:instrText xml:space="preserve"> PAGEREF _Toc243774545 \h </w:instrText>
             </w:r>
             <w:r>
               <w:rPr>
@@ -4419,7 +4419,7 @@
               <w14:ligatures w14:val="standardContextual"/>
             </w:rPr>
           </w:pPr>
-          <w:hyperlink w:anchor="_Toc243774120" w:history="1">
+          <w:hyperlink w:anchor="_Toc243774546" w:history="1">
             <w:r>
               <w:rPr>
                 <w:rStyle w:val="Hyperlink"/>
@@ -4443,7 +4443,7 @@
               <w:rPr>
                 <w:noProof/>
               </w:rPr>
-              <w:instrText xml:space="preserve"> PAGEREF _Toc243774120 \h </w:instrText>
+              <w:instrText xml:space="preserve"> PAGEREF _Toc243774546 \h </w:instrText>
             </w:r>
             <w:r>
               <w:rPr>
@@ -4483,7 +4483,7 @@
               <w14:ligatures w14:val="standardContextual"/>
             </w:rPr>
           </w:pPr>
-          <w:hyperlink w:anchor="_Toc243774121" w:history="1">
+          <w:hyperlink w:anchor="_Toc243774547" w:history="1">
             <w:r>
               <w:rPr>
                 <w:rStyle w:val="Hyperlink"/>
@@ -4507,7 +4507,7 @@
               <w:rPr>
                 <w:noProof/>
               </w:rPr>
-              <w:instrText xml:space="preserve"> PAGEREF _Toc243774121 \h </w:instrText>
+              <w:instrText xml:space="preserve"> PAGEREF _Toc243774547 \h </w:instrText>
             </w:r>
             <w:r>
               <w:rPr>
@@ -4547,7 +4547,7 @@
               <w14:ligatures w14:val="standardContextual"/>
             </w:rPr>
           </w:pPr>
-          <w:hyperlink w:anchor="_Toc243774122" w:history="1">
+          <w:hyperlink w:anchor="_Toc243774548" w:history="1">
             <w:r>
               <w:rPr>
                 <w:rStyle w:val="Hyperlink"/>
@@ -4571,7 +4571,7 @@
               <w:rPr>
                 <w:noProof/>
               </w:rPr>
-              <w:instrText xml:space="preserve"> PAGEREF _Toc243774122 \h </w:instrText>
+              <w:instrText xml:space="preserve"> PAGEREF _Toc243774548 \h </w:instrText>
             </w:r>
             <w:r>
               <w:rPr>
@@ -4611,7 +4611,7 @@
               <w14:ligatures w14:val="standardContextual"/>
             </w:rPr>
           </w:pPr>
-          <w:hyperlink w:anchor="_Toc243774123" w:history="1">
+          <w:hyperlink w:anchor="_Toc243774549" w:history="1">
             <w:r>
               <w:rPr>
                 <w:rStyle w:val="Hyperlink"/>
@@ -4635,7 +4635,7 @@
               <w:rPr>
                 <w:noProof/>
               </w:rPr>
-              <w:instrText xml:space="preserve"> PAGEREF _Toc243774123 \h </w:instrText>
+              <w:instrText xml:space="preserve"> PAGEREF _Toc243774549 \h </w:instrText>
             </w:r>
             <w:r>
               <w:rPr>
@@ -4675,7 +4675,7 @@
               <w14:ligatures w14:val="standardContextual"/>
             </w:rPr>
           </w:pPr>
-          <w:hyperlink w:anchor="_Toc243774124" w:history="1">
+          <w:hyperlink w:anchor="_Toc243774550" w:history="1">
             <w:r>
               <w:rPr>
                 <w:rStyle w:val="Hyperlink"/>
@@ -4699,7 +4699,7 @@
               <w:rPr>
                 <w:noProof/>
               </w:rPr>
-              <w:instrText xml:space="preserve"> PAGEREF _Toc243774124 \h </w:instrText>
+              <w:instrText xml:space="preserve"> PAGEREF _Toc243774550 \h </w:instrText>
             </w:r>
             <w:r>
               <w:rPr>
@@ -4739,7 +4739,7 @@
               <w14:ligatures w14:val="standardContextual"/>
             </w:rPr>
           </w:pPr>
-          <w:hyperlink w:anchor="_Toc243774125" w:history="1">
+          <w:hyperlink w:anchor="_Toc243774551" w:history="1">
             <w:r>
               <w:rPr>
                 <w:rStyle w:val="Hyperlink"/>
@@ -4763,7 +4763,7 @@
               <w:rPr>
                 <w:noProof/>
               </w:rPr>
-              <w:instrText xml:space="preserve"> PAGEREF _Toc243774125 \h </w:instrText>
+              <w:instrText xml:space="preserve"> PAGEREF _Toc243774551 \h </w:instrText>
             </w:r>
             <w:r>
               <w:rPr>
@@ -4803,7 +4803,7 @@
               <w14:ligatures w14:val="standardContextual"/>
             </w:rPr>
           </w:pPr>
-          <w:hyperlink w:anchor="_Toc243774126" w:history="1">
+          <w:hyperlink w:anchor="_Toc243774552" w:history="1">
             <w:r>
               <w:rPr>
                 <w:rStyle w:val="Hyperlink"/>
@@ -4827,7 +4827,7 @@
               <w:rPr>
                 <w:noProof/>
               </w:rPr>
-              <w:instrText xml:space="preserve"> PAGEREF _Toc243774126 \h </w:instrText>
+              <w:instrText xml:space="preserve"> PAGEREF _Toc243774552 \h </w:instrText>
             </w:r>
             <w:r>
               <w:rPr>
@@ -4867,7 +4867,7 @@
               <w14:ligatures w14:val="standardContextual"/>
             </w:rPr>
           </w:pPr>
-          <w:hyperlink w:anchor="_Toc243774127" w:history="1">
+          <w:hyperlink w:anchor="_Toc243774553" w:history="1">
             <w:r>
               <w:rPr>
                 <w:rStyle w:val="Hyperlink"/>
@@ -4891,7 +4891,7 @@
               <w:rPr>
                 <w:noProof/>
               </w:rPr>
-              <w:instrText xml:space="preserve"> PAGEREF _Toc243774127 \h </w:instrText>
+              <w:instrText xml:space="preserve"> PAGEREF _Toc243774553 \h </w:instrText>
             </w:r>
             <w:r>
               <w:rPr>
@@ -4931,7 +4931,7 @@
               <w14:ligatures w14:val="standardContextual"/>
             </w:rPr>
           </w:pPr>
-          <w:hyperlink w:anchor="_Toc243774128" w:history="1">
+          <w:hyperlink w:anchor="_Toc243774554" w:history="1">
             <w:r>
               <w:rPr>
                 <w:rStyle w:val="Hyperlink"/>
@@ -4955,7 +4955,7 @@
               <w:rPr>
                 <w:noProof/>
               </w:rPr>
-              <w:instrText xml:space="preserve"> PAGEREF _Toc243774128 \h </w:instrText>
+              <w:instrText xml:space="preserve"> PAGEREF _Toc243774554 \h </w:instrText>
             </w:r>
             <w:r>
               <w:rPr>
@@ -4995,7 +4995,7 @@
               <w14:ligatures w14:val="standardContextual"/>
             </w:rPr>
           </w:pPr>
-          <w:hyperlink w:anchor="_Toc243774129" w:history="1">
+          <w:hyperlink w:anchor="_Toc243774555" w:history="1">
             <w:r>
               <w:rPr>
                 <w:rStyle w:val="Hyperlink"/>
@@ -5019,7 +5019,7 @@
               <w:rPr>
                 <w:noProof/>
               </w:rPr>
-              <w:instrText xml:space="preserve"> PAGEREF _Toc243774129 \h </w:instrText>
+              <w:instrText xml:space="preserve"> PAGEREF _Toc243774555 \h </w:instrText>
             </w:r>
             <w:r>
               <w:rPr>
@@ -5059,7 +5059,7 @@
               <w14:ligatures w14:val="standardContextual"/>
             </w:rPr>
           </w:pPr>
-          <w:hyperlink w:anchor="_Toc243774130" w:history="1">
+          <w:hyperlink w:anchor="_Toc243774556" w:history="1">
             <w:r>
               <w:rPr>
                 <w:rStyle w:val="Hyperlink"/>
@@ -5083,7 +5083,7 @@
               <w:rPr>
                 <w:noProof/>
               </w:rPr>
-              <w:instrText xml:space="preserve"> PAGEREF _Toc243774130 \h </w:instrText>
+              <w:instrText xml:space="preserve"> PAGEREF _Toc243774556 \h </w:instrText>
             </w:r>
             <w:r>
               <w:rPr>
@@ -5123,7 +5123,7 @@
               <w14:ligatures w14:val="standardContextual"/>
             </w:rPr>
           </w:pPr>
-          <w:hyperlink w:anchor="_Toc243774131" w:history="1">
+          <w:hyperlink w:anchor="_Toc243774557" w:history="1">
             <w:r>
               <w:rPr>
                 <w:rStyle w:val="Hyperlink"/>
@@ -5147,7 +5147,7 @@
               <w:rPr>
                 <w:noProof/>
               </w:rPr>
-              <w:instrText xml:space="preserve"> PAGEREF _Toc243774131 \h </w:instrText>
+              <w:instrText xml:space="preserve"> PAGEREF _Toc243774557 \h </w:instrText>
             </w:r>
             <w:r>
               <w:rPr>
@@ -5187,7 +5187,7 @@
               <w14:ligatures w14:val="standardContextual"/>
             </w:rPr>
           </w:pPr>
-          <w:hyperlink w:anchor="_Toc243774132" w:history="1">
+          <w:hyperlink w:anchor="_Toc243774558" w:history="1">
             <w:r>
               <w:rPr>
                 <w:rStyle w:val="Hyperlink"/>
@@ -5211,7 +5211,7 @@
               <w:rPr>
                 <w:noProof/>
               </w:rPr>
-              <w:instrText xml:space="preserve"> PAGEREF _Toc243774132 \h </w:instrText>
+              <w:instrText xml:space="preserve"> PAGEREF _Toc243774558 \h </w:instrText>
             </w:r>
             <w:r>
               <w:rPr>
@@ -5251,7 +5251,7 @@
               <w14:ligatures w14:val="standardContextual"/>
             </w:rPr>
           </w:pPr>
-          <w:hyperlink w:anchor="_Toc243774133" w:history="1">
+          <w:hyperlink w:anchor="_Toc243774559" w:history="1">
             <w:r>
               <w:rPr>
                 <w:rStyle w:val="Hyperlink"/>
@@ -5275,7 +5275,7 @@
               <w:rPr>
                 <w:noProof/>
               </w:rPr>
-              <w:instrText xml:space="preserve"> PAGEREF _Toc243774133 \h </w:instrText>
+              <w:instrText xml:space="preserve"> PAGEREF _Toc243774559 \h </w:instrText>
             </w:r>
             <w:r>
               <w:rPr>
@@ -5315,7 +5315,7 @@
               <w14:ligatures w14:val="standardContextual"/>
             </w:rPr>
           </w:pPr>
-          <w:hyperlink w:anchor="_Toc243774134" w:history="1">
+          <w:hyperlink w:anchor="_Toc243774560" w:history="1">
             <w:r>
               <w:rPr>
                 <w:rStyle w:val="Hyperlink"/>
@@ -5339,7 +5339,7 @@
               <w:rPr>
                 <w:noProof/>
               </w:rPr>
-              <w:instrText xml:space="preserve"> PAGEREF _Toc243774134 \h </w:instrText>
+              <w:instrText xml:space="preserve"> PAGEREF _Toc243774560 \h </w:instrText>
             </w:r>
             <w:r>
               <w:rPr>
@@ -5379,7 +5379,7 @@
               <w14:ligatures w14:val="standardContextual"/>
             </w:rPr>
           </w:pPr>
-          <w:hyperlink w:anchor="_Toc243774135" w:history="1">
+          <w:hyperlink w:anchor="_Toc243774561" w:history="1">
             <w:r>
               <w:rPr>
                 <w:rStyle w:val="Hyperlink"/>
@@ -5403,7 +5403,7 @@
               <w:rPr>
                 <w:noProof/>
               </w:rPr>
-              <w:instrText xml:space="preserve"> PAGEREF _Toc243774135 \h </w:instrText>
+              <w:instrText xml:space="preserve"> PAGEREF _Toc243774561 \h </w:instrText>
             </w:r>
             <w:r>
               <w:rPr>
@@ -5443,7 +5443,7 @@
               <w14:ligatures w14:val="standardContextual"/>
             </w:rPr>
           </w:pPr>
-          <w:hyperlink w:anchor="_Toc243774136" w:history="1">
+          <w:hyperlink w:anchor="_Toc243774562" w:history="1">
             <w:r>
               <w:rPr>
                 <w:rStyle w:val="Hyperlink"/>
@@ -5467,7 +5467,7 @@
               <w:rPr>
                 <w:noProof/>
               </w:rPr>
-              <w:instrText xml:space="preserve"> PAGEREF _Toc243774136 \h </w:instrText>
+              <w:instrText xml:space="preserve"> PAGEREF _Toc243774562 \h </w:instrText>
             </w:r>
             <w:r>
               <w:rPr>
@@ -5507,7 +5507,7 @@
               <w14:ligatures w14:val="standardContextual"/>
             </w:rPr>
           </w:pPr>
-          <w:hyperlink w:anchor="_Toc243774137" w:history="1">
+          <w:hyperlink w:anchor="_Toc243774563" w:history="1">
             <w:r>
               <w:rPr>
                 <w:rStyle w:val="Hyperlink"/>
@@ -5531,7 +5531,7 @@
               <w:rPr>
                 <w:noProof/>
               </w:rPr>
-              <w:instrText xml:space="preserve"> PAGEREF _Toc243774137 \h </w:instrText>
+              <w:instrText xml:space="preserve"> PAGEREF _Toc243774563 \h </w:instrText>
             </w:r>
             <w:r>
               <w:rPr>
@@ -5571,7 +5571,7 @@
               <w14:ligatures w14:val="standardContextual"/>
             </w:rPr>
           </w:pPr>
-          <w:hyperlink w:anchor="_Toc243774138" w:history="1">
+          <w:hyperlink w:anchor="_Toc243774564" w:history="1">
             <w:r>
               <w:rPr>
                 <w:rStyle w:val="Hyperlink"/>
@@ -5595,7 +5595,7 @@
               <w:rPr>
                 <w:noProof/>
               </w:rPr>
-              <w:instrText xml:space="preserve"> PAGEREF _Toc243774138 \h </w:instrText>
+              <w:instrText xml:space="preserve"> PAGEREF _Toc243774564 \h </w:instrText>
             </w:r>
             <w:r>
               <w:rPr>
@@ -5635,7 +5635,7 @@
               <w14:ligatures w14:val="standardContextual"/>
             </w:rPr>
           </w:pPr>
-          <w:hyperlink w:anchor="_Toc243774139" w:history="1">
+          <w:hyperlink w:anchor="_Toc243774565" w:history="1">
             <w:r>
               <w:rPr>
                 <w:rStyle w:val="Hyperlink"/>
@@ -5659,7 +5659,7 @@
               <w:rPr>
                 <w:noProof/>
               </w:rPr>
-              <w:instrText xml:space="preserve"> PAGEREF _Toc243774139 \h </w:instrText>
+              <w:instrText xml:space="preserve"> PAGEREF _Toc243774565 \h </w:instrText>
             </w:r>
             <w:r>
               <w:rPr>
@@ -5699,7 +5699,7 @@
               <w14:ligatures w14:val="standardContextual"/>
             </w:rPr>
           </w:pPr>
-          <w:hyperlink w:anchor="_Toc243774140" w:history="1">
+          <w:hyperlink w:anchor="_Toc243774566" w:history="1">
             <w:r>
               <w:rPr>
                 <w:rStyle w:val="Hyperlink"/>
@@ -5723,7 +5723,7 @@
               <w:rPr>
                 <w:noProof/>
               </w:rPr>
-              <w:instrText xml:space="preserve"> PAGEREF _Toc243774140 \h </w:instrText>
+              <w:instrText xml:space="preserve"> PAGEREF _Toc243774566 \h </w:instrText>
             </w:r>
             <w:r>
               <w:rPr>
@@ -5763,7 +5763,7 @@
               <w14:ligatures w14:val="standardContextual"/>
             </w:rPr>
           </w:pPr>
-          <w:hyperlink w:anchor="_Toc243774141" w:history="1">
+          <w:hyperlink w:anchor="_Toc243774567" w:history="1">
             <w:r>
               <w:rPr>
                 <w:rStyle w:val="Hyperlink"/>
@@ -5787,7 +5787,7 @@
               <w:rPr>
                 <w:noProof/>
               </w:rPr>
-              <w:instrText xml:space="preserve"> PAGEREF _Toc243774141 \h </w:instrText>
+              <w:instrText xml:space="preserve"> PAGEREF _Toc243774567 \h </w:instrText>
             </w:r>
             <w:r>
               <w:rPr>
@@ -5827,7 +5827,7 @@
               <w14:ligatures w14:val="standardContextual"/>
             </w:rPr>
           </w:pPr>
-          <w:hyperlink w:anchor="_Toc243774142" w:history="1">
+          <w:hyperlink w:anchor="_Toc243774568" w:history="1">
             <w:r>
               <w:rPr>
                 <w:rStyle w:val="Hyperlink"/>
@@ -5851,7 +5851,7 @@
               <w:rPr>
                 <w:noProof/>
               </w:rPr>
-              <w:instrText xml:space="preserve"> PAGEREF _Toc243774142 \h </w:instrText>
+              <w:instrText xml:space="preserve"> PAGEREF _Toc243774568 \h </w:instrText>
             </w:r>
             <w:r>
               <w:rPr>
@@ -5891,7 +5891,7 @@
               <w14:ligatures w14:val="standardContextual"/>
             </w:rPr>
           </w:pPr>
-          <w:hyperlink w:anchor="_Toc243774143" w:history="1">
+          <w:hyperlink w:anchor="_Toc243774569" w:history="1">
             <w:r>
               <w:rPr>
                 <w:rStyle w:val="Hyperlink"/>
@@ -5915,7 +5915,7 @@
               <w:rPr>
                 <w:noProof/>
               </w:rPr>
-              <w:instrText xml:space="preserve"> PAGEREF _Toc243774143 \h </w:instrText>
+              <w:instrText xml:space="preserve"> PAGEREF _Toc243774569 \h </w:instrText>
             </w:r>
             <w:r>
               <w:rPr>
@@ -5955,7 +5955,7 @@
               <w14:ligatures w14:val="standardContextual"/>
             </w:rPr>
           </w:pPr>
-          <w:hyperlink w:anchor="_Toc243774144" w:history="1">
+          <w:hyperlink w:anchor="_Toc243774570" w:history="1">
             <w:r>
               <w:rPr>
                 <w:rStyle w:val="Hyperlink"/>
@@ -5979,7 +5979,7 @@
               <w:rPr>
                 <w:noProof/>
               </w:rPr>
-              <w:instrText xml:space="preserve"> PAGEREF _Toc243774144 \h </w:instrText>
+              <w:instrText xml:space="preserve"> PAGEREF _Toc243774570 \h </w:instrText>
             </w:r>
             <w:r>
               <w:rPr>
@@ -6019,7 +6019,7 @@
               <w14:ligatures w14:val="standardContextual"/>
             </w:rPr>
           </w:pPr>
-          <w:hyperlink w:anchor="_Toc243774145" w:history="1">
+          <w:hyperlink w:anchor="_Toc243774571" w:history="1">
             <w:r>
               <w:rPr>
                 <w:rStyle w:val="Hyperlink"/>
@@ -6043,7 +6043,7 @@
               <w:rPr>
                 <w:noProof/>
               </w:rPr>
-              <w:instrText xml:space="preserve"> PAGEREF _Toc243774145 \h </w:instrText>
+              <w:instrText xml:space="preserve"> PAGEREF _Toc243774571 \h </w:instrText>
             </w:r>
             <w:r>
               <w:rPr>
@@ -6083,7 +6083,7 @@
               <w14:ligatures w14:val="standardContextual"/>
             </w:rPr>
           </w:pPr>
-          <w:hyperlink w:anchor="_Toc243774146" w:history="1">
+          <w:hyperlink w:anchor="_Toc243774572" w:history="1">
             <w:r>
               <w:rPr>
                 <w:rStyle w:val="Hyperlink"/>
@@ -6107,7 +6107,7 @@
               <w:rPr>
                 <w:noProof/>
               </w:rPr>
-              <w:instrText xml:space="preserve"> PAGEREF _Toc243774146 \h </w:instrText>
+              <w:instrText xml:space="preserve"> PAGEREF _Toc243774572 \h </w:instrText>
             </w:r>
             <w:r>
               <w:rPr>
@@ -6147,7 +6147,7 @@
               <w14:ligatures w14:val="standardContextual"/>
             </w:rPr>
           </w:pPr>
-          <w:hyperlink w:anchor="_Toc243774147" w:history="1">
+          <w:hyperlink w:anchor="_Toc243774573" w:history="1">
             <w:r>
               <w:rPr>
                 <w:rStyle w:val="Hyperlink"/>
@@ -6171,7 +6171,7 @@
               <w:rPr>
                 <w:noProof/>
               </w:rPr>
-              <w:instrText xml:space="preserve"> PAGEREF _Toc243774147 \h </w:instrText>
+              <w:instrText xml:space="preserve"> PAGEREF _Toc243774573 \h </w:instrText>
             </w:r>
             <w:r>
               <w:rPr>
@@ -6211,7 +6211,7 @@
               <w14:ligatures w14:val="standardContextual"/>
             </w:rPr>
           </w:pPr>
-          <w:hyperlink w:anchor="_Toc243774148" w:history="1">
+          <w:hyperlink w:anchor="_Toc243774574" w:history="1">
             <w:r>
               <w:rPr>
                 <w:rStyle w:val="Hyperlink"/>
@@ -6235,7 +6235,7 @@
               <w:rPr>
                 <w:noProof/>
               </w:rPr>
-              <w:instrText xml:space="preserve"> PAGEREF _Toc243774148 \h </w:instrText>
+              <w:instrText xml:space="preserve"> PAGEREF _Toc243774574 \h </w:instrText>
             </w:r>
             <w:r>
               <w:rPr>
@@ -6275,7 +6275,7 @@
               <w14:ligatures w14:val="standardContextual"/>
             </w:rPr>
           </w:pPr>
-          <w:hyperlink w:anchor="_Toc243774149" w:history="1">
+          <w:hyperlink w:anchor="_Toc243774575" w:history="1">
             <w:r>
               <w:rPr>
                 <w:rStyle w:val="Hyperlink"/>
@@ -6299,7 +6299,7 @@
               <w:rPr>
                 <w:noProof/>
               </w:rPr>
-              <w:instrText xml:space="preserve"> PAGEREF _Toc243774149 \h </w:instrText>
+              <w:instrText xml:space="preserve"> PAGEREF _Toc243774575 \h </w:instrText>
             </w:r>
             <w:r>
               <w:rPr>
@@ -6339,7 +6339,7 @@
               <w14:ligatures w14:val="standardContextual"/>
             </w:rPr>
           </w:pPr>
-          <w:hyperlink w:anchor="_Toc243774150" w:history="1">
+          <w:hyperlink w:anchor="_Toc243774576" w:history="1">
             <w:r>
               <w:rPr>
                 <w:rStyle w:val="Hyperlink"/>
@@ -6363,7 +6363,7 @@
               <w:rPr>
                 <w:noProof/>
               </w:rPr>
-              <w:instrText xml:space="preserve"> PAGEREF _Toc243774150 \h </w:instrText>
+              <w:instrText xml:space="preserve"> PAGEREF _Toc243774576 \h </w:instrText>
             </w:r>
             <w:r>
               <w:rPr>
@@ -6403,7 +6403,7 @@
               <w14:ligatures w14:val="standardContextual"/>
             </w:rPr>
           </w:pPr>
-          <w:hyperlink w:anchor="_Toc243774151" w:history="1">
+          <w:hyperlink w:anchor="_Toc243774577" w:history="1">
             <w:r>
               <w:rPr>
                 <w:rStyle w:val="Hyperlink"/>
@@ -6427,7 +6427,7 @@
               <w:rPr>
                 <w:noProof/>
               </w:rPr>
-              <w:instrText xml:space="preserve"> PAGEREF _Toc243774151 \h </w:instrText>
+              <w:instrText xml:space="preserve"> PAGEREF _Toc243774577 \h </w:instrText>
             </w:r>
             <w:r>
               <w:rPr>
@@ -6467,7 +6467,7 @@
               <w14:ligatures w14:val="standardContextual"/>
             </w:rPr>
           </w:pPr>
-          <w:hyperlink w:anchor="_Toc243774152" w:history="1">
+          <w:hyperlink w:anchor="_Toc243774578" w:history="1">
             <w:r>
               <w:rPr>
                 <w:rStyle w:val="Hyperlink"/>
@@ -6491,7 +6491,7 @@
               <w:rPr>
                 <w:noProof/>
               </w:rPr>
-              <w:instrText xml:space="preserve"> PAGEREF _Toc243774152 \h </w:instrText>
+              <w:instrText xml:space="preserve"> PAGEREF _Toc243774578 \h </w:instrText>
             </w:r>
             <w:r>
               <w:rPr>
@@ -6531,7 +6531,7 @@
               <w14:ligatures w14:val="standardContextual"/>
             </w:rPr>
           </w:pPr>
-          <w:hyperlink w:anchor="_Toc243774153" w:history="1">
+          <w:hyperlink w:anchor="_Toc243774579" w:history="1">
             <w:r>
               <w:rPr>
                 <w:rStyle w:val="Hyperlink"/>
@@ -6555,7 +6555,7 @@
               <w:rPr>
                 <w:noProof/>
               </w:rPr>
-              <w:instrText xml:space="preserve"> PAGEREF _Toc243774153 \h </w:instrText>
+              <w:instrText xml:space="preserve"> PAGEREF _Toc243774579 \h </w:instrText>
             </w:r>
             <w:r>
               <w:rPr>
@@ -6595,7 +6595,7 @@
               <w14:ligatures w14:val="standardContextual"/>
             </w:rPr>
           </w:pPr>
-          <w:hyperlink w:anchor="_Toc243774154" w:history="1">
+          <w:hyperlink w:anchor="_Toc243774580" w:history="1">
             <w:r>
               <w:rPr>
                 <w:rStyle w:val="Hyperlink"/>
@@ -6619,7 +6619,7 @@
               <w:rPr>
                 <w:noProof/>
               </w:rPr>
-              <w:instrText xml:space="preserve"> PAGEREF _Toc243774154 \h </w:instrText>
+              <w:instrText xml:space="preserve"> PAGEREF _Toc243774580 \h </w:instrText>
             </w:r>
             <w:r>
               <w:rPr>
@@ -6659,7 +6659,7 @@
         <w:pageBreakBefore/>
         <w:jc w:val="center"/>
       </w:pPr>
-      <w:bookmarkStart w:id="5" w:name="_Toc243774067"/>
+      <w:bookmarkStart w:id="5" w:name="_Toc243774493"/>
       <w:r>
         <w:lastRenderedPageBreak/>
         <w:t>LIST OF FIGURES</w:t>
@@ -6710,7 +6710,7 @@
         <w:rPr>
           <w:noProof/>
         </w:rPr>
-        <w:instrText xml:space="preserve"> PAGEREF _Toc243774039 \h </w:instrText>
+        <w:instrText xml:space="preserve"> PAGEREF _Toc243774465 \h </w:instrText>
       </w:r>
       <w:r>
         <w:rPr>
@@ -6771,7 +6771,7 @@
         <w:rPr>
           <w:noProof/>
         </w:rPr>
-        <w:instrText xml:space="preserve"> PAGEREF _Toc243774040 \h </w:instrText>
+        <w:instrText xml:space="preserve"> PAGEREF _Toc243774466 \h </w:instrText>
       </w:r>
       <w:r>
         <w:rPr>
@@ -6832,7 +6832,7 @@
         <w:rPr>
           <w:noProof/>
         </w:rPr>
-        <w:instrText xml:space="preserve"> PAGEREF _Toc243774041 \h </w:instrText>
+        <w:instrText xml:space="preserve"> PAGEREF _Toc243774467 \h </w:instrText>
       </w:r>
       <w:r>
         <w:rPr>
@@ -6893,7 +6893,7 @@
         <w:rPr>
           <w:noProof/>
         </w:rPr>
-        <w:instrText xml:space="preserve"> PAGEREF _Toc243774042 \h </w:instrText>
+        <w:instrText xml:space="preserve"> PAGEREF _Toc243774468 \h </w:instrText>
       </w:r>
       <w:r>
         <w:rPr>
@@ -6954,7 +6954,7 @@
         <w:rPr>
           <w:noProof/>
         </w:rPr>
-        <w:instrText xml:space="preserve"> PAGEREF _Toc243774043 \h </w:instrText>
+        <w:instrText xml:space="preserve"> PAGEREF _Toc243774469 \h </w:instrText>
       </w:r>
       <w:r>
         <w:rPr>
@@ -7015,7 +7015,7 @@
         <w:rPr>
           <w:noProof/>
         </w:rPr>
-        <w:instrText xml:space="preserve"> PAGEREF _Toc243774044 \h </w:instrText>
+        <w:instrText xml:space="preserve"> PAGEREF _Toc243774470 \h </w:instrText>
       </w:r>
       <w:r>
         <w:rPr>
@@ -7052,7 +7052,7 @@
         <w:pageBreakBefore/>
         <w:jc w:val="center"/>
       </w:pPr>
-      <w:bookmarkStart w:id="6" w:name="_Toc243774068"/>
+      <w:bookmarkStart w:id="6" w:name="_Toc243774494"/>
       <w:r>
         <w:lastRenderedPageBreak/>
         <w:t>LIST OF TABLES</w:t>
@@ -7103,7 +7103,7 @@
         <w:rPr>
           <w:noProof/>
         </w:rPr>
-        <w:instrText xml:space="preserve"> PAGEREF _Toc243774045 \h </w:instrText>
+        <w:instrText xml:space="preserve"> PAGEREF _Toc243774471 \h </w:instrText>
       </w:r>
       <w:r>
         <w:rPr>
@@ -7164,7 +7164,7 @@
         <w:rPr>
           <w:noProof/>
         </w:rPr>
-        <w:instrText xml:space="preserve"> PAGEREF _Toc243774046 \h </w:instrText>
+        <w:instrText xml:space="preserve"> PAGEREF _Toc243774472 \h </w:instrText>
       </w:r>
       <w:r>
         <w:rPr>
@@ -7225,7 +7225,7 @@
         <w:rPr>
           <w:noProof/>
         </w:rPr>
-        <w:instrText xml:space="preserve"> PAGEREF _Toc243774047 \h </w:instrText>
+        <w:instrText xml:space="preserve"> PAGEREF _Toc243774473 \h </w:instrText>
       </w:r>
       <w:r>
         <w:rPr>
@@ -7286,7 +7286,7 @@
         <w:rPr>
           <w:noProof/>
         </w:rPr>
-        <w:instrText xml:space="preserve"> PAGEREF _Toc243774048 \h </w:instrText>
+        <w:instrText xml:space="preserve"> PAGEREF _Toc243774474 \h </w:instrText>
       </w:r>
       <w:r>
         <w:rPr>
@@ -7347,7 +7347,7 @@
         <w:rPr>
           <w:noProof/>
         </w:rPr>
-        <w:instrText xml:space="preserve"> PAGEREF _Toc243774049 \h </w:instrText>
+        <w:instrText xml:space="preserve"> PAGEREF _Toc243774475 \h </w:instrText>
       </w:r>
       <w:r>
         <w:rPr>
@@ -7408,7 +7408,7 @@
         <w:rPr>
           <w:noProof/>
         </w:rPr>
-        <w:instrText xml:space="preserve"> PAGEREF _Toc243774050 \h </w:instrText>
+        <w:instrText xml:space="preserve"> PAGEREF _Toc243774476 \h </w:instrText>
       </w:r>
       <w:r>
         <w:rPr>
@@ -7469,7 +7469,7 @@
         <w:rPr>
           <w:noProof/>
         </w:rPr>
-        <w:instrText xml:space="preserve"> PAGEREF _Toc243774051 \h </w:instrText>
+        <w:instrText xml:space="preserve"> PAGEREF _Toc243774477 \h </w:instrText>
       </w:r>
       <w:r>
         <w:rPr>
@@ -7530,7 +7530,7 @@
         <w:rPr>
           <w:noProof/>
         </w:rPr>
-        <w:instrText xml:space="preserve"> PAGEREF _Toc243774052 \h </w:instrText>
+        <w:instrText xml:space="preserve"> PAGEREF _Toc243774478 \h </w:instrText>
       </w:r>
       <w:r>
         <w:rPr>
@@ -7591,7 +7591,7 @@
         <w:rPr>
           <w:noProof/>
         </w:rPr>
-        <w:instrText xml:space="preserve"> PAGEREF _Toc243774053 \h </w:instrText>
+        <w:instrText xml:space="preserve"> PAGEREF _Toc243774479 \h </w:instrText>
       </w:r>
       <w:r>
         <w:rPr>
@@ -7652,7 +7652,7 @@
         <w:rPr>
           <w:noProof/>
         </w:rPr>
-        <w:instrText xml:space="preserve"> PAGEREF _Toc243774054 \h </w:instrText>
+        <w:instrText xml:space="preserve"> PAGEREF _Toc243774480 \h </w:instrText>
       </w:r>
       <w:r>
         <w:rPr>
@@ -7713,7 +7713,7 @@
         <w:rPr>
           <w:noProof/>
         </w:rPr>
-        <w:instrText xml:space="preserve"> PAGEREF _Toc243774055 \h </w:instrText>
+        <w:instrText xml:space="preserve"> PAGEREF _Toc243774481 \h </w:instrText>
       </w:r>
       <w:r>
         <w:rPr>
@@ -7774,7 +7774,7 @@
         <w:rPr>
           <w:noProof/>
         </w:rPr>
-        <w:instrText xml:space="preserve"> PAGEREF _Toc243774056 \h </w:instrText>
+        <w:instrText xml:space="preserve"> PAGEREF _Toc243774482 \h </w:instrText>
       </w:r>
       <w:r>
         <w:rPr>
@@ -7835,7 +7835,7 @@
         <w:rPr>
           <w:noProof/>
         </w:rPr>
-        <w:instrText xml:space="preserve"> PAGEREF _Toc243774057 \h </w:instrText>
+        <w:instrText xml:space="preserve"> PAGEREF _Toc243774483 \h </w:instrText>
       </w:r>
       <w:r>
         <w:rPr>
@@ -7896,7 +7896,7 @@
         <w:rPr>
           <w:noProof/>
         </w:rPr>
-        <w:instrText xml:space="preserve"> PAGEREF _Toc243774058 \h </w:instrText>
+        <w:instrText xml:space="preserve"> PAGEREF _Toc243774484 \h </w:instrText>
       </w:r>
       <w:r>
         <w:rPr>
@@ -7957,7 +7957,7 @@
         <w:rPr>
           <w:noProof/>
         </w:rPr>
-        <w:instrText xml:space="preserve"> PAGEREF _Toc243774059 \h </w:instrText>
+        <w:instrText xml:space="preserve"> PAGEREF _Toc243774485 \h </w:instrText>
       </w:r>
       <w:r>
         <w:rPr>
@@ -8018,7 +8018,7 @@
         <w:rPr>
           <w:noProof/>
         </w:rPr>
-        <w:instrText xml:space="preserve"> PAGEREF _Toc243774060 \h </w:instrText>
+        <w:instrText xml:space="preserve"> PAGEREF _Toc243774486 \h </w:instrText>
       </w:r>
       <w:r>
         <w:rPr>
@@ -8079,7 +8079,7 @@
         <w:rPr>
           <w:noProof/>
         </w:rPr>
-        <w:instrText xml:space="preserve"> PAGEREF _Toc243774061 \h </w:instrText>
+        <w:instrText xml:space="preserve"> PAGEREF _Toc243774487 \h </w:instrText>
       </w:r>
       <w:r>
         <w:rPr>
@@ -8126,7 +8126,7 @@
         <w:pageBreakBefore/>
         <w:jc w:val="center"/>
       </w:pPr>
-      <w:bookmarkStart w:id="7" w:name="_Toc243774069"/>
+      <w:bookmarkStart w:id="7" w:name="_Toc243774495"/>
       <w:r>
         <w:lastRenderedPageBreak/>
         <w:t>CHAPTER 1 INTRODUCTION</w:t>
@@ -8138,7 +8138,7 @@
         <w:pStyle w:val="Heading2"/>
         <w:keepNext/>
       </w:pPr>
-      <w:bookmarkStart w:id="8" w:name="_Toc243774070"/>
+      <w:bookmarkStart w:id="8" w:name="_Toc243774496"/>
       <w:r>
         <w:t>1.1 Internship Overview</w:t>
       </w:r>
@@ -8179,7 +8179,7 @@
         <w:pStyle w:val="Heading2"/>
         <w:keepNext/>
       </w:pPr>
-      <w:bookmarkStart w:id="9" w:name="_Toc243774071"/>
+      <w:bookmarkStart w:id="9" w:name="_Toc243774497"/>
       <w:r>
         <w:t>1.2 Objectives of the Internship</w:t>
       </w:r>
@@ -8283,7 +8283,7 @@
         <w:pStyle w:val="Heading2"/>
         <w:keepNext/>
       </w:pPr>
-      <w:bookmarkStart w:id="10" w:name="_Toc243774072"/>
+      <w:bookmarkStart w:id="10" w:name="_Toc243774498"/>
       <w:r>
         <w:lastRenderedPageBreak/>
         <w:t>1.3 Scope of the Internship</w:t>
@@ -8307,7 +8307,7 @@
         <w:pStyle w:val="Heading2"/>
         <w:keepNext/>
       </w:pPr>
-      <w:bookmarkStart w:id="11" w:name="_Toc243774073"/>
+      <w:bookmarkStart w:id="11" w:name="_Toc243774499"/>
       <w:r>
         <w:t>1.4 Technologies and Platforms Used</w:t>
       </w:r>
@@ -8320,7 +8320,7 @@
         <w:spacing w:before="80" w:after="240"/>
         <w:jc w:val="center"/>
       </w:pPr>
-      <w:bookmarkStart w:id="12" w:name="_Toc243774045"/>
+      <w:bookmarkStart w:id="12" w:name="_Toc243774471"/>
       <w:r>
         <w:t xml:space="preserve">Table </w:t>
       </w:r>
@@ -9213,7 +9213,7 @@
         <w:pStyle w:val="Heading2"/>
         <w:keepNext/>
       </w:pPr>
-      <w:bookmarkStart w:id="13" w:name="_Toc243774074"/>
+      <w:bookmarkStart w:id="13" w:name="_Toc243774500"/>
       <w:r>
         <w:t>1.5 Methodology</w:t>
       </w:r>
@@ -9240,7 +9240,7 @@
         </w:rPr>
         <w:lastRenderedPageBreak/>
         <w:drawing>
-          <wp:inline distT="0" distB="0" distL="0" distR="0" wp14:anchorId="3B16394F" wp14:editId="3B163950">
+          <wp:inline distT="0" distB="0" distL="0" distR="0" wp14:anchorId="09FD710D" wp14:editId="09FD710E">
             <wp:extent cx="5715000" cy="1371600"/>
             <wp:effectExtent l="0" t="0" r="0" b="0"/>
             <wp:docPr id="1" name="fig_timeline.png" descr="Phases of the internship" title="Phases of the internship"/>
@@ -9285,7 +9285,7 @@
         <w:spacing w:before="80" w:after="240"/>
         <w:jc w:val="center"/>
       </w:pPr>
-      <w:bookmarkStart w:id="14" w:name="_Toc243774039"/>
+      <w:bookmarkStart w:id="14" w:name="_Toc243774465"/>
       <w:r>
         <w:t xml:space="preserve">Figure </w:t>
       </w:r>
@@ -9317,7 +9317,7 @@
         <w:pStyle w:val="Heading2"/>
         <w:keepNext/>
       </w:pPr>
-      <w:bookmarkStart w:id="15" w:name="_Toc243774075"/>
+      <w:bookmarkStart w:id="15" w:name="_Toc243774501"/>
       <w:r>
         <w:t>1.6 Organization of the Report</w:t>
       </w:r>
@@ -9338,7 +9338,7 @@
         <w:pageBreakBefore/>
         <w:jc w:val="center"/>
       </w:pPr>
-      <w:bookmarkStart w:id="16" w:name="_Toc243774076"/>
+      <w:bookmarkStart w:id="16" w:name="_Toc243774502"/>
       <w:r>
         <w:lastRenderedPageBreak/>
         <w:t>CHAPTER 2 ORGANIZATION AND INTERNSHIP BACKGROUND</w:t>
@@ -9350,7 +9350,7 @@
         <w:pStyle w:val="Heading2"/>
         <w:keepNext/>
       </w:pPr>
-      <w:bookmarkStart w:id="17" w:name="_Toc243774077"/>
+      <w:bookmarkStart w:id="17" w:name="_Toc243774503"/>
       <w:r>
         <w:t>2.1 Organization Overview</w:t>
       </w:r>
@@ -9370,7 +9370,7 @@
         <w:pStyle w:val="Heading2"/>
         <w:keepNext/>
       </w:pPr>
-      <w:bookmarkStart w:id="18" w:name="_Toc243774078"/>
+      <w:bookmarkStart w:id="18" w:name="_Toc243774504"/>
       <w:r>
         <w:t>2.2 My Role and Way of Working</w:t>
       </w:r>
@@ -9393,7 +9393,7 @@
         <w:pStyle w:val="Heading2"/>
         <w:keepNext/>
       </w:pPr>
-      <w:bookmarkStart w:id="19" w:name="_Toc243774079"/>
+      <w:bookmarkStart w:id="19" w:name="_Toc243774505"/>
       <w:r>
         <w:t>2.3 Internship Curriculum</w:t>
       </w:r>
@@ -9415,7 +9415,7 @@
         <w:spacing w:before="80" w:after="240"/>
         <w:jc w:val="center"/>
       </w:pPr>
-      <w:bookmarkStart w:id="20" w:name="_Toc243774046"/>
+      <w:bookmarkStart w:id="20" w:name="_Toc243774472"/>
       <w:r>
         <w:t xml:space="preserve">Table </w:t>
       </w:r>
@@ -10401,7 +10401,7 @@
         <w:pStyle w:val="Heading2"/>
         <w:keepNext/>
       </w:pPr>
-      <w:bookmarkStart w:id="21" w:name="_Toc243774080"/>
+      <w:bookmarkStart w:id="21" w:name="_Toc243774506"/>
       <w:r>
         <w:t>2.4 Why an AI Agent Project</w:t>
       </w:r>
@@ -10422,7 +10422,7 @@
         <w:pageBreakBefore/>
         <w:jc w:val="center"/>
       </w:pPr>
-      <w:bookmarkStart w:id="22" w:name="_Toc243774081"/>
+      <w:bookmarkStart w:id="22" w:name="_Toc243774507"/>
       <w:r>
         <w:lastRenderedPageBreak/>
         <w:t>CHAPTER 3 PYTHON PROGRAMMING FOUNDATIONS</w:t>
@@ -10443,7 +10443,7 @@
         <w:pStyle w:val="Heading2"/>
         <w:keepNext/>
       </w:pPr>
-      <w:bookmarkStart w:id="23" w:name="_Toc243774082"/>
+      <w:bookmarkStart w:id="23" w:name="_Toc243774508"/>
       <w:r>
         <w:t>3.1 Python Setup and Installation</w:t>
       </w:r>
@@ -10463,7 +10463,7 @@
         <w:pStyle w:val="Heading2"/>
         <w:keepNext/>
       </w:pPr>
-      <w:bookmarkStart w:id="24" w:name="_Toc243774083"/>
+      <w:bookmarkStart w:id="24" w:name="_Toc243774509"/>
       <w:r>
         <w:t>3.2 Python Basics</w:t>
       </w:r>
@@ -10483,7 +10483,7 @@
         <w:pStyle w:val="Heading2"/>
         <w:keepNext/>
       </w:pPr>
-      <w:bookmarkStart w:id="25" w:name="_Toc243774084"/>
+      <w:bookmarkStart w:id="25" w:name="_Toc243774510"/>
       <w:r>
         <w:t>3.3 Python Operators</w:t>
       </w:r>
@@ -10503,7 +10503,7 @@
         <w:pStyle w:val="Heading2"/>
         <w:keepNext/>
       </w:pPr>
-      <w:bookmarkStart w:id="26" w:name="_Toc243774085"/>
+      <w:bookmarkStart w:id="26" w:name="_Toc243774511"/>
       <w:r>
         <w:t>3.4 Conditional Statements</w:t>
       </w:r>
@@ -10523,7 +10523,7 @@
         <w:pStyle w:val="Heading2"/>
         <w:keepNext/>
       </w:pPr>
-      <w:bookmarkStart w:id="27" w:name="_Toc243774086"/>
+      <w:bookmarkStart w:id="27" w:name="_Toc243774512"/>
       <w:r>
         <w:t>3.5 Loops</w:t>
       </w:r>
@@ -10543,7 +10543,7 @@
         <w:pStyle w:val="Heading2"/>
         <w:keepNext/>
       </w:pPr>
-      <w:bookmarkStart w:id="28" w:name="_Toc243774087"/>
+      <w:bookmarkStart w:id="28" w:name="_Toc243774513"/>
       <w:r>
         <w:lastRenderedPageBreak/>
         <w:t>3.6 Functions</w:t>
@@ -10616,7 +10616,7 @@
         <w:pageBreakBefore/>
         <w:jc w:val="center"/>
       </w:pPr>
-      <w:bookmarkStart w:id="29" w:name="_Toc243774088"/>
+      <w:bookmarkStart w:id="29" w:name="_Toc243774514"/>
       <w:r>
         <w:lastRenderedPageBreak/>
         <w:t>CHAPTER 4 DATA ANALYSIS AND VISUALIZATION</w:t>
@@ -10637,7 +10637,7 @@
         <w:pStyle w:val="Heading2"/>
         <w:keepNext/>
       </w:pPr>
-      <w:bookmarkStart w:id="30" w:name="_Toc243774089"/>
+      <w:bookmarkStart w:id="30" w:name="_Toc243774515"/>
       <w:r>
         <w:t>4.1 External Data Read and Write</w:t>
       </w:r>
@@ -10657,7 +10657,7 @@
         <w:pStyle w:val="Heading2"/>
         <w:keepNext/>
       </w:pPr>
-      <w:bookmarkStart w:id="31" w:name="_Toc243774090"/>
+      <w:bookmarkStart w:id="31" w:name="_Toc243774516"/>
       <w:r>
         <w:t>4.2 Data Summarization</w:t>
       </w:r>
@@ -10677,7 +10677,7 @@
         <w:pStyle w:val="Heading2"/>
         <w:keepNext/>
       </w:pPr>
-      <w:bookmarkStart w:id="32" w:name="_Toc243774091"/>
+      <w:bookmarkStart w:id="32" w:name="_Toc243774517"/>
       <w:r>
         <w:t>4.3 Data Manipulation</w:t>
       </w:r>
@@ -10697,7 +10697,7 @@
         <w:pStyle w:val="Heading2"/>
         <w:keepNext/>
       </w:pPr>
-      <w:bookmarkStart w:id="33" w:name="_Toc243774092"/>
+      <w:bookmarkStart w:id="33" w:name="_Toc243774518"/>
       <w:r>
         <w:t>4.4 Data Visualization and Dashboards</w:t>
       </w:r>
@@ -10724,7 +10724,7 @@
         </w:rPr>
         <w:lastRenderedPageBreak/>
         <w:drawing>
-          <wp:inline distT="0" distB="0" distL="0" distR="0" wp14:anchorId="3B163951" wp14:editId="3B163952">
+          <wp:inline distT="0" distB="0" distL="0" distR="0" wp14:anchorId="09FD710F" wp14:editId="09FD7110">
             <wp:extent cx="5334000" cy="2133600"/>
             <wp:effectExtent l="0" t="0" r="0" b="0"/>
             <wp:docPr id="2" name="iris_dashboard.png" descr="Data dashboard of the Iris dataset produced by the agent's chart tool" title="Data dashboard of the Iris dataset produced by the agent's chart tool"/>
@@ -10769,7 +10769,7 @@
         <w:spacing w:before="80" w:after="240"/>
         <w:jc w:val="center"/>
       </w:pPr>
-      <w:bookmarkStart w:id="34" w:name="_Toc243774040"/>
+      <w:bookmarkStart w:id="34" w:name="_Toc243774466"/>
       <w:r>
         <w:t xml:space="preserve">Figure </w:t>
       </w:r>
@@ -10802,7 +10802,7 @@
         <w:pageBreakBefore/>
         <w:jc w:val="center"/>
       </w:pPr>
-      <w:bookmarkStart w:id="35" w:name="_Toc243774093"/>
+      <w:bookmarkStart w:id="35" w:name="_Toc243774519"/>
       <w:r>
         <w:lastRenderedPageBreak/>
         <w:t>CHAPTER 5 MACHINE LEARNING AND PREDICTIVE MODELLING</w:t>
@@ -10823,7 +10823,7 @@
         <w:pStyle w:val="Heading2"/>
         <w:keepNext/>
       </w:pPr>
-      <w:bookmarkStart w:id="36" w:name="_Toc243774094"/>
+      <w:bookmarkStart w:id="36" w:name="_Toc243774520"/>
       <w:r>
         <w:t>5.1 Types of Machine Learning</w:t>
       </w:r>
@@ -10876,7 +10876,7 @@
         <w:pStyle w:val="Heading2"/>
         <w:keepNext/>
       </w:pPr>
-      <w:bookmarkStart w:id="37" w:name="_Toc243774095"/>
+      <w:bookmarkStart w:id="37" w:name="_Toc243774521"/>
       <w:r>
         <w:t>5.2 Standard Workflow for a Business Problem</w:t>
       </w:r>
@@ -10896,7 +10896,7 @@
         <w:pStyle w:val="Heading2"/>
         <w:keepNext/>
       </w:pPr>
-      <w:bookmarkStart w:id="38" w:name="_Toc243774096"/>
+      <w:bookmarkStart w:id="38" w:name="_Toc243774522"/>
       <w:r>
         <w:t>5.3 Logistic Regression</w:t>
       </w:r>
@@ -10916,7 +10916,7 @@
         <w:pStyle w:val="Heading2"/>
         <w:keepNext/>
       </w:pPr>
-      <w:bookmarkStart w:id="39" w:name="_Toc243774097"/>
+      <w:bookmarkStart w:id="39" w:name="_Toc243774523"/>
       <w:r>
         <w:t>5.4 K-Nearest Neighbours (KNN)</w:t>
       </w:r>
@@ -10936,7 +10936,7 @@
         <w:pStyle w:val="Heading2"/>
         <w:keepNext/>
       </w:pPr>
-      <w:bookmarkStart w:id="40" w:name="_Toc243774098"/>
+      <w:bookmarkStart w:id="40" w:name="_Toc243774524"/>
       <w:r>
         <w:lastRenderedPageBreak/>
         <w:t>5.5 Decision Trees</w:t>
@@ -10957,7 +10957,7 @@
         <w:pStyle w:val="Heading2"/>
         <w:keepNext/>
       </w:pPr>
-      <w:bookmarkStart w:id="41" w:name="_Toc243774099"/>
+      <w:bookmarkStart w:id="41" w:name="_Toc243774525"/>
       <w:r>
         <w:t>5.6 Random Forest</w:t>
       </w:r>
@@ -10977,7 +10977,7 @@
         <w:pStyle w:val="Heading2"/>
         <w:keepNext/>
       </w:pPr>
-      <w:bookmarkStart w:id="42" w:name="_Toc243774100"/>
+      <w:bookmarkStart w:id="42" w:name="_Toc243774526"/>
       <w:r>
         <w:t>5.7 K-Means and Clustering</w:t>
       </w:r>
@@ -10999,7 +10999,7 @@
         <w:spacing w:before="80" w:after="240"/>
         <w:jc w:val="center"/>
       </w:pPr>
-      <w:bookmarkStart w:id="43" w:name="_Toc243774047"/>
+      <w:bookmarkStart w:id="43" w:name="_Toc243774473"/>
       <w:r>
         <w:t xml:space="preserve">Table </w:t>
       </w:r>
@@ -11794,7 +11794,7 @@
         <w:pStyle w:val="Heading2"/>
         <w:keepNext/>
       </w:pPr>
-      <w:bookmarkStart w:id="44" w:name="_Toc243774101"/>
+      <w:bookmarkStart w:id="44" w:name="_Toc243774527"/>
       <w:r>
         <w:lastRenderedPageBreak/>
         <w:t>5.8 Review and Feedback</w:t>
@@ -11816,7 +11816,7 @@
         <w:pageBreakBefore/>
         <w:jc w:val="center"/>
       </w:pPr>
-      <w:bookmarkStart w:id="45" w:name="_Toc243774102"/>
+      <w:bookmarkStart w:id="45" w:name="_Toc243774528"/>
       <w:r>
         <w:lastRenderedPageBreak/>
         <w:t>CHAPTER 6 DEEP LEARNING, CLASSIFICATION AND GENERATIVE AI</w:t>
@@ -11837,7 +11837,7 @@
         <w:pStyle w:val="Heading2"/>
         <w:keepNext/>
       </w:pPr>
-      <w:bookmarkStart w:id="46" w:name="_Toc243774103"/>
+      <w:bookmarkStart w:id="46" w:name="_Toc243774529"/>
       <w:r>
         <w:t>6.1 Deep Learning</w:t>
       </w:r>
@@ -11857,7 +11857,7 @@
         <w:pStyle w:val="Heading2"/>
         <w:keepNext/>
       </w:pPr>
-      <w:bookmarkStart w:id="47" w:name="_Toc243774104"/>
+      <w:bookmarkStart w:id="47" w:name="_Toc243774530"/>
       <w:r>
         <w:t>6.2 Artificial Neural Networks for Regression</w:t>
       </w:r>
@@ -11880,7 +11880,7 @@
         <w:pStyle w:val="Heading2"/>
         <w:keepNext/>
       </w:pPr>
-      <w:bookmarkStart w:id="48" w:name="_Toc243774105"/>
+      <w:bookmarkStart w:id="48" w:name="_Toc243774531"/>
       <w:r>
         <w:t>6.3 Binary Classification</w:t>
       </w:r>
@@ -11900,7 +11900,7 @@
         <w:pStyle w:val="Heading2"/>
         <w:keepNext/>
       </w:pPr>
-      <w:bookmarkStart w:id="49" w:name="_Toc243774106"/>
+      <w:bookmarkStart w:id="49" w:name="_Toc243774532"/>
       <w:r>
         <w:t>6.4 Multi-Class Classification</w:t>
       </w:r>
@@ -11926,7 +11926,7 @@
         <w:spacing w:before="80" w:after="240"/>
         <w:jc w:val="center"/>
       </w:pPr>
-      <w:bookmarkStart w:id="50" w:name="_Toc243774048"/>
+      <w:bookmarkStart w:id="50" w:name="_Toc243774474"/>
       <w:r>
         <w:t xml:space="preserve">Table </w:t>
       </w:r>
@@ -12600,7 +12600,7 @@
         <w:pStyle w:val="Heading2"/>
         <w:keepNext/>
       </w:pPr>
-      <w:bookmarkStart w:id="51" w:name="_Toc243774107"/>
+      <w:bookmarkStart w:id="51" w:name="_Toc243774533"/>
       <w:r>
         <w:t>6.5 Generative AI and Large Language Models</w:t>
       </w:r>
@@ -12623,7 +12623,7 @@
         <w:pStyle w:val="Heading2"/>
         <w:keepNext/>
       </w:pPr>
-      <w:bookmarkStart w:id="52" w:name="_Toc243774108"/>
+      <w:bookmarkStart w:id="52" w:name="_Toc243774534"/>
       <w:r>
         <w:t>6.6 From Models to Agents</w:t>
       </w:r>
@@ -12644,7 +12644,7 @@
         <w:pageBreakBefore/>
         <w:jc w:val="center"/>
       </w:pPr>
-      <w:bookmarkStart w:id="53" w:name="_Toc243774109"/>
+      <w:bookmarkStart w:id="53" w:name="_Toc243774535"/>
       <w:r>
         <w:lastRenderedPageBreak/>
         <w:t>CHAPTER 7 PROJECT DESIGN: SMARTDATA AI AGENT</w:t>
@@ -12656,7 +12656,7 @@
         <w:pStyle w:val="Heading2"/>
         <w:keepNext/>
       </w:pPr>
-      <w:bookmarkStart w:id="54" w:name="_Toc243774110"/>
+      <w:bookmarkStart w:id="54" w:name="_Toc243774536"/>
       <w:r>
         <w:t>7.1 Problem Statement</w:t>
       </w:r>
@@ -12676,7 +12676,7 @@
         <w:pStyle w:val="Heading2"/>
         <w:keepNext/>
       </w:pPr>
-      <w:bookmarkStart w:id="55" w:name="_Toc243774111"/>
+      <w:bookmarkStart w:id="55" w:name="_Toc243774537"/>
       <w:r>
         <w:t>7.2 Project Objectives</w:t>
       </w:r>
@@ -12771,7 +12771,7 @@
         <w:pStyle w:val="Heading2"/>
         <w:keepNext/>
       </w:pPr>
-      <w:bookmarkStart w:id="56" w:name="_Toc243774112"/>
+      <w:bookmarkStart w:id="56" w:name="_Toc243774538"/>
       <w:r>
         <w:t>7.3 What Is an AI Agent? (Simple Explanation)</w:t>
       </w:r>
@@ -12797,7 +12797,7 @@
           <w:noProof/>
         </w:rPr>
         <w:drawing>
-          <wp:inline distT="0" distB="0" distL="0" distR="0" wp14:anchorId="3B163953" wp14:editId="3B163954">
+          <wp:inline distT="0" distB="0" distL="0" distR="0" wp14:anchorId="09FD7111" wp14:editId="09FD7112">
             <wp:extent cx="5715000" cy="1485900"/>
             <wp:effectExtent l="0" t="0" r="0" b="0"/>
             <wp:docPr id="3" name="fig_loop.png" descr="The Perceive-Think-Act-Observe-Respond loop of the agent" title="The Perceive-Think-Act-Observe-Respond loop of the agent"/>
@@ -12842,7 +12842,7 @@
         <w:spacing w:before="80" w:after="240"/>
         <w:jc w:val="center"/>
       </w:pPr>
-      <w:bookmarkStart w:id="57" w:name="_Toc243774041"/>
+      <w:bookmarkStart w:id="57" w:name="_Toc243774467"/>
       <w:r>
         <w:t xml:space="preserve">Figure </w:t>
       </w:r>
@@ -12874,7 +12874,7 @@
         <w:pStyle w:val="Heading2"/>
         <w:keepNext/>
       </w:pPr>
-      <w:bookmarkStart w:id="58" w:name="_Toc243774113"/>
+      <w:bookmarkStart w:id="58" w:name="_Toc243774539"/>
       <w:r>
         <w:t>7.4 System Architecture</w:t>
       </w:r>
@@ -12964,7 +12964,7 @@
           <w:noProof/>
         </w:rPr>
         <w:drawing>
-          <wp:inline distT="0" distB="0" distL="0" distR="0" wp14:anchorId="3B163955" wp14:editId="3B163956">
+          <wp:inline distT="0" distB="0" distL="0" distR="0" wp14:anchorId="09FD7113" wp14:editId="09FD7114">
             <wp:extent cx="5715000" cy="2971800"/>
             <wp:effectExtent l="0" t="0" r="0" b="0"/>
             <wp:docPr id="4" name="fig_architecture.png" descr="Architecture of the SmartData AI Agent" title="Architecture of the SmartData AI Agent"/>
@@ -13009,7 +13009,7 @@
         <w:spacing w:before="80" w:after="240"/>
         <w:jc w:val="center"/>
       </w:pPr>
-      <w:bookmarkStart w:id="59" w:name="_Toc243774042"/>
+      <w:bookmarkStart w:id="59" w:name="_Toc243774468"/>
       <w:r>
         <w:t xml:space="preserve">Figure </w:t>
       </w:r>
@@ -13041,7 +13041,7 @@
         <w:pStyle w:val="Heading2"/>
         <w:keepNext/>
       </w:pPr>
-      <w:bookmarkStart w:id="60" w:name="_Toc243774114"/>
+      <w:bookmarkStart w:id="60" w:name="_Toc243774540"/>
       <w:r>
         <w:t>7.5 Tools of the Agent</w:t>
       </w:r>
@@ -13054,7 +13054,7 @@
         <w:spacing w:before="80" w:after="240"/>
         <w:jc w:val="center"/>
       </w:pPr>
-      <w:bookmarkStart w:id="61" w:name="_Toc243774049"/>
+      <w:bookmarkStart w:id="61" w:name="_Toc243774475"/>
       <w:r>
         <w:t xml:space="preserve">Table </w:t>
       </w:r>
@@ -13763,7 +13763,7 @@
         <w:pStyle w:val="Heading2"/>
         <w:keepNext/>
       </w:pPr>
-      <w:bookmarkStart w:id="62" w:name="_Toc243774115"/>
+      <w:bookmarkStart w:id="62" w:name="_Toc243774541"/>
       <w:r>
         <w:lastRenderedPageBreak/>
         <w:t>7.6 The Brain: Rule-Based and LLM</w:t>
@@ -13793,7 +13793,7 @@
         <w:pStyle w:val="Heading2"/>
         <w:keepNext/>
       </w:pPr>
-      <w:bookmarkStart w:id="63" w:name="_Toc243774116"/>
+      <w:bookmarkStart w:id="63" w:name="_Toc243774542"/>
       <w:r>
         <w:t>7.7 Dataset</w:t>
       </w:r>
@@ -13814,7 +13814,7 @@
         <w:pageBreakBefore/>
         <w:jc w:val="center"/>
       </w:pPr>
-      <w:bookmarkStart w:id="64" w:name="_Toc243774117"/>
+      <w:bookmarkStart w:id="64" w:name="_Toc243774543"/>
       <w:r>
         <w:lastRenderedPageBreak/>
         <w:t>CHAPTER 8 IMPLEMENTATION</w:t>
@@ -13826,7 +13826,7 @@
         <w:pStyle w:val="Heading2"/>
         <w:keepNext/>
       </w:pPr>
-      <w:bookmarkStart w:id="65" w:name="_Toc243774118"/>
+      <w:bookmarkStart w:id="65" w:name="_Toc243774544"/>
       <w:r>
         <w:t>8.1 Project Structure</w:t>
       </w:r>
@@ -13944,7 +13944,7 @@
         <w:pStyle w:val="Heading2"/>
         <w:keepNext/>
       </w:pPr>
-      <w:bookmarkStart w:id="66" w:name="_Toc243774119"/>
+      <w:bookmarkStart w:id="66" w:name="_Toc243774545"/>
       <w:r>
         <w:t>8.2 The Tool Registry</w:t>
       </w:r>
@@ -14085,7 +14085,7 @@
         <w:pStyle w:val="Heading2"/>
         <w:keepNext/>
       </w:pPr>
-      <w:bookmarkStart w:id="67" w:name="_Toc243774120"/>
+      <w:bookmarkStart w:id="67" w:name="_Toc243774546"/>
       <w:r>
         <w:t>8.3 Model Comparison Tool</w:t>
       </w:r>
@@ -14254,7 +14254,7 @@
         <w:pStyle w:val="Heading2"/>
         <w:keepNext/>
       </w:pPr>
-      <w:bookmarkStart w:id="68" w:name="_Toc243774121"/>
+      <w:bookmarkStart w:id="68" w:name="_Toc243774547"/>
       <w:r>
         <w:t>8.4 The Rule-Based Brain</w:t>
       </w:r>
@@ -14400,7 +14400,7 @@
         <w:pStyle w:val="Heading2"/>
         <w:keepNext/>
       </w:pPr>
-      <w:bookmarkStart w:id="69" w:name="_Toc243774122"/>
+      <w:bookmarkStart w:id="69" w:name="_Toc243774548"/>
       <w:r>
         <w:t>8.5 The Agent Loop</w:t>
       </w:r>
@@ -14611,7 +14611,7 @@
         <w:pStyle w:val="Heading2"/>
         <w:keepNext/>
       </w:pPr>
-      <w:bookmarkStart w:id="70" w:name="_Toc243774123"/>
+      <w:bookmarkStart w:id="70" w:name="_Toc243774549"/>
       <w:r>
         <w:t>8.6 Safe Calculator</w:t>
       </w:r>
@@ -14631,7 +14631,7 @@
         <w:pStyle w:val="Heading2"/>
         <w:keepNext/>
       </w:pPr>
-      <w:bookmarkStart w:id="71" w:name="_Toc243774124"/>
+      <w:bookmarkStart w:id="71" w:name="_Toc243774550"/>
       <w:r>
         <w:t>8.7 Running the Project</w:t>
       </w:r>
@@ -14694,7 +14694,7 @@
         <w:pageBreakBefore/>
         <w:jc w:val="center"/>
       </w:pPr>
-      <w:bookmarkStart w:id="72" w:name="_Toc243774125"/>
+      <w:bookmarkStart w:id="72" w:name="_Toc243774551"/>
       <w:r>
         <w:lastRenderedPageBreak/>
         <w:t>CHAPTER 9 TESTING, RESULTS AND DISCUSSION</w:t>
@@ -14706,7 +14706,7 @@
         <w:pStyle w:val="Heading2"/>
         <w:keepNext/>
       </w:pPr>
-      <w:bookmarkStart w:id="73" w:name="_Toc243774126"/>
+      <w:bookmarkStart w:id="73" w:name="_Toc243774552"/>
       <w:r>
         <w:t>9.1 Testing Approach</w:t>
       </w:r>
@@ -14726,7 +14726,7 @@
         <w:pStyle w:val="Heading2"/>
         <w:keepNext/>
       </w:pPr>
-      <w:bookmarkStart w:id="74" w:name="_Toc243774127"/>
+      <w:bookmarkStart w:id="74" w:name="_Toc243774553"/>
       <w:r>
         <w:t>9.2 Functional Test Cases</w:t>
       </w:r>
@@ -14739,7 +14739,7 @@
         <w:spacing w:before="80" w:after="240"/>
         <w:jc w:val="center"/>
       </w:pPr>
-      <w:bookmarkStart w:id="75" w:name="_Toc243774050"/>
+      <w:bookmarkStart w:id="75" w:name="_Toc243774476"/>
       <w:r>
         <w:t xml:space="preserve">Table </w:t>
       </w:r>
@@ -16621,7 +16621,7 @@
         <w:pStyle w:val="Heading2"/>
         <w:keepNext/>
       </w:pPr>
-      <w:bookmarkStart w:id="76" w:name="_Toc243774128"/>
+      <w:bookmarkStart w:id="76" w:name="_Toc243774554"/>
       <w:r>
         <w:lastRenderedPageBreak/>
         <w:t>9.3 Model Comparison Results</w:t>
@@ -16635,7 +16635,7 @@
         <w:spacing w:before="80" w:after="240"/>
         <w:jc w:val="center"/>
       </w:pPr>
-      <w:bookmarkStart w:id="77" w:name="_Toc243774051"/>
+      <w:bookmarkStart w:id="77" w:name="_Toc243774477"/>
       <w:r>
         <w:t xml:space="preserve">Table </w:t>
       </w:r>
@@ -17166,7 +17166,7 @@
           <w:noProof/>
         </w:rPr>
         <w:drawing>
-          <wp:inline distT="0" distB="0" distL="0" distR="0" wp14:anchorId="3B163957" wp14:editId="3B163958">
+          <wp:inline distT="0" distB="0" distL="0" distR="0" wp14:anchorId="09FD7115" wp14:editId="09FD7116">
             <wp:extent cx="4572000" cy="2486025"/>
             <wp:effectExtent l="0" t="0" r="0" b="0"/>
             <wp:docPr id="5" name="fig_accuracy.png" descr="Test accuracy of the four classification models" title="Test accuracy of the four classification models"/>
@@ -17211,7 +17211,7 @@
         <w:spacing w:before="80" w:after="240"/>
         <w:jc w:val="center"/>
       </w:pPr>
-      <w:bookmarkStart w:id="78" w:name="_Toc243774043"/>
+      <w:bookmarkStart w:id="78" w:name="_Toc243774469"/>
       <w:r>
         <w:t xml:space="preserve">Figure </w:t>
       </w:r>
@@ -17259,7 +17259,7 @@
         </w:rPr>
         <w:lastRenderedPageBreak/>
         <w:drawing>
-          <wp:inline distT="0" distB="0" distL="0" distR="0" wp14:anchorId="3B163959" wp14:editId="3B16395A">
+          <wp:inline distT="0" distB="0" distL="0" distR="0" wp14:anchorId="09FD7117" wp14:editId="09FD7118">
             <wp:extent cx="3143250" cy="2619375"/>
             <wp:effectExtent l="0" t="0" r="0" b="0"/>
             <wp:docPr id="6" name="fig_confusion.png" descr="Confusion matrix of the best model (KNN) on 38 test flowers" title="Confusion matrix of the best model (KNN) on 38 test flowers"/>
@@ -17304,7 +17304,7 @@
         <w:spacing w:before="80" w:after="240"/>
         <w:jc w:val="center"/>
       </w:pPr>
-      <w:bookmarkStart w:id="79" w:name="_Toc243774044"/>
+      <w:bookmarkStart w:id="79" w:name="_Toc243774470"/>
       <w:r>
         <w:t xml:space="preserve">Figure </w:t>
       </w:r>
@@ -17336,7 +17336,7 @@
         <w:pStyle w:val="Heading2"/>
         <w:keepNext/>
       </w:pPr>
-      <w:bookmarkStart w:id="80" w:name="_Toc243774129"/>
+      <w:bookmarkStart w:id="80" w:name="_Toc243774555"/>
       <w:r>
         <w:t>9.4 Clustering Result</w:t>
       </w:r>
@@ -17349,7 +17349,7 @@
         <w:spacing w:before="80" w:after="240"/>
         <w:jc w:val="center"/>
       </w:pPr>
-      <w:bookmarkStart w:id="81" w:name="_Toc243774052"/>
+      <w:bookmarkStart w:id="81" w:name="_Toc243774478"/>
       <w:r>
         <w:t xml:space="preserve">Table </w:t>
       </w:r>
@@ -17911,7 +17911,7 @@
         <w:pStyle w:val="Heading2"/>
         <w:keepNext/>
       </w:pPr>
-      <w:bookmarkStart w:id="82" w:name="_Toc243774130"/>
+      <w:bookmarkStart w:id="82" w:name="_Toc243774556"/>
       <w:r>
         <w:t>9.5 Discussion</w:t>
       </w:r>
@@ -17931,7 +17931,7 @@
         <w:pStyle w:val="Heading2"/>
         <w:keepNext/>
       </w:pPr>
-      <w:bookmarkStart w:id="83" w:name="_Toc243774131"/>
+      <w:bookmarkStart w:id="83" w:name="_Toc243774557"/>
       <w:r>
         <w:lastRenderedPageBreak/>
         <w:t>9.6 Limitations</w:t>
@@ -18014,7 +18014,7 @@
         <w:pageBreakBefore/>
         <w:jc w:val="center"/>
       </w:pPr>
-      <w:bookmarkStart w:id="84" w:name="_Toc243774132"/>
+      <w:bookmarkStart w:id="84" w:name="_Toc243774558"/>
       <w:r>
         <w:lastRenderedPageBreak/>
         <w:t>CHAPTER 10 WEEK-WISE INTERNSHIP SUMMARY</w:t>
@@ -18026,7 +18026,7 @@
         <w:pStyle w:val="Heading2"/>
         <w:keepNext/>
       </w:pPr>
-      <w:bookmarkStart w:id="85" w:name="_Toc243774133"/>
+      <w:bookmarkStart w:id="85" w:name="_Toc243774559"/>
       <w:r>
         <w:t>10.1 Overview</w:t>
       </w:r>
@@ -18046,7 +18046,7 @@
         <w:pStyle w:val="Heading2"/>
         <w:keepNext/>
       </w:pPr>
-      <w:bookmarkStart w:id="86" w:name="_Toc243774134"/>
+      <w:bookmarkStart w:id="86" w:name="_Toc243774560"/>
       <w:r>
         <w:t>10.2 Phase 1: Python Foundations (Weeks 1-2)</w:t>
       </w:r>
@@ -18059,7 +18059,7 @@
         <w:spacing w:before="80" w:after="240"/>
         <w:jc w:val="center"/>
       </w:pPr>
-      <w:bookmarkStart w:id="87" w:name="_Toc243774053"/>
+      <w:bookmarkStart w:id="87" w:name="_Toc243774479"/>
       <w:r>
         <w:t xml:space="preserve">Table </w:t>
       </w:r>
@@ -18400,7 +18400,7 @@
         <w:pStyle w:val="Heading2"/>
         <w:keepNext/>
       </w:pPr>
-      <w:bookmarkStart w:id="88" w:name="_Toc243774135"/>
+      <w:bookmarkStart w:id="88" w:name="_Toc243774561"/>
       <w:r>
         <w:t>10.3 Phase 2: Data Analysis and Visualization (Weeks 3-4)</w:t>
       </w:r>
@@ -18413,7 +18413,7 @@
         <w:spacing w:before="80" w:after="240"/>
         <w:jc w:val="center"/>
       </w:pPr>
-      <w:bookmarkStart w:id="89" w:name="_Toc243774054"/>
+      <w:bookmarkStart w:id="89" w:name="_Toc243774480"/>
       <w:r>
         <w:t xml:space="preserve">Table </w:t>
       </w:r>
@@ -18754,7 +18754,7 @@
         <w:pStyle w:val="Heading2"/>
         <w:keepNext/>
       </w:pPr>
-      <w:bookmarkStart w:id="90" w:name="_Toc243774136"/>
+      <w:bookmarkStart w:id="90" w:name="_Toc243774562"/>
       <w:r>
         <w:t>10.4 Phase 3: Machine Learning (Weeks 5-8)</w:t>
       </w:r>
@@ -18767,7 +18767,7 @@
         <w:spacing w:before="80" w:after="240"/>
         <w:jc w:val="center"/>
       </w:pPr>
-      <w:bookmarkStart w:id="91" w:name="_Toc243774055"/>
+      <w:bookmarkStart w:id="91" w:name="_Toc243774481"/>
       <w:r>
         <w:t xml:space="preserve">Table </w:t>
       </w:r>
@@ -19293,7 +19293,7 @@
         <w:pStyle w:val="Heading2"/>
         <w:keepNext/>
       </w:pPr>
-      <w:bookmarkStart w:id="92" w:name="_Toc243774137"/>
+      <w:bookmarkStart w:id="92" w:name="_Toc243774563"/>
       <w:r>
         <w:t>10.5 Phase 4: Deep Learning, Classification and Generative AI (Weeks 9-14)</w:t>
       </w:r>
@@ -19306,7 +19306,7 @@
         <w:spacing w:before="80" w:after="240"/>
         <w:jc w:val="center"/>
       </w:pPr>
-      <w:bookmarkStart w:id="93" w:name="_Toc243774056"/>
+      <w:bookmarkStart w:id="93" w:name="_Toc243774482"/>
       <w:r>
         <w:t xml:space="preserve">Table </w:t>
       </w:r>
@@ -20015,7 +20015,7 @@
         <w:pStyle w:val="Heading2"/>
         <w:keepNext/>
       </w:pPr>
-      <w:bookmarkStart w:id="94" w:name="_Toc243774138"/>
+      <w:bookmarkStart w:id="94" w:name="_Toc243774564"/>
       <w:r>
         <w:t>10.6 Phase 5: AI Agent Project (Weeks 15-18)</w:t>
       </w:r>
@@ -20028,7 +20028,7 @@
         <w:spacing w:before="80" w:after="240"/>
         <w:jc w:val="center"/>
       </w:pPr>
-      <w:bookmarkStart w:id="95" w:name="_Toc243774057"/>
+      <w:bookmarkStart w:id="95" w:name="_Toc243774483"/>
       <w:r>
         <w:t xml:space="preserve">Table </w:t>
       </w:r>
@@ -20555,7 +20555,7 @@
         <w:pageBreakBefore/>
         <w:jc w:val="center"/>
       </w:pPr>
-      <w:bookmarkStart w:id="96" w:name="_Toc243774139"/>
+      <w:bookmarkStart w:id="96" w:name="_Toc243774565"/>
       <w:r>
         <w:lastRenderedPageBreak/>
         <w:t>CHAPTER 11 SKILLS, CHALLENGES AND LEARNING OUTCOMES</w:t>
@@ -20567,7 +20567,7 @@
         <w:pStyle w:val="Heading2"/>
         <w:keepNext/>
       </w:pPr>
-      <w:bookmarkStart w:id="97" w:name="_Toc243774140"/>
+      <w:bookmarkStart w:id="97" w:name="_Toc243774566"/>
       <w:r>
         <w:t>11.1 Technical Skills Gained</w:t>
       </w:r>
@@ -20580,7 +20580,7 @@
         <w:spacing w:before="80" w:after="240"/>
         <w:jc w:val="center"/>
       </w:pPr>
-      <w:bookmarkStart w:id="98" w:name="_Toc243774058"/>
+      <w:bookmarkStart w:id="98" w:name="_Toc243774484"/>
       <w:r>
         <w:t xml:space="preserve">Table </w:t>
       </w:r>
@@ -21208,7 +21208,7 @@
         <w:pStyle w:val="Heading2"/>
         <w:keepNext/>
       </w:pPr>
-      <w:bookmarkStart w:id="99" w:name="_Toc243774141"/>
+      <w:bookmarkStart w:id="99" w:name="_Toc243774567"/>
       <w:r>
         <w:t>11.2 Professional Skills Gained</w:t>
       </w:r>
@@ -21275,7 +21275,7 @@
         <w:pStyle w:val="Heading2"/>
         <w:keepNext/>
       </w:pPr>
-      <w:bookmarkStart w:id="100" w:name="_Toc243774142"/>
+      <w:bookmarkStart w:id="100" w:name="_Toc243774568"/>
       <w:r>
         <w:t>11.3 Performance Evaluation by the Organization</w:t>
       </w:r>
@@ -21297,7 +21297,7 @@
         <w:spacing w:before="80" w:after="240"/>
         <w:jc w:val="center"/>
       </w:pPr>
-      <w:bookmarkStart w:id="101" w:name="_Toc243774059"/>
+      <w:bookmarkStart w:id="101" w:name="_Toc243774485"/>
       <w:r>
         <w:lastRenderedPageBreak/>
         <w:t xml:space="preserve">Table </w:t>
@@ -22375,7 +22375,7 @@
         <w:pStyle w:val="Heading2"/>
         <w:keepNext/>
       </w:pPr>
-      <w:bookmarkStart w:id="102" w:name="_Toc243774143"/>
+      <w:bookmarkStart w:id="102" w:name="_Toc243774569"/>
       <w:r>
         <w:t>11.4 Challenges and How They Were Solved</w:t>
       </w:r>
@@ -22388,7 +22388,7 @@
         <w:spacing w:before="80" w:after="240"/>
         <w:jc w:val="center"/>
       </w:pPr>
-      <w:bookmarkStart w:id="103" w:name="_Toc243774060"/>
+      <w:bookmarkStart w:id="103" w:name="_Toc243774486"/>
       <w:r>
         <w:t xml:space="preserve">Table </w:t>
       </w:r>
@@ -22890,7 +22890,7 @@
         <w:pStyle w:val="Heading2"/>
         <w:keepNext/>
       </w:pPr>
-      <w:bookmarkStart w:id="104" w:name="_Toc243774144"/>
+      <w:bookmarkStart w:id="104" w:name="_Toc243774570"/>
       <w:r>
         <w:t>11.5 Learning Outcomes</w:t>
       </w:r>
@@ -22915,7 +22915,7 @@
         <w:pageBreakBefore/>
         <w:jc w:val="center"/>
       </w:pPr>
-      <w:bookmarkStart w:id="105" w:name="_Toc243774145"/>
+      <w:bookmarkStart w:id="105" w:name="_Toc243774571"/>
       <w:r>
         <w:lastRenderedPageBreak/>
         <w:t>CHAPTER 12 CONCLUSION AND FUTURE SCOPE</w:t>
@@ -22927,7 +22927,7 @@
         <w:pStyle w:val="Heading2"/>
         <w:keepNext/>
       </w:pPr>
-      <w:bookmarkStart w:id="106" w:name="_Toc243774146"/>
+      <w:bookmarkStart w:id="106" w:name="_Toc243774572"/>
       <w:r>
         <w:t>12.1 Conclusion</w:t>
       </w:r>
@@ -22950,7 +22950,7 @@
         <w:pStyle w:val="Heading2"/>
         <w:keepNext/>
       </w:pPr>
-      <w:bookmarkStart w:id="107" w:name="_Toc243774147"/>
+      <w:bookmarkStart w:id="107" w:name="_Toc243774573"/>
       <w:r>
         <w:t>12.2 Future Scope</w:t>
       </w:r>
@@ -23046,7 +23046,7 @@
         <w:pageBreakBefore/>
         <w:jc w:val="center"/>
       </w:pPr>
-      <w:bookmarkStart w:id="108" w:name="_Toc243774148"/>
+      <w:bookmarkStart w:id="108" w:name="_Toc243774574"/>
       <w:r>
         <w:lastRenderedPageBreak/>
         <w:t>REFERENCES</w:t>
@@ -23158,7 +23158,7 @@
         <w:pageBreakBefore/>
         <w:jc w:val="center"/>
       </w:pPr>
-      <w:bookmarkStart w:id="109" w:name="_Toc243774149"/>
+      <w:bookmarkStart w:id="109" w:name="_Toc243774575"/>
       <w:r>
         <w:lastRenderedPageBreak/>
         <w:t>APPENDIX A: SAMPLE RUN OF THE AGENT</w:t>
@@ -24184,7 +24184,7 @@
         <w:pageBreakBefore/>
         <w:jc w:val="center"/>
       </w:pPr>
-      <w:bookmarkStart w:id="110" w:name="_Toc243774150"/>
+      <w:bookmarkStart w:id="110" w:name="_Toc243774576"/>
       <w:r>
         <w:lastRenderedPageBreak/>
         <w:t>APPENDIX B: GLOSSARY</w:t>
@@ -24198,7 +24198,7 @@
         <w:spacing w:before="80" w:after="240"/>
         <w:jc w:val="center"/>
       </w:pPr>
-      <w:bookmarkStart w:id="111" w:name="_Toc243774061"/>
+      <w:bookmarkStart w:id="111" w:name="_Toc243774487"/>
       <w:r>
         <w:t xml:space="preserve">Table </w:t>
       </w:r>
@@ -25205,7 +25205,7 @@
         <w:pageBreakBefore/>
         <w:jc w:val="center"/>
       </w:pPr>
-      <w:bookmarkStart w:id="112" w:name="_Toc243774151"/>
+      <w:bookmarkStart w:id="112" w:name="_Toc243774577"/>
       <w:r>
         <w:lastRenderedPageBreak/>
         <w:t>ANNEXURE I: INTERNSHIP JOINING / OFFER LETTER</w:t>
@@ -25232,7 +25232,7 @@
         <w:pageBreakBefore/>
         <w:jc w:val="center"/>
       </w:pPr>
-      <w:bookmarkStart w:id="113" w:name="_Toc243774152"/>
+      <w:bookmarkStart w:id="113" w:name="_Toc243774578"/>
       <w:r>
         <w:lastRenderedPageBreak/>
         <w:t>ANNEXURE II: INTERNSHIP COMPLETION CERTIFICATE</w:t>
@@ -25259,7 +25259,7 @@
         <w:pageBreakBefore/>
         <w:jc w:val="center"/>
       </w:pPr>
-      <w:bookmarkStart w:id="114" w:name="_Toc243774153"/>
+      <w:bookmarkStart w:id="114" w:name="_Toc243774579"/>
       <w:r>
         <w:lastRenderedPageBreak/>
         <w:t>ANNEXURE III: WEEKLY INTERNSHIP REPORTS</w:t>
@@ -25286,7 +25286,7 @@
         <w:pageBreakBefore/>
         <w:jc w:val="center"/>
       </w:pPr>
-      <w:bookmarkStart w:id="115" w:name="_Toc243774154"/>
+      <w:bookmarkStart w:id="115" w:name="_Toc243774580"/>
       <w:r>
         <w:lastRenderedPageBreak/>
         <w:t>ANNEXURE IV: INTERNSHIP PERFORMANCE REPORT</w:t>
@@ -25452,10 +25452,10 @@
 <file path=word/numbering.xml><?xml version="1.0" encoding="utf-8"?>
 <w:numbering xmlns:wpc="http://schemas.microsoft.com/office/word/2010/wordprocessingCanvas" xmlns:cx="http://schemas.microsoft.com/office/drawing/2014/chartex" xmlns:cx1="http://schemas.microsoft.com/office/drawing/2015/9/8/chartex" xmlns:cx2="http://schemas.microsoft.com/office/drawing/2015/10/21/chartex" xmlns:cx3="http://schemas.microsoft.com/office/drawing/2016/5/9/chartex" xmlns:cx4="http://schemas.microsoft.com/office/drawing/2016/5/10/chartex" xmlns:cx5="http://schemas.microsoft.com/office/drawing/2016/5/11/chartex" xmlns:cx6="http://schemas.microsoft.com/office/drawing/2016/5/12/chartex" xmlns:cx7="http://schemas.microsoft.com/office/drawing/2016/5/13/chartex" xmlns:cx8="http://schemas.microsoft.com/office/drawing/2016/5/14/chartex" xmlns:mc="http://schemas.openxmlformats.org/markup-compatibility/2006" xmlns:aink="http://schemas.microsoft.com/office/drawing/2016/ink" xmlns:am3d="http://schemas.microsoft.com/office/drawing/2017/model3d" xmlns:o="urn:schemas-microsoft-com:office:office" xmlns:oel="http://schemas.microsoft.com/office/2019/extlst" xmlns:r="http://schemas.openxmlformats.org/officeDocument/2006/relationships" xmlns:m="http://schemas.openxmlformats.org/officeDocument/2006/math" xmlns:v="urn:schemas-microsoft-com:vml" xmlns:wp14="http://schemas.microsoft.com/office/word/2010/wordprocessingDrawing" xmlns:wp="http://schemas.openxmlformats.org/drawingml/2006/wordprocessingDrawing" xmlns:w10="urn:schemas-microsoft-com:office:word" xmlns:w="http://schemas.openxmlformats.org/wordprocessingml/2006/main" xmlns:w14="http://schemas.microsoft.com/office/word/2010/wordml" xmlns:w15="http://schemas.microsoft.com/office/word/2012/wordml" xmlns:w16cex="http://schemas.microsoft.com/office/word/2018/wordml/cex" xmlns:w16cid="http://schemas.microsoft.com/office/word/2016/wordml/cid" xmlns:w16="http://schemas.microsoft.com/office/word/2018/wordml" xmlns:w16du="http://schemas.microsoft.com/office/word/2023/wordml/word16du" xmlns:w16sdtdh="http://schemas.microsoft.com/office/word/2020/wordml/sdtdatahash" xmlns:w16sdtfl="http://schemas.microsoft.com/office/word/2024/wordml/sdtformatlock" xmlns:w16se="http://schemas.microsoft.com/office/word/2015/wordml/symex" xmlns:wpg="http://schemas.microsoft.com/office/word/2010/wordprocessingGroup" xmlns:wpi="http://schemas.microsoft.com/office/word/2010/wordprocessingInk" xmlns:wne="http://schemas.microsoft.com/office/word/2006/wordml" xmlns:wps="http://schemas.microsoft.com/office/word/2010/wordprocessingShape" mc:Ignorable="w14 w15 w16se w16cid w16 w16cex w16sdtdh w16sdtfl w16du wp14">
   <w:abstractNum w:abstractNumId="0" w15:restartNumberingAfterBreak="0">
-    <w:nsid w:val="14006FE2"/>
+    <w:nsid w:val="348E7B43"/>
     <w:multiLevelType w:val="hybridMultilevel"/>
-    <w:tmpl w:val="EBC23168"/>
-    <w:lvl w:ilvl="0" w:tplc="E0466012">
+    <w:tmpl w:val="079C3E36"/>
+    <w:lvl w:ilvl="0" w:tplc="1DF21B92">
       <w:start w:val="1"/>
       <w:numFmt w:val="bullet"/>
       <w:lvlText w:val="•"/>
@@ -25464,52 +25464,52 @@
         <w:ind w:left="720" w:hanging="360"/>
       </w:pPr>
     </w:lvl>
-    <w:lvl w:ilvl="1" w:tplc="28362362">
+    <w:lvl w:ilvl="1" w:tplc="3328FB12">
       <w:numFmt w:val="decimal"/>
       <w:lvlText w:val=""/>
       <w:lvlJc w:val="left"/>
     </w:lvl>
-    <w:lvl w:ilvl="2" w:tplc="D7628AA8">
+    <w:lvl w:ilvl="2" w:tplc="99F84982">
       <w:numFmt w:val="decimal"/>
       <w:lvlText w:val=""/>
       <w:lvlJc w:val="left"/>
     </w:lvl>
-    <w:lvl w:ilvl="3" w:tplc="E986447C">
+    <w:lvl w:ilvl="3" w:tplc="72C463F0">
       <w:numFmt w:val="decimal"/>
       <w:lvlText w:val=""/>
       <w:lvlJc w:val="left"/>
     </w:lvl>
-    <w:lvl w:ilvl="4" w:tplc="D8B665F0">
+    <w:lvl w:ilvl="4" w:tplc="5804F9B0">
       <w:numFmt w:val="decimal"/>
       <w:lvlText w:val=""/>
       <w:lvlJc w:val="left"/>
     </w:lvl>
-    <w:lvl w:ilvl="5" w:tplc="3DC04B74">
+    <w:lvl w:ilvl="5" w:tplc="5B368A8C">
       <w:numFmt w:val="decimal"/>
       <w:lvlText w:val=""/>
       <w:lvlJc w:val="left"/>
     </w:lvl>
-    <w:lvl w:ilvl="6" w:tplc="EED85C32">
+    <w:lvl w:ilvl="6" w:tplc="7CA8BACC">
       <w:numFmt w:val="decimal"/>
       <w:lvlText w:val=""/>
       <w:lvlJc w:val="left"/>
     </w:lvl>
-    <w:lvl w:ilvl="7" w:tplc="5D3C4344">
+    <w:lvl w:ilvl="7" w:tplc="9F26219E">
       <w:numFmt w:val="decimal"/>
       <w:lvlText w:val=""/>
       <w:lvlJc w:val="left"/>
     </w:lvl>
-    <w:lvl w:ilvl="8" w:tplc="D99A97B0">
+    <w:lvl w:ilvl="8" w:tplc="EAD4671C">
       <w:numFmt w:val="decimal"/>
       <w:lvlText w:val=""/>
       <w:lvlJc w:val="left"/>
     </w:lvl>
   </w:abstractNum>
   <w:abstractNum w:abstractNumId="1" w15:restartNumberingAfterBreak="0">
-    <w:nsid w:val="5E052E0E"/>
+    <w:nsid w:val="5A4A1D55"/>
     <w:multiLevelType w:val="hybridMultilevel"/>
-    <w:tmpl w:val="5536838A"/>
-    <w:lvl w:ilvl="0" w:tplc="CDD04DA8" w:tentative="1">
+    <w:tmpl w:val="4CD06016"/>
+    <w:lvl w:ilvl="0" w:tplc="B290AB28" w:tentative="1">
       <w:start w:val="1"/>
       <w:numFmt w:val="bullet"/>
       <w:lvlText w:val="●"/>
@@ -25518,7 +25518,7 @@
         <w:ind w:left="720" w:hanging="360"/>
       </w:pPr>
     </w:lvl>
-    <w:lvl w:ilvl="1" w:tplc="BC72EF70" w:tentative="1">
+    <w:lvl w:ilvl="1" w:tplc="B3E02698" w:tentative="1">
       <w:start w:val="1"/>
       <w:numFmt w:val="bullet"/>
       <w:lvlText w:val="○"/>
@@ -25527,7 +25527,7 @@
         <w:ind w:left="1440" w:hanging="360"/>
       </w:pPr>
     </w:lvl>
-    <w:lvl w:ilvl="2" w:tplc="36A6D09C" w:tentative="1">
+    <w:lvl w:ilvl="2" w:tplc="EF509066" w:tentative="1">
       <w:start w:val="1"/>
       <w:numFmt w:val="bullet"/>
       <w:lvlText w:val="■"/>
@@ -25536,7 +25536,7 @@
         <w:ind w:left="2160" w:hanging="360"/>
       </w:pPr>
     </w:lvl>
-    <w:lvl w:ilvl="3" w:tplc="6A362FD2" w:tentative="1">
+    <w:lvl w:ilvl="3" w:tplc="1966B548" w:tentative="1">
       <w:start w:val="1"/>
       <w:numFmt w:val="bullet"/>
       <w:lvlText w:val="●"/>
@@ -25545,7 +25545,7 @@
         <w:ind w:left="2880" w:hanging="360"/>
       </w:pPr>
     </w:lvl>
-    <w:lvl w:ilvl="4" w:tplc="D73487AE" w:tentative="1">
+    <w:lvl w:ilvl="4" w:tplc="331E4BD4" w:tentative="1">
       <w:start w:val="1"/>
       <w:numFmt w:val="bullet"/>
       <w:lvlText w:val="○"/>
@@ -25554,7 +25554,7 @@
         <w:ind w:left="3600" w:hanging="360"/>
       </w:pPr>
     </w:lvl>
-    <w:lvl w:ilvl="5" w:tplc="814CC204" w:tentative="1">
+    <w:lvl w:ilvl="5" w:tplc="8E944462" w:tentative="1">
       <w:start w:val="1"/>
       <w:numFmt w:val="bullet"/>
       <w:lvlText w:val="■"/>
@@ -25563,7 +25563,7 @@
         <w:ind w:left="4320" w:hanging="360"/>
       </w:pPr>
     </w:lvl>
-    <w:lvl w:ilvl="6" w:tplc="C73028E4" w:tentative="1">
+    <w:lvl w:ilvl="6" w:tplc="BC50D89A" w:tentative="1">
       <w:start w:val="1"/>
       <w:numFmt w:val="bullet"/>
       <w:lvlText w:val="●"/>
@@ -25572,7 +25572,7 @@
         <w:ind w:left="5040" w:hanging="360"/>
       </w:pPr>
     </w:lvl>
-    <w:lvl w:ilvl="7" w:tplc="335463D0" w:tentative="1">
+    <w:lvl w:ilvl="7" w:tplc="30A4644C" w:tentative="1">
       <w:start w:val="1"/>
       <w:numFmt w:val="bullet"/>
       <w:lvlText w:val="●"/>
@@ -25581,7 +25581,7 @@
         <w:ind w:left="5760" w:hanging="360"/>
       </w:pPr>
     </w:lvl>
-    <w:lvl w:ilvl="8" w:tplc="ACACBA8A" w:tentative="1">
+    <w:lvl w:ilvl="8" w:tplc="4AE6B31A" w:tentative="1">
       <w:start w:val="1"/>
       <w:numFmt w:val="bullet"/>
       <w:lvlText w:val="●"/>
@@ -25591,13 +25591,13 @@
       </w:pPr>
     </w:lvl>
   </w:abstractNum>
-  <w:num w:numId="1" w16cid:durableId="1948850105">
+  <w:num w:numId="1" w16cid:durableId="42947539">
     <w:abstractNumId w:val="1"/>
     <w:lvlOverride w:ilvl="0">
       <w:startOverride w:val="1"/>
     </w:lvlOverride>
   </w:num>
-  <w:num w:numId="2" w16cid:durableId="2093042581">
+  <w:num w:numId="2" w16cid:durableId="1726024778">
     <w:abstractNumId w:val="0"/>
     <w:lvlOverride w:ilvl="0">
       <w:startOverride w:val="1"/>
@@ -26355,7 +26355,7 @@
     <w:next w:val="Normal"/>
     <w:uiPriority w:val="99"/>
     <w:unhideWhenUsed/>
-    <w:rsid w:val="00A5653D"/>
+    <w:rsid w:val="00701C02"/>
   </w:style>
   <w:style w:type="character" w:styleId="UnresolvedMention">
     <w:name w:val="Unresolved Mention"/>
@@ -26363,7 +26363,7 @@
     <w:uiPriority w:val="99"/>
     <w:semiHidden/>
     <w:unhideWhenUsed/>
-    <w:rsid w:val="00A5653D"/>
+    <w:rsid w:val="00701C02"/>
     <w:rPr>
       <w:color w:val="605E5C"/>
       <w:shd w:val="clear" w:color="auto" w:fill="E1DFDD"/>

</xml_diff>

<commit_message>
Shorten abstract and add plagiarism report page
Condense the abstract into a single professional paragraph with a
shorter keyword list, and add Annexure V: Plagiarism Report as the
final page with a details table and signature lines.

Co-Authored-By: Claude Opus 5.5 <noreply@anthropic.com>
</commit_message>
<xml_diff>
--- a/Rutuja_Soundale_Internship_Report.docx
+++ b/Rutuja_Soundale_Internship_Report.docx
@@ -252,7 +252,7 @@
         <w:pageBreakBefore/>
         <w:jc w:val="center"/>
       </w:pPr>
-      <w:bookmarkStart w:id="0" w:name="_Toc243774488"/>
+      <w:bookmarkStart w:id="0" w:name="_Toc243833806"/>
       <w:r>
         <w:lastRenderedPageBreak/>
         <w:t>CERTIFICATE</w:t>
@@ -455,7 +455,7 @@
         <w:pageBreakBefore/>
         <w:jc w:val="center"/>
       </w:pPr>
-      <w:bookmarkStart w:id="1" w:name="_Toc243774489"/>
+      <w:bookmarkStart w:id="1" w:name="_Toc243833807"/>
       <w:r>
         <w:lastRenderedPageBreak/>
         <w:t>ACKNOWLEDGEMENT</w:t>
@@ -528,9 +528,8 @@
         <w:pageBreakBefore/>
         <w:jc w:val="center"/>
       </w:pPr>
-      <w:bookmarkStart w:id="2" w:name="_Toc243774490"/>
-      <w:r>
-        <w:lastRenderedPageBreak/>
+      <w:bookmarkStart w:id="2" w:name="_Toc243833808"/>
+      <w:r>
         <w:t>ABSTRACT</w:t>
       </w:r>
       <w:bookmarkEnd w:id="2"/>
@@ -541,45 +540,12 @@
         <w:jc w:val="both"/>
       </w:pPr>
       <w:r>
-        <w:t>This report describes my four-month internship in Artificial Intelligence and Generative AI at YBI Foundation from 18 June 2026 to 18 October 2026, carried out under the mentorship of Dr. Alok Yadav. The internship followed a structured curriculum. It started with Python programming: setup, basics, operators, conditional statements, loops and functions. It continued with data analysis using Pandas: reading and writing external data, data summarization, data manipulation and building data dashboards with Mat</w:t>
-      </w:r>
-      <w:r>
-        <w:t>plotlib.</w:t>
-      </w:r>
-    </w:p>
-    <w:p>
-      <w:pPr>
-        <w:spacing w:after="120" w:line="360" w:lineRule="auto"/>
-        <w:jc w:val="both"/>
-      </w:pPr>
-      <w:r>
-        <w:t>The next phase covered predictive modelling and predictive analytics. I studied and applied Logistic Regression, K-Nearest Neighbours (KNN), Decision Trees, Random Forest, K-Means and clustering models to business problems. This was followed by deep learning, Artificial Neural Network (ANN) regression and binary and multi-class classification, along with their advantages, disadvantages, applications and limitations. I was also introduced to Generative AI, large language models and prompt engineering.</w:t>
-      </w:r>
-    </w:p>
-    <w:p>
-      <w:pPr>
-        <w:spacing w:after="120" w:line="360" w:lineRule="auto"/>
-        <w:jc w:val="both"/>
-      </w:pPr>
-      <w:r>
-        <w:t>In the final phase I designed and built the SmartData AI Agent, a basic tool-using AI agent written in Python. A user types a request in plain English, and the agent follows a simple Perceive, Think, Act, Observe and Respond loop. Its brain decides which of six tools to use: dataset summary, chart creation, model comparison, species prediction, K-Means clustering and a safe calculator. The brain is rule-based and works fully offline, and it can optionally use the Google Gemini large language model to choose</w:t>
-      </w:r>
-      <w:r>
-        <w:t xml:space="preserve"> tools. The agent also keeps a short conversation memory.</w:t>
-      </w:r>
-    </w:p>
-    <w:p>
-      <w:pPr>
-        <w:spacing w:after="120" w:line="360" w:lineRule="auto"/>
-        <w:jc w:val="both"/>
-      </w:pPr>
-      <w:r>
-        <w:t>The agent was tested with eleven test cases covering every tool and also unclear or unsupported requests, and it handled all of them correctly. On the Iris dataset, the four models reached test accuracies of 94.7% (Logistic Regression), 97.4% (KNN), 89.5% (Decision Tree) and 92.1% (Random Forest), and the agent automatically selected KNN for prediction. The report also presents the week-wise work, the skills gained, the challenges faced, the limitations of the project and its future scope.</w:t>
-      </w:r>
-    </w:p>
-    <w:p>
-      <w:pPr>
-        <w:spacing w:after="120" w:line="360" w:lineRule="auto"/>
+        <w:t>This report presents the work carried out during a four-month internship in Artificial Intelligence and Generative AI at YBI Foundation (18 June 2026 to 18 October 2026) under the mentorship of Dr. Alok Yadav. The internship covered Python programming, data analysis and visualization using Pandas and Matplotlib, predictive modelling with Logistic Regression, K-Nearest Neighbours (KNN), Decision Tree, Random Forest and K-Means, deep learning with Artificial Neural Networks, and an introduction to Generative AI and large language models. As the final project, the SmartData AI Agent was developed: a Python-based, tool-using agent that interprets plain-English requests through a Perceive, Think, Act, Observe and Respond loop and selects among six tools for dataset summary, visualization, model comparison, prediction, clustering and calculation. Its rule-based decision module operates fully offline, with optional Google Gemini support for tool selection. The agent passed all eleven test cases, and on the Iris dataset KNN achieved the highest test accuracy of 97.4% and was selected automatically for prediction. The report also outlines the week-wise progress, skills gained, limitations and future scope of the work.</w:t>
+      </w:r>
+    </w:p>
+    <w:p>
+      <w:pPr>
+        <w:spacing w:before="240" w:after="120" w:line="360" w:lineRule="auto"/>
         <w:jc w:val="both"/>
       </w:pPr>
       <w:r>
@@ -590,7 +556,11 @@
         <w:t xml:space="preserve">Keywords: </w:t>
       </w:r>
       <w:r>
-        <w:t>Python; Pandas; data visualization; machine learning; logistic regression; KNN; decision tree; random forest; K-Means; artificial neural network; classification; Generative AI; large language model; AI agent; tool calling.</w:t>
+        <w:rPr>
+          <w:i/>
+          <w:iCs/>
+        </w:rPr>
+        <w:t>Artificial Intelligence; Machine Learning; Python; Predictive Modelling; Generative AI; Large Language Models; AI Agent.</w:t>
       </w:r>
     </w:p>
     <w:p>
@@ -599,9 +569,8 @@
         <w:pageBreakBefore/>
         <w:jc w:val="center"/>
       </w:pPr>
-      <w:bookmarkStart w:id="3" w:name="_Toc243774491"/>
-      <w:r>
-        <w:lastRenderedPageBreak/>
+      <w:bookmarkStart w:id="3" w:name="_Toc243833809"/>
+      <w:r>
         <w:t>DECLARATION</w:t>
       </w:r>
       <w:bookmarkEnd w:id="3"/>
@@ -671,9 +640,8 @@
         <w:pageBreakBefore/>
         <w:jc w:val="center"/>
       </w:pPr>
-      <w:bookmarkStart w:id="4" w:name="_Toc243774492"/>
-      <w:r>
-        <w:lastRenderedPageBreak/>
+      <w:bookmarkStart w:id="4" w:name="_Toc243833810"/>
+      <w:r>
         <w:t>CONTENTS</w:t>
       </w:r>
       <w:bookmarkEnd w:id="4"/>
@@ -707,7 +675,7 @@
           <w:r>
             <w:fldChar w:fldCharType="separate"/>
           </w:r>
-          <w:hyperlink w:anchor="_Toc243774488" w:history="1">
+          <w:hyperlink w:anchor="_Toc243833806" w:history="1">
             <w:r>
               <w:rPr>
                 <w:rStyle w:val="Hyperlink"/>
@@ -731,7 +699,7 @@
               <w:rPr>
                 <w:noProof/>
               </w:rPr>
-              <w:instrText xml:space="preserve"> PAGEREF _Toc243774488 \h </w:instrText>
+              <w:instrText xml:space="preserve"> PAGEREF _Toc243833806 \h </w:instrText>
             </w:r>
             <w:r>
               <w:rPr>
@@ -771,7 +739,7 @@
               <w14:ligatures w14:val="standardContextual"/>
             </w:rPr>
           </w:pPr>
-          <w:hyperlink w:anchor="_Toc243774489" w:history="1">
+          <w:hyperlink w:anchor="_Toc243833807" w:history="1">
             <w:r>
               <w:rPr>
                 <w:rStyle w:val="Hyperlink"/>
@@ -795,7 +763,7 @@
               <w:rPr>
                 <w:noProof/>
               </w:rPr>
-              <w:instrText xml:space="preserve"> PAGEREF _Toc243774489 \h </w:instrText>
+              <w:instrText xml:space="preserve"> PAGEREF _Toc243833807 \h </w:instrText>
             </w:r>
             <w:r>
               <w:rPr>
@@ -835,7 +803,7 @@
               <w14:ligatures w14:val="standardContextual"/>
             </w:rPr>
           </w:pPr>
-          <w:hyperlink w:anchor="_Toc243774490" w:history="1">
+          <w:hyperlink w:anchor="_Toc243833808" w:history="1">
             <w:r>
               <w:rPr>
                 <w:rStyle w:val="Hyperlink"/>
@@ -859,7 +827,7 @@
               <w:rPr>
                 <w:noProof/>
               </w:rPr>
-              <w:instrText xml:space="preserve"> PAGEREF _Toc243774490 \h </w:instrText>
+              <w:instrText xml:space="preserve"> PAGEREF _Toc243833808 \h </w:instrText>
             </w:r>
             <w:r>
               <w:rPr>
@@ -899,7 +867,7 @@
               <w14:ligatures w14:val="standardContextual"/>
             </w:rPr>
           </w:pPr>
-          <w:hyperlink w:anchor="_Toc243774491" w:history="1">
+          <w:hyperlink w:anchor="_Toc243833809" w:history="1">
             <w:r>
               <w:rPr>
                 <w:rStyle w:val="Hyperlink"/>
@@ -923,7 +891,7 @@
               <w:rPr>
                 <w:noProof/>
               </w:rPr>
-              <w:instrText xml:space="preserve"> PAGEREF _Toc243774491 \h </w:instrText>
+              <w:instrText xml:space="preserve"> PAGEREF _Toc243833809 \h </w:instrText>
             </w:r>
             <w:r>
               <w:rPr>
@@ -963,7 +931,7 @@
               <w14:ligatures w14:val="standardContextual"/>
             </w:rPr>
           </w:pPr>
-          <w:hyperlink w:anchor="_Toc243774492" w:history="1">
+          <w:hyperlink w:anchor="_Toc243833810" w:history="1">
             <w:r>
               <w:rPr>
                 <w:rStyle w:val="Hyperlink"/>
@@ -987,7 +955,7 @@
               <w:rPr>
                 <w:noProof/>
               </w:rPr>
-              <w:instrText xml:space="preserve"> PAGEREF _Toc243774492 \h </w:instrText>
+              <w:instrText xml:space="preserve"> PAGEREF _Toc243833810 \h </w:instrText>
             </w:r>
             <w:r>
               <w:rPr>
@@ -1027,7 +995,7 @@
               <w14:ligatures w14:val="standardContextual"/>
             </w:rPr>
           </w:pPr>
-          <w:hyperlink w:anchor="_Toc243774493" w:history="1">
+          <w:hyperlink w:anchor="_Toc243833811" w:history="1">
             <w:r>
               <w:rPr>
                 <w:rStyle w:val="Hyperlink"/>
@@ -1051,7 +1019,7 @@
               <w:rPr>
                 <w:noProof/>
               </w:rPr>
-              <w:instrText xml:space="preserve"> PAGEREF _Toc243774493 \h </w:instrText>
+              <w:instrText xml:space="preserve"> PAGEREF _Toc243833811 \h </w:instrText>
             </w:r>
             <w:r>
               <w:rPr>
@@ -1091,7 +1059,7 @@
               <w14:ligatures w14:val="standardContextual"/>
             </w:rPr>
           </w:pPr>
-          <w:hyperlink w:anchor="_Toc243774494" w:history="1">
+          <w:hyperlink w:anchor="_Toc243833812" w:history="1">
             <w:r>
               <w:rPr>
                 <w:rStyle w:val="Hyperlink"/>
@@ -1115,7 +1083,7 @@
               <w:rPr>
                 <w:noProof/>
               </w:rPr>
-              <w:instrText xml:space="preserve"> PAGEREF _Toc243774494 \h </w:instrText>
+              <w:instrText xml:space="preserve"> PAGEREF _Toc243833812 \h </w:instrText>
             </w:r>
             <w:r>
               <w:rPr>
@@ -1155,7 +1123,7 @@
               <w14:ligatures w14:val="standardContextual"/>
             </w:rPr>
           </w:pPr>
-          <w:hyperlink w:anchor="_Toc243774495" w:history="1">
+          <w:hyperlink w:anchor="_Toc243833813" w:history="1">
             <w:r>
               <w:rPr>
                 <w:rStyle w:val="Hyperlink"/>
@@ -1179,7 +1147,7 @@
               <w:rPr>
                 <w:noProof/>
               </w:rPr>
-              <w:instrText xml:space="preserve"> PAGEREF _Toc243774495 \h </w:instrText>
+              <w:instrText xml:space="preserve"> PAGEREF _Toc243833813 \h </w:instrText>
             </w:r>
             <w:r>
               <w:rPr>
@@ -1219,7 +1187,7 @@
               <w14:ligatures w14:val="standardContextual"/>
             </w:rPr>
           </w:pPr>
-          <w:hyperlink w:anchor="_Toc243774496" w:history="1">
+          <w:hyperlink w:anchor="_Toc243833814" w:history="1">
             <w:r>
               <w:rPr>
                 <w:rStyle w:val="Hyperlink"/>
@@ -1243,7 +1211,7 @@
               <w:rPr>
                 <w:noProof/>
               </w:rPr>
-              <w:instrText xml:space="preserve"> PAGEREF _Toc243774496 \h </w:instrText>
+              <w:instrText xml:space="preserve"> PAGEREF _Toc243833814 \h </w:instrText>
             </w:r>
             <w:r>
               <w:rPr>
@@ -1283,7 +1251,7 @@
               <w14:ligatures w14:val="standardContextual"/>
             </w:rPr>
           </w:pPr>
-          <w:hyperlink w:anchor="_Toc243774497" w:history="1">
+          <w:hyperlink w:anchor="_Toc243833815" w:history="1">
             <w:r>
               <w:rPr>
                 <w:rStyle w:val="Hyperlink"/>
@@ -1307,7 +1275,7 @@
               <w:rPr>
                 <w:noProof/>
               </w:rPr>
-              <w:instrText xml:space="preserve"> PAGEREF _Toc243774497 \h </w:instrText>
+              <w:instrText xml:space="preserve"> PAGEREF _Toc243833815 \h </w:instrText>
             </w:r>
             <w:r>
               <w:rPr>
@@ -1347,7 +1315,7 @@
               <w14:ligatures w14:val="standardContextual"/>
             </w:rPr>
           </w:pPr>
-          <w:hyperlink w:anchor="_Toc243774498" w:history="1">
+          <w:hyperlink w:anchor="_Toc243833816" w:history="1">
             <w:r>
               <w:rPr>
                 <w:rStyle w:val="Hyperlink"/>
@@ -1371,7 +1339,7 @@
               <w:rPr>
                 <w:noProof/>
               </w:rPr>
-              <w:instrText xml:space="preserve"> PAGEREF _Toc243774498 \h </w:instrText>
+              <w:instrText xml:space="preserve"> PAGEREF _Toc243833816 \h </w:instrText>
             </w:r>
             <w:r>
               <w:rPr>
@@ -1411,7 +1379,7 @@
               <w14:ligatures w14:val="standardContextual"/>
             </w:rPr>
           </w:pPr>
-          <w:hyperlink w:anchor="_Toc243774499" w:history="1">
+          <w:hyperlink w:anchor="_Toc243833817" w:history="1">
             <w:r>
               <w:rPr>
                 <w:rStyle w:val="Hyperlink"/>
@@ -1435,7 +1403,7 @@
               <w:rPr>
                 <w:noProof/>
               </w:rPr>
-              <w:instrText xml:space="preserve"> PAGEREF _Toc243774499 \h </w:instrText>
+              <w:instrText xml:space="preserve"> PAGEREF _Toc243833817 \h </w:instrText>
             </w:r>
             <w:r>
               <w:rPr>
@@ -1475,7 +1443,7 @@
               <w14:ligatures w14:val="standardContextual"/>
             </w:rPr>
           </w:pPr>
-          <w:hyperlink w:anchor="_Toc243774500" w:history="1">
+          <w:hyperlink w:anchor="_Toc243833818" w:history="1">
             <w:r>
               <w:rPr>
                 <w:rStyle w:val="Hyperlink"/>
@@ -1499,7 +1467,7 @@
               <w:rPr>
                 <w:noProof/>
               </w:rPr>
-              <w:instrText xml:space="preserve"> PAGEREF _Toc243774500 \h </w:instrText>
+              <w:instrText xml:space="preserve"> PAGEREF _Toc243833818 \h </w:instrText>
             </w:r>
             <w:r>
               <w:rPr>
@@ -1539,7 +1507,7 @@
               <w14:ligatures w14:val="standardContextual"/>
             </w:rPr>
           </w:pPr>
-          <w:hyperlink w:anchor="_Toc243774501" w:history="1">
+          <w:hyperlink w:anchor="_Toc243833819" w:history="1">
             <w:r>
               <w:rPr>
                 <w:rStyle w:val="Hyperlink"/>
@@ -1563,7 +1531,7 @@
               <w:rPr>
                 <w:noProof/>
               </w:rPr>
-              <w:instrText xml:space="preserve"> PAGEREF _Toc243774501 \h </w:instrText>
+              <w:instrText xml:space="preserve"> PAGEREF _Toc243833819 \h </w:instrText>
             </w:r>
             <w:r>
               <w:rPr>
@@ -1603,7 +1571,7 @@
               <w14:ligatures w14:val="standardContextual"/>
             </w:rPr>
           </w:pPr>
-          <w:hyperlink w:anchor="_Toc243774502" w:history="1">
+          <w:hyperlink w:anchor="_Toc243833820" w:history="1">
             <w:r>
               <w:rPr>
                 <w:rStyle w:val="Hyperlink"/>
@@ -1627,7 +1595,7 @@
               <w:rPr>
                 <w:noProof/>
               </w:rPr>
-              <w:instrText xml:space="preserve"> PAGEREF _Toc243774502 \h </w:instrText>
+              <w:instrText xml:space="preserve"> PAGEREF _Toc243833820 \h </w:instrText>
             </w:r>
             <w:r>
               <w:rPr>
@@ -1667,7 +1635,7 @@
               <w14:ligatures w14:val="standardContextual"/>
             </w:rPr>
           </w:pPr>
-          <w:hyperlink w:anchor="_Toc243774503" w:history="1">
+          <w:hyperlink w:anchor="_Toc243833821" w:history="1">
             <w:r>
               <w:rPr>
                 <w:rStyle w:val="Hyperlink"/>
@@ -1691,7 +1659,7 @@
               <w:rPr>
                 <w:noProof/>
               </w:rPr>
-              <w:instrText xml:space="preserve"> PAGEREF _Toc243774503 \h </w:instrText>
+              <w:instrText xml:space="preserve"> PAGEREF _Toc243833821 \h </w:instrText>
             </w:r>
             <w:r>
               <w:rPr>
@@ -1731,7 +1699,7 @@
               <w14:ligatures w14:val="standardContextual"/>
             </w:rPr>
           </w:pPr>
-          <w:hyperlink w:anchor="_Toc243774504" w:history="1">
+          <w:hyperlink w:anchor="_Toc243833822" w:history="1">
             <w:r>
               <w:rPr>
                 <w:rStyle w:val="Hyperlink"/>
@@ -1755,7 +1723,7 @@
               <w:rPr>
                 <w:noProof/>
               </w:rPr>
-              <w:instrText xml:space="preserve"> PAGEREF _Toc243774504 \h </w:instrText>
+              <w:instrText xml:space="preserve"> PAGEREF _Toc243833822 \h </w:instrText>
             </w:r>
             <w:r>
               <w:rPr>
@@ -1795,7 +1763,7 @@
               <w14:ligatures w14:val="standardContextual"/>
             </w:rPr>
           </w:pPr>
-          <w:hyperlink w:anchor="_Toc243774505" w:history="1">
+          <w:hyperlink w:anchor="_Toc243833823" w:history="1">
             <w:r>
               <w:rPr>
                 <w:rStyle w:val="Hyperlink"/>
@@ -1819,7 +1787,7 @@
               <w:rPr>
                 <w:noProof/>
               </w:rPr>
-              <w:instrText xml:space="preserve"> PAGEREF _Toc243774505 \h </w:instrText>
+              <w:instrText xml:space="preserve"> PAGEREF _Toc243833823 \h </w:instrText>
             </w:r>
             <w:r>
               <w:rPr>
@@ -1859,7 +1827,7 @@
               <w14:ligatures w14:val="standardContextual"/>
             </w:rPr>
           </w:pPr>
-          <w:hyperlink w:anchor="_Toc243774506" w:history="1">
+          <w:hyperlink w:anchor="_Toc243833824" w:history="1">
             <w:r>
               <w:rPr>
                 <w:rStyle w:val="Hyperlink"/>
@@ -1883,7 +1851,7 @@
               <w:rPr>
                 <w:noProof/>
               </w:rPr>
-              <w:instrText xml:space="preserve"> PAGEREF _Toc243774506 \h </w:instrText>
+              <w:instrText xml:space="preserve"> PAGEREF _Toc243833824 \h </w:instrText>
             </w:r>
             <w:r>
               <w:rPr>
@@ -1923,7 +1891,7 @@
               <w14:ligatures w14:val="standardContextual"/>
             </w:rPr>
           </w:pPr>
-          <w:hyperlink w:anchor="_Toc243774507" w:history="1">
+          <w:hyperlink w:anchor="_Toc243833825" w:history="1">
             <w:r>
               <w:rPr>
                 <w:rStyle w:val="Hyperlink"/>
@@ -1947,7 +1915,7 @@
               <w:rPr>
                 <w:noProof/>
               </w:rPr>
-              <w:instrText xml:space="preserve"> PAGEREF _Toc243774507 \h </w:instrText>
+              <w:instrText xml:space="preserve"> PAGEREF _Toc243833825 \h </w:instrText>
             </w:r>
             <w:r>
               <w:rPr>
@@ -1987,7 +1955,7 @@
               <w14:ligatures w14:val="standardContextual"/>
             </w:rPr>
           </w:pPr>
-          <w:hyperlink w:anchor="_Toc243774508" w:history="1">
+          <w:hyperlink w:anchor="_Toc243833826" w:history="1">
             <w:r>
               <w:rPr>
                 <w:rStyle w:val="Hyperlink"/>
@@ -2011,7 +1979,7 @@
               <w:rPr>
                 <w:noProof/>
               </w:rPr>
-              <w:instrText xml:space="preserve"> PAGEREF _Toc243774508 \h </w:instrText>
+              <w:instrText xml:space="preserve"> PAGEREF _Toc243833826 \h </w:instrText>
             </w:r>
             <w:r>
               <w:rPr>
@@ -2051,7 +2019,7 @@
               <w14:ligatures w14:val="standardContextual"/>
             </w:rPr>
           </w:pPr>
-          <w:hyperlink w:anchor="_Toc243774509" w:history="1">
+          <w:hyperlink w:anchor="_Toc243833827" w:history="1">
             <w:r>
               <w:rPr>
                 <w:rStyle w:val="Hyperlink"/>
@@ -2075,7 +2043,7 @@
               <w:rPr>
                 <w:noProof/>
               </w:rPr>
-              <w:instrText xml:space="preserve"> PAGEREF _Toc243774509 \h </w:instrText>
+              <w:instrText xml:space="preserve"> PAGEREF _Toc243833827 \h </w:instrText>
             </w:r>
             <w:r>
               <w:rPr>
@@ -2115,7 +2083,7 @@
               <w14:ligatures w14:val="standardContextual"/>
             </w:rPr>
           </w:pPr>
-          <w:hyperlink w:anchor="_Toc243774510" w:history="1">
+          <w:hyperlink w:anchor="_Toc243833828" w:history="1">
             <w:r>
               <w:rPr>
                 <w:rStyle w:val="Hyperlink"/>
@@ -2139,7 +2107,7 @@
               <w:rPr>
                 <w:noProof/>
               </w:rPr>
-              <w:instrText xml:space="preserve"> PAGEREF _Toc243774510 \h </w:instrText>
+              <w:instrText xml:space="preserve"> PAGEREF _Toc243833828 \h </w:instrText>
             </w:r>
             <w:r>
               <w:rPr>
@@ -2179,7 +2147,7 @@
               <w14:ligatures w14:val="standardContextual"/>
             </w:rPr>
           </w:pPr>
-          <w:hyperlink w:anchor="_Toc243774511" w:history="1">
+          <w:hyperlink w:anchor="_Toc243833829" w:history="1">
             <w:r>
               <w:rPr>
                 <w:rStyle w:val="Hyperlink"/>
@@ -2203,7 +2171,7 @@
               <w:rPr>
                 <w:noProof/>
               </w:rPr>
-              <w:instrText xml:space="preserve"> PAGEREF _Toc243774511 \h </w:instrText>
+              <w:instrText xml:space="preserve"> PAGEREF _Toc243833829 \h </w:instrText>
             </w:r>
             <w:r>
               <w:rPr>
@@ -2243,7 +2211,7 @@
               <w14:ligatures w14:val="standardContextual"/>
             </w:rPr>
           </w:pPr>
-          <w:hyperlink w:anchor="_Toc243774512" w:history="1">
+          <w:hyperlink w:anchor="_Toc243833830" w:history="1">
             <w:r>
               <w:rPr>
                 <w:rStyle w:val="Hyperlink"/>
@@ -2267,7 +2235,7 @@
               <w:rPr>
                 <w:noProof/>
               </w:rPr>
-              <w:instrText xml:space="preserve"> PAGEREF _Toc243774512 \h </w:instrText>
+              <w:instrText xml:space="preserve"> PAGEREF _Toc243833830 \h </w:instrText>
             </w:r>
             <w:r>
               <w:rPr>
@@ -2307,7 +2275,7 @@
               <w14:ligatures w14:val="standardContextual"/>
             </w:rPr>
           </w:pPr>
-          <w:hyperlink w:anchor="_Toc243774513" w:history="1">
+          <w:hyperlink w:anchor="_Toc243833831" w:history="1">
             <w:r>
               <w:rPr>
                 <w:rStyle w:val="Hyperlink"/>
@@ -2331,7 +2299,7 @@
               <w:rPr>
                 <w:noProof/>
               </w:rPr>
-              <w:instrText xml:space="preserve"> PAGEREF _Toc243774513 \h </w:instrText>
+              <w:instrText xml:space="preserve"> PAGEREF _Toc243833831 \h </w:instrText>
             </w:r>
             <w:r>
               <w:rPr>
@@ -2371,7 +2339,7 @@
               <w14:ligatures w14:val="standardContextual"/>
             </w:rPr>
           </w:pPr>
-          <w:hyperlink w:anchor="_Toc243774514" w:history="1">
+          <w:hyperlink w:anchor="_Toc243833832" w:history="1">
             <w:r>
               <w:rPr>
                 <w:rStyle w:val="Hyperlink"/>
@@ -2395,7 +2363,7 @@
               <w:rPr>
                 <w:noProof/>
               </w:rPr>
-              <w:instrText xml:space="preserve"> PAGEREF _Toc243774514 \h </w:instrText>
+              <w:instrText xml:space="preserve"> PAGEREF _Toc243833832 \h </w:instrText>
             </w:r>
             <w:r>
               <w:rPr>
@@ -2435,7 +2403,7 @@
               <w14:ligatures w14:val="standardContextual"/>
             </w:rPr>
           </w:pPr>
-          <w:hyperlink w:anchor="_Toc243774515" w:history="1">
+          <w:hyperlink w:anchor="_Toc243833833" w:history="1">
             <w:r>
               <w:rPr>
                 <w:rStyle w:val="Hyperlink"/>
@@ -2459,7 +2427,7 @@
               <w:rPr>
                 <w:noProof/>
               </w:rPr>
-              <w:instrText xml:space="preserve"> PAGEREF _Toc243774515 \h </w:instrText>
+              <w:instrText xml:space="preserve"> PAGEREF _Toc243833833 \h </w:instrText>
             </w:r>
             <w:r>
               <w:rPr>
@@ -2499,7 +2467,7 @@
               <w14:ligatures w14:val="standardContextual"/>
             </w:rPr>
           </w:pPr>
-          <w:hyperlink w:anchor="_Toc243774516" w:history="1">
+          <w:hyperlink w:anchor="_Toc243833834" w:history="1">
             <w:r>
               <w:rPr>
                 <w:rStyle w:val="Hyperlink"/>
@@ -2523,7 +2491,7 @@
               <w:rPr>
                 <w:noProof/>
               </w:rPr>
-              <w:instrText xml:space="preserve"> PAGEREF _Toc243774516 \h </w:instrText>
+              <w:instrText xml:space="preserve"> PAGEREF _Toc243833834 \h </w:instrText>
             </w:r>
             <w:r>
               <w:rPr>
@@ -2563,7 +2531,7 @@
               <w14:ligatures w14:val="standardContextual"/>
             </w:rPr>
           </w:pPr>
-          <w:hyperlink w:anchor="_Toc243774517" w:history="1">
+          <w:hyperlink w:anchor="_Toc243833835" w:history="1">
             <w:r>
               <w:rPr>
                 <w:rStyle w:val="Hyperlink"/>
@@ -2587,7 +2555,7 @@
               <w:rPr>
                 <w:noProof/>
               </w:rPr>
-              <w:instrText xml:space="preserve"> PAGEREF _Toc243774517 \h </w:instrText>
+              <w:instrText xml:space="preserve"> PAGEREF _Toc243833835 \h </w:instrText>
             </w:r>
             <w:r>
               <w:rPr>
@@ -2627,7 +2595,7 @@
               <w14:ligatures w14:val="standardContextual"/>
             </w:rPr>
           </w:pPr>
-          <w:hyperlink w:anchor="_Toc243774518" w:history="1">
+          <w:hyperlink w:anchor="_Toc243833836" w:history="1">
             <w:r>
               <w:rPr>
                 <w:rStyle w:val="Hyperlink"/>
@@ -2651,7 +2619,7 @@
               <w:rPr>
                 <w:noProof/>
               </w:rPr>
-              <w:instrText xml:space="preserve"> PAGEREF _Toc243774518 \h </w:instrText>
+              <w:instrText xml:space="preserve"> PAGEREF _Toc243833836 \h </w:instrText>
             </w:r>
             <w:r>
               <w:rPr>
@@ -2691,7 +2659,7 @@
               <w14:ligatures w14:val="standardContextual"/>
             </w:rPr>
           </w:pPr>
-          <w:hyperlink w:anchor="_Toc243774519" w:history="1">
+          <w:hyperlink w:anchor="_Toc243833837" w:history="1">
             <w:r>
               <w:rPr>
                 <w:rStyle w:val="Hyperlink"/>
@@ -2715,7 +2683,7 @@
               <w:rPr>
                 <w:noProof/>
               </w:rPr>
-              <w:instrText xml:space="preserve"> PAGEREF _Toc243774519 \h </w:instrText>
+              <w:instrText xml:space="preserve"> PAGEREF _Toc243833837 \h </w:instrText>
             </w:r>
             <w:r>
               <w:rPr>
@@ -2755,7 +2723,7 @@
               <w14:ligatures w14:val="standardContextual"/>
             </w:rPr>
           </w:pPr>
-          <w:hyperlink w:anchor="_Toc243774520" w:history="1">
+          <w:hyperlink w:anchor="_Toc243833838" w:history="1">
             <w:r>
               <w:rPr>
                 <w:rStyle w:val="Hyperlink"/>
@@ -2779,7 +2747,7 @@
               <w:rPr>
                 <w:noProof/>
               </w:rPr>
-              <w:instrText xml:space="preserve"> PAGEREF _Toc243774520 \h </w:instrText>
+              <w:instrText xml:space="preserve"> PAGEREF _Toc243833838 \h </w:instrText>
             </w:r>
             <w:r>
               <w:rPr>
@@ -2819,7 +2787,7 @@
               <w14:ligatures w14:val="standardContextual"/>
             </w:rPr>
           </w:pPr>
-          <w:hyperlink w:anchor="_Toc243774521" w:history="1">
+          <w:hyperlink w:anchor="_Toc243833839" w:history="1">
             <w:r>
               <w:rPr>
                 <w:rStyle w:val="Hyperlink"/>
@@ -2843,7 +2811,7 @@
               <w:rPr>
                 <w:noProof/>
               </w:rPr>
-              <w:instrText xml:space="preserve"> PAGEREF _Toc243774521 \h </w:instrText>
+              <w:instrText xml:space="preserve"> PAGEREF _Toc243833839 \h </w:instrText>
             </w:r>
             <w:r>
               <w:rPr>
@@ -2883,7 +2851,7 @@
               <w14:ligatures w14:val="standardContextual"/>
             </w:rPr>
           </w:pPr>
-          <w:hyperlink w:anchor="_Toc243774522" w:history="1">
+          <w:hyperlink w:anchor="_Toc243833840" w:history="1">
             <w:r>
               <w:rPr>
                 <w:rStyle w:val="Hyperlink"/>
@@ -2907,7 +2875,7 @@
               <w:rPr>
                 <w:noProof/>
               </w:rPr>
-              <w:instrText xml:space="preserve"> PAGEREF _Toc243774522 \h </w:instrText>
+              <w:instrText xml:space="preserve"> PAGEREF _Toc243833840 \h </w:instrText>
             </w:r>
             <w:r>
               <w:rPr>
@@ -2947,7 +2915,7 @@
               <w14:ligatures w14:val="standardContextual"/>
             </w:rPr>
           </w:pPr>
-          <w:hyperlink w:anchor="_Toc243774523" w:history="1">
+          <w:hyperlink w:anchor="_Toc243833841" w:history="1">
             <w:r>
               <w:rPr>
                 <w:rStyle w:val="Hyperlink"/>
@@ -2971,7 +2939,7 @@
               <w:rPr>
                 <w:noProof/>
               </w:rPr>
-              <w:instrText xml:space="preserve"> PAGEREF _Toc243774523 \h </w:instrText>
+              <w:instrText xml:space="preserve"> PAGEREF _Toc243833841 \h </w:instrText>
             </w:r>
             <w:r>
               <w:rPr>
@@ -3011,7 +2979,7 @@
               <w14:ligatures w14:val="standardContextual"/>
             </w:rPr>
           </w:pPr>
-          <w:hyperlink w:anchor="_Toc243774524" w:history="1">
+          <w:hyperlink w:anchor="_Toc243833842" w:history="1">
             <w:r>
               <w:rPr>
                 <w:rStyle w:val="Hyperlink"/>
@@ -3035,7 +3003,7 @@
               <w:rPr>
                 <w:noProof/>
               </w:rPr>
-              <w:instrText xml:space="preserve"> PAGEREF _Toc243774524 \h </w:instrText>
+              <w:instrText xml:space="preserve"> PAGEREF _Toc243833842 \h </w:instrText>
             </w:r>
             <w:r>
               <w:rPr>
@@ -3075,7 +3043,7 @@
               <w14:ligatures w14:val="standardContextual"/>
             </w:rPr>
           </w:pPr>
-          <w:hyperlink w:anchor="_Toc243774525" w:history="1">
+          <w:hyperlink w:anchor="_Toc243833843" w:history="1">
             <w:r>
               <w:rPr>
                 <w:rStyle w:val="Hyperlink"/>
@@ -3099,7 +3067,7 @@
               <w:rPr>
                 <w:noProof/>
               </w:rPr>
-              <w:instrText xml:space="preserve"> PAGEREF _Toc243774525 \h </w:instrText>
+              <w:instrText xml:space="preserve"> PAGEREF _Toc243833843 \h </w:instrText>
             </w:r>
             <w:r>
               <w:rPr>
@@ -3139,7 +3107,7 @@
               <w14:ligatures w14:val="standardContextual"/>
             </w:rPr>
           </w:pPr>
-          <w:hyperlink w:anchor="_Toc243774526" w:history="1">
+          <w:hyperlink w:anchor="_Toc243833844" w:history="1">
             <w:r>
               <w:rPr>
                 <w:rStyle w:val="Hyperlink"/>
@@ -3163,7 +3131,7 @@
               <w:rPr>
                 <w:noProof/>
               </w:rPr>
-              <w:instrText xml:space="preserve"> PAGEREF _Toc243774526 \h </w:instrText>
+              <w:instrText xml:space="preserve"> PAGEREF _Toc243833844 \h </w:instrText>
             </w:r>
             <w:r>
               <w:rPr>
@@ -3203,7 +3171,7 @@
               <w14:ligatures w14:val="standardContextual"/>
             </w:rPr>
           </w:pPr>
-          <w:hyperlink w:anchor="_Toc243774527" w:history="1">
+          <w:hyperlink w:anchor="_Toc243833845" w:history="1">
             <w:r>
               <w:rPr>
                 <w:rStyle w:val="Hyperlink"/>
@@ -3227,7 +3195,7 @@
               <w:rPr>
                 <w:noProof/>
               </w:rPr>
-              <w:instrText xml:space="preserve"> PAGEREF _Toc243774527 \h </w:instrText>
+              <w:instrText xml:space="preserve"> PAGEREF _Toc243833845 \h </w:instrText>
             </w:r>
             <w:r>
               <w:rPr>
@@ -3267,7 +3235,7 @@
               <w14:ligatures w14:val="standardContextual"/>
             </w:rPr>
           </w:pPr>
-          <w:hyperlink w:anchor="_Toc243774528" w:history="1">
+          <w:hyperlink w:anchor="_Toc243833846" w:history="1">
             <w:r>
               <w:rPr>
                 <w:rStyle w:val="Hyperlink"/>
@@ -3291,7 +3259,7 @@
               <w:rPr>
                 <w:noProof/>
               </w:rPr>
-              <w:instrText xml:space="preserve"> PAGEREF _Toc243774528 \h </w:instrText>
+              <w:instrText xml:space="preserve"> PAGEREF _Toc243833846 \h </w:instrText>
             </w:r>
             <w:r>
               <w:rPr>
@@ -3331,7 +3299,7 @@
               <w14:ligatures w14:val="standardContextual"/>
             </w:rPr>
           </w:pPr>
-          <w:hyperlink w:anchor="_Toc243774529" w:history="1">
+          <w:hyperlink w:anchor="_Toc243833847" w:history="1">
             <w:r>
               <w:rPr>
                 <w:rStyle w:val="Hyperlink"/>
@@ -3355,7 +3323,7 @@
               <w:rPr>
                 <w:noProof/>
               </w:rPr>
-              <w:instrText xml:space="preserve"> PAGEREF _Toc243774529 \h </w:instrText>
+              <w:instrText xml:space="preserve"> PAGEREF _Toc243833847 \h </w:instrText>
             </w:r>
             <w:r>
               <w:rPr>
@@ -3395,7 +3363,7 @@
               <w14:ligatures w14:val="standardContextual"/>
             </w:rPr>
           </w:pPr>
-          <w:hyperlink w:anchor="_Toc243774530" w:history="1">
+          <w:hyperlink w:anchor="_Toc243833848" w:history="1">
             <w:r>
               <w:rPr>
                 <w:rStyle w:val="Hyperlink"/>
@@ -3419,7 +3387,7 @@
               <w:rPr>
                 <w:noProof/>
               </w:rPr>
-              <w:instrText xml:space="preserve"> PAGEREF _Toc243774530 \h </w:instrText>
+              <w:instrText xml:space="preserve"> PAGEREF _Toc243833848 \h </w:instrText>
             </w:r>
             <w:r>
               <w:rPr>
@@ -3459,7 +3427,7 @@
               <w14:ligatures w14:val="standardContextual"/>
             </w:rPr>
           </w:pPr>
-          <w:hyperlink w:anchor="_Toc243774531" w:history="1">
+          <w:hyperlink w:anchor="_Toc243833849" w:history="1">
             <w:r>
               <w:rPr>
                 <w:rStyle w:val="Hyperlink"/>
@@ -3483,7 +3451,7 @@
               <w:rPr>
                 <w:noProof/>
               </w:rPr>
-              <w:instrText xml:space="preserve"> PAGEREF _Toc243774531 \h </w:instrText>
+              <w:instrText xml:space="preserve"> PAGEREF _Toc243833849 \h </w:instrText>
             </w:r>
             <w:r>
               <w:rPr>
@@ -3523,7 +3491,7 @@
               <w14:ligatures w14:val="standardContextual"/>
             </w:rPr>
           </w:pPr>
-          <w:hyperlink w:anchor="_Toc243774532" w:history="1">
+          <w:hyperlink w:anchor="_Toc243833850" w:history="1">
             <w:r>
               <w:rPr>
                 <w:rStyle w:val="Hyperlink"/>
@@ -3547,7 +3515,7 @@
               <w:rPr>
                 <w:noProof/>
               </w:rPr>
-              <w:instrText xml:space="preserve"> PAGEREF _Toc243774532 \h </w:instrText>
+              <w:instrText xml:space="preserve"> PAGEREF _Toc243833850 \h </w:instrText>
             </w:r>
             <w:r>
               <w:rPr>
@@ -3587,7 +3555,7 @@
               <w14:ligatures w14:val="standardContextual"/>
             </w:rPr>
           </w:pPr>
-          <w:hyperlink w:anchor="_Toc243774533" w:history="1">
+          <w:hyperlink w:anchor="_Toc243833851" w:history="1">
             <w:r>
               <w:rPr>
                 <w:rStyle w:val="Hyperlink"/>
@@ -3611,7 +3579,7 @@
               <w:rPr>
                 <w:noProof/>
               </w:rPr>
-              <w:instrText xml:space="preserve"> PAGEREF _Toc243774533 \h </w:instrText>
+              <w:instrText xml:space="preserve"> PAGEREF _Toc243833851 \h </w:instrText>
             </w:r>
             <w:r>
               <w:rPr>
@@ -3651,7 +3619,7 @@
               <w14:ligatures w14:val="standardContextual"/>
             </w:rPr>
           </w:pPr>
-          <w:hyperlink w:anchor="_Toc243774534" w:history="1">
+          <w:hyperlink w:anchor="_Toc243833852" w:history="1">
             <w:r>
               <w:rPr>
                 <w:rStyle w:val="Hyperlink"/>
@@ -3675,7 +3643,7 @@
               <w:rPr>
                 <w:noProof/>
               </w:rPr>
-              <w:instrText xml:space="preserve"> PAGEREF _Toc243774534 \h </w:instrText>
+              <w:instrText xml:space="preserve"> PAGEREF _Toc243833852 \h </w:instrText>
             </w:r>
             <w:r>
               <w:rPr>
@@ -3715,7 +3683,7 @@
               <w14:ligatures w14:val="standardContextual"/>
             </w:rPr>
           </w:pPr>
-          <w:hyperlink w:anchor="_Toc243774535" w:history="1">
+          <w:hyperlink w:anchor="_Toc243833853" w:history="1">
             <w:r>
               <w:rPr>
                 <w:rStyle w:val="Hyperlink"/>
@@ -3739,7 +3707,7 @@
               <w:rPr>
                 <w:noProof/>
               </w:rPr>
-              <w:instrText xml:space="preserve"> PAGEREF _Toc243774535 \h </w:instrText>
+              <w:instrText xml:space="preserve"> PAGEREF _Toc243833853 \h </w:instrText>
             </w:r>
             <w:r>
               <w:rPr>
@@ -3779,7 +3747,7 @@
               <w14:ligatures w14:val="standardContextual"/>
             </w:rPr>
           </w:pPr>
-          <w:hyperlink w:anchor="_Toc243774536" w:history="1">
+          <w:hyperlink w:anchor="_Toc243833854" w:history="1">
             <w:r>
               <w:rPr>
                 <w:rStyle w:val="Hyperlink"/>
@@ -3803,7 +3771,7 @@
               <w:rPr>
                 <w:noProof/>
               </w:rPr>
-              <w:instrText xml:space="preserve"> PAGEREF _Toc243774536 \h </w:instrText>
+              <w:instrText xml:space="preserve"> PAGEREF _Toc243833854 \h </w:instrText>
             </w:r>
             <w:r>
               <w:rPr>
@@ -3843,7 +3811,7 @@
               <w14:ligatures w14:val="standardContextual"/>
             </w:rPr>
           </w:pPr>
-          <w:hyperlink w:anchor="_Toc243774537" w:history="1">
+          <w:hyperlink w:anchor="_Toc243833855" w:history="1">
             <w:r>
               <w:rPr>
                 <w:rStyle w:val="Hyperlink"/>
@@ -3867,7 +3835,7 @@
               <w:rPr>
                 <w:noProof/>
               </w:rPr>
-              <w:instrText xml:space="preserve"> PAGEREF _Toc243774537 \h </w:instrText>
+              <w:instrText xml:space="preserve"> PAGEREF _Toc243833855 \h </w:instrText>
             </w:r>
             <w:r>
               <w:rPr>
@@ -3907,7 +3875,7 @@
               <w14:ligatures w14:val="standardContextual"/>
             </w:rPr>
           </w:pPr>
-          <w:hyperlink w:anchor="_Toc243774538" w:history="1">
+          <w:hyperlink w:anchor="_Toc243833856" w:history="1">
             <w:r>
               <w:rPr>
                 <w:rStyle w:val="Hyperlink"/>
@@ -3931,7 +3899,7 @@
               <w:rPr>
                 <w:noProof/>
               </w:rPr>
-              <w:instrText xml:space="preserve"> PAGEREF _Toc243774538 \h </w:instrText>
+              <w:instrText xml:space="preserve"> PAGEREF _Toc243833856 \h </w:instrText>
             </w:r>
             <w:r>
               <w:rPr>
@@ -3971,7 +3939,7 @@
               <w14:ligatures w14:val="standardContextual"/>
             </w:rPr>
           </w:pPr>
-          <w:hyperlink w:anchor="_Toc243774539" w:history="1">
+          <w:hyperlink w:anchor="_Toc243833857" w:history="1">
             <w:r>
               <w:rPr>
                 <w:rStyle w:val="Hyperlink"/>
@@ -3995,7 +3963,7 @@
               <w:rPr>
                 <w:noProof/>
               </w:rPr>
-              <w:instrText xml:space="preserve"> PAGEREF _Toc243774539 \h </w:instrText>
+              <w:instrText xml:space="preserve"> PAGEREF _Toc243833857 \h </w:instrText>
             </w:r>
             <w:r>
               <w:rPr>
@@ -4035,7 +4003,7 @@
               <w14:ligatures w14:val="standardContextual"/>
             </w:rPr>
           </w:pPr>
-          <w:hyperlink w:anchor="_Toc243774540" w:history="1">
+          <w:hyperlink w:anchor="_Toc243833858" w:history="1">
             <w:r>
               <w:rPr>
                 <w:rStyle w:val="Hyperlink"/>
@@ -4059,7 +4027,7 @@
               <w:rPr>
                 <w:noProof/>
               </w:rPr>
-              <w:instrText xml:space="preserve"> PAGEREF _Toc243774540 \h </w:instrText>
+              <w:instrText xml:space="preserve"> PAGEREF _Toc243833858 \h </w:instrText>
             </w:r>
             <w:r>
               <w:rPr>
@@ -4099,7 +4067,7 @@
               <w14:ligatures w14:val="standardContextual"/>
             </w:rPr>
           </w:pPr>
-          <w:hyperlink w:anchor="_Toc243774541" w:history="1">
+          <w:hyperlink w:anchor="_Toc243833859" w:history="1">
             <w:r>
               <w:rPr>
                 <w:rStyle w:val="Hyperlink"/>
@@ -4123,7 +4091,7 @@
               <w:rPr>
                 <w:noProof/>
               </w:rPr>
-              <w:instrText xml:space="preserve"> PAGEREF _Toc243774541 \h </w:instrText>
+              <w:instrText xml:space="preserve"> PAGEREF _Toc243833859 \h </w:instrText>
             </w:r>
             <w:r>
               <w:rPr>
@@ -4163,7 +4131,7 @@
               <w14:ligatures w14:val="standardContextual"/>
             </w:rPr>
           </w:pPr>
-          <w:hyperlink w:anchor="_Toc243774542" w:history="1">
+          <w:hyperlink w:anchor="_Toc243833860" w:history="1">
             <w:r>
               <w:rPr>
                 <w:rStyle w:val="Hyperlink"/>
@@ -4187,7 +4155,7 @@
               <w:rPr>
                 <w:noProof/>
               </w:rPr>
-              <w:instrText xml:space="preserve"> PAGEREF _Toc243774542 \h </w:instrText>
+              <w:instrText xml:space="preserve"> PAGEREF _Toc243833860 \h </w:instrText>
             </w:r>
             <w:r>
               <w:rPr>
@@ -4227,7 +4195,7 @@
               <w14:ligatures w14:val="standardContextual"/>
             </w:rPr>
           </w:pPr>
-          <w:hyperlink w:anchor="_Toc243774543" w:history="1">
+          <w:hyperlink w:anchor="_Toc243833861" w:history="1">
             <w:r>
               <w:rPr>
                 <w:rStyle w:val="Hyperlink"/>
@@ -4251,7 +4219,7 @@
               <w:rPr>
                 <w:noProof/>
               </w:rPr>
-              <w:instrText xml:space="preserve"> PAGEREF _Toc243774543 \h </w:instrText>
+              <w:instrText xml:space="preserve"> PAGEREF _Toc243833861 \h </w:instrText>
             </w:r>
             <w:r>
               <w:rPr>
@@ -4291,7 +4259,7 @@
               <w14:ligatures w14:val="standardContextual"/>
             </w:rPr>
           </w:pPr>
-          <w:hyperlink w:anchor="_Toc243774544" w:history="1">
+          <w:hyperlink w:anchor="_Toc243833862" w:history="1">
             <w:r>
               <w:rPr>
                 <w:rStyle w:val="Hyperlink"/>
@@ -4315,7 +4283,7 @@
               <w:rPr>
                 <w:noProof/>
               </w:rPr>
-              <w:instrText xml:space="preserve"> PAGEREF _Toc243774544 \h </w:instrText>
+              <w:instrText xml:space="preserve"> PAGEREF _Toc243833862 \h </w:instrText>
             </w:r>
             <w:r>
               <w:rPr>
@@ -4355,7 +4323,7 @@
               <w14:ligatures w14:val="standardContextual"/>
             </w:rPr>
           </w:pPr>
-          <w:hyperlink w:anchor="_Toc243774545" w:history="1">
+          <w:hyperlink w:anchor="_Toc243833863" w:history="1">
             <w:r>
               <w:rPr>
                 <w:rStyle w:val="Hyperlink"/>
@@ -4379,7 +4347,7 @@
               <w:rPr>
                 <w:noProof/>
               </w:rPr>
-              <w:instrText xml:space="preserve"> PAGEREF _Toc243774545 \h </w:instrText>
+              <w:instrText xml:space="preserve"> PAGEREF _Toc243833863 \h </w:instrText>
             </w:r>
             <w:r>
               <w:rPr>
@@ -4419,7 +4387,7 @@
               <w14:ligatures w14:val="standardContextual"/>
             </w:rPr>
           </w:pPr>
-          <w:hyperlink w:anchor="_Toc243774546" w:history="1">
+          <w:hyperlink w:anchor="_Toc243833864" w:history="1">
             <w:r>
               <w:rPr>
                 <w:rStyle w:val="Hyperlink"/>
@@ -4443,7 +4411,7 @@
               <w:rPr>
                 <w:noProof/>
               </w:rPr>
-              <w:instrText xml:space="preserve"> PAGEREF _Toc243774546 \h </w:instrText>
+              <w:instrText xml:space="preserve"> PAGEREF _Toc243833864 \h </w:instrText>
             </w:r>
             <w:r>
               <w:rPr>
@@ -4483,7 +4451,7 @@
               <w14:ligatures w14:val="standardContextual"/>
             </w:rPr>
           </w:pPr>
-          <w:hyperlink w:anchor="_Toc243774547" w:history="1">
+          <w:hyperlink w:anchor="_Toc243833865" w:history="1">
             <w:r>
               <w:rPr>
                 <w:rStyle w:val="Hyperlink"/>
@@ -4507,7 +4475,7 @@
               <w:rPr>
                 <w:noProof/>
               </w:rPr>
-              <w:instrText xml:space="preserve"> PAGEREF _Toc243774547 \h </w:instrText>
+              <w:instrText xml:space="preserve"> PAGEREF _Toc243833865 \h </w:instrText>
             </w:r>
             <w:r>
               <w:rPr>
@@ -4547,7 +4515,7 @@
               <w14:ligatures w14:val="standardContextual"/>
             </w:rPr>
           </w:pPr>
-          <w:hyperlink w:anchor="_Toc243774548" w:history="1">
+          <w:hyperlink w:anchor="_Toc243833866" w:history="1">
             <w:r>
               <w:rPr>
                 <w:rStyle w:val="Hyperlink"/>
@@ -4571,7 +4539,7 @@
               <w:rPr>
                 <w:noProof/>
               </w:rPr>
-              <w:instrText xml:space="preserve"> PAGEREF _Toc243774548 \h </w:instrText>
+              <w:instrText xml:space="preserve"> PAGEREF _Toc243833866 \h </w:instrText>
             </w:r>
             <w:r>
               <w:rPr>
@@ -4611,7 +4579,7 @@
               <w14:ligatures w14:val="standardContextual"/>
             </w:rPr>
           </w:pPr>
-          <w:hyperlink w:anchor="_Toc243774549" w:history="1">
+          <w:hyperlink w:anchor="_Toc243833867" w:history="1">
             <w:r>
               <w:rPr>
                 <w:rStyle w:val="Hyperlink"/>
@@ -4635,7 +4603,7 @@
               <w:rPr>
                 <w:noProof/>
               </w:rPr>
-              <w:instrText xml:space="preserve"> PAGEREF _Toc243774549 \h </w:instrText>
+              <w:instrText xml:space="preserve"> PAGEREF _Toc243833867 \h </w:instrText>
             </w:r>
             <w:r>
               <w:rPr>
@@ -4675,7 +4643,7 @@
               <w14:ligatures w14:val="standardContextual"/>
             </w:rPr>
           </w:pPr>
-          <w:hyperlink w:anchor="_Toc243774550" w:history="1">
+          <w:hyperlink w:anchor="_Toc243833868" w:history="1">
             <w:r>
               <w:rPr>
                 <w:rStyle w:val="Hyperlink"/>
@@ -4699,7 +4667,7 @@
               <w:rPr>
                 <w:noProof/>
               </w:rPr>
-              <w:instrText xml:space="preserve"> PAGEREF _Toc243774550 \h </w:instrText>
+              <w:instrText xml:space="preserve"> PAGEREF _Toc243833868 \h </w:instrText>
             </w:r>
             <w:r>
               <w:rPr>
@@ -4739,7 +4707,7 @@
               <w14:ligatures w14:val="standardContextual"/>
             </w:rPr>
           </w:pPr>
-          <w:hyperlink w:anchor="_Toc243774551" w:history="1">
+          <w:hyperlink w:anchor="_Toc243833869" w:history="1">
             <w:r>
               <w:rPr>
                 <w:rStyle w:val="Hyperlink"/>
@@ -4763,7 +4731,7 @@
               <w:rPr>
                 <w:noProof/>
               </w:rPr>
-              <w:instrText xml:space="preserve"> PAGEREF _Toc243774551 \h </w:instrText>
+              <w:instrText xml:space="preserve"> PAGEREF _Toc243833869 \h </w:instrText>
             </w:r>
             <w:r>
               <w:rPr>
@@ -4803,7 +4771,7 @@
               <w14:ligatures w14:val="standardContextual"/>
             </w:rPr>
           </w:pPr>
-          <w:hyperlink w:anchor="_Toc243774552" w:history="1">
+          <w:hyperlink w:anchor="_Toc243833870" w:history="1">
             <w:r>
               <w:rPr>
                 <w:rStyle w:val="Hyperlink"/>
@@ -4827,7 +4795,7 @@
               <w:rPr>
                 <w:noProof/>
               </w:rPr>
-              <w:instrText xml:space="preserve"> PAGEREF _Toc243774552 \h </w:instrText>
+              <w:instrText xml:space="preserve"> PAGEREF _Toc243833870 \h </w:instrText>
             </w:r>
             <w:r>
               <w:rPr>
@@ -4867,7 +4835,7 @@
               <w14:ligatures w14:val="standardContextual"/>
             </w:rPr>
           </w:pPr>
-          <w:hyperlink w:anchor="_Toc243774553" w:history="1">
+          <w:hyperlink w:anchor="_Toc243833871" w:history="1">
             <w:r>
               <w:rPr>
                 <w:rStyle w:val="Hyperlink"/>
@@ -4891,7 +4859,7 @@
               <w:rPr>
                 <w:noProof/>
               </w:rPr>
-              <w:instrText xml:space="preserve"> PAGEREF _Toc243774553 \h </w:instrText>
+              <w:instrText xml:space="preserve"> PAGEREF _Toc243833871 \h </w:instrText>
             </w:r>
             <w:r>
               <w:rPr>
@@ -4931,7 +4899,7 @@
               <w14:ligatures w14:val="standardContextual"/>
             </w:rPr>
           </w:pPr>
-          <w:hyperlink w:anchor="_Toc243774554" w:history="1">
+          <w:hyperlink w:anchor="_Toc243833872" w:history="1">
             <w:r>
               <w:rPr>
                 <w:rStyle w:val="Hyperlink"/>
@@ -4955,7 +4923,7 @@
               <w:rPr>
                 <w:noProof/>
               </w:rPr>
-              <w:instrText xml:space="preserve"> PAGEREF _Toc243774554 \h </w:instrText>
+              <w:instrText xml:space="preserve"> PAGEREF _Toc243833872 \h </w:instrText>
             </w:r>
             <w:r>
               <w:rPr>
@@ -4995,7 +4963,7 @@
               <w14:ligatures w14:val="standardContextual"/>
             </w:rPr>
           </w:pPr>
-          <w:hyperlink w:anchor="_Toc243774555" w:history="1">
+          <w:hyperlink w:anchor="_Toc243833873" w:history="1">
             <w:r>
               <w:rPr>
                 <w:rStyle w:val="Hyperlink"/>
@@ -5019,7 +4987,7 @@
               <w:rPr>
                 <w:noProof/>
               </w:rPr>
-              <w:instrText xml:space="preserve"> PAGEREF _Toc243774555 \h </w:instrText>
+              <w:instrText xml:space="preserve"> PAGEREF _Toc243833873 \h </w:instrText>
             </w:r>
             <w:r>
               <w:rPr>
@@ -5059,7 +5027,7 @@
               <w14:ligatures w14:val="standardContextual"/>
             </w:rPr>
           </w:pPr>
-          <w:hyperlink w:anchor="_Toc243774556" w:history="1">
+          <w:hyperlink w:anchor="_Toc243833874" w:history="1">
             <w:r>
               <w:rPr>
                 <w:rStyle w:val="Hyperlink"/>
@@ -5083,7 +5051,7 @@
               <w:rPr>
                 <w:noProof/>
               </w:rPr>
-              <w:instrText xml:space="preserve"> PAGEREF _Toc243774556 \h </w:instrText>
+              <w:instrText xml:space="preserve"> PAGEREF _Toc243833874 \h </w:instrText>
             </w:r>
             <w:r>
               <w:rPr>
@@ -5123,7 +5091,7 @@
               <w14:ligatures w14:val="standardContextual"/>
             </w:rPr>
           </w:pPr>
-          <w:hyperlink w:anchor="_Toc243774557" w:history="1">
+          <w:hyperlink w:anchor="_Toc243833875" w:history="1">
             <w:r>
               <w:rPr>
                 <w:rStyle w:val="Hyperlink"/>
@@ -5147,7 +5115,7 @@
               <w:rPr>
                 <w:noProof/>
               </w:rPr>
-              <w:instrText xml:space="preserve"> PAGEREF _Toc243774557 \h </w:instrText>
+              <w:instrText xml:space="preserve"> PAGEREF _Toc243833875 \h </w:instrText>
             </w:r>
             <w:r>
               <w:rPr>
@@ -5187,7 +5155,7 @@
               <w14:ligatures w14:val="standardContextual"/>
             </w:rPr>
           </w:pPr>
-          <w:hyperlink w:anchor="_Toc243774558" w:history="1">
+          <w:hyperlink w:anchor="_Toc243833876" w:history="1">
             <w:r>
               <w:rPr>
                 <w:rStyle w:val="Hyperlink"/>
@@ -5211,7 +5179,7 @@
               <w:rPr>
                 <w:noProof/>
               </w:rPr>
-              <w:instrText xml:space="preserve"> PAGEREF _Toc243774558 \h </w:instrText>
+              <w:instrText xml:space="preserve"> PAGEREF _Toc243833876 \h </w:instrText>
             </w:r>
             <w:r>
               <w:rPr>
@@ -5251,7 +5219,7 @@
               <w14:ligatures w14:val="standardContextual"/>
             </w:rPr>
           </w:pPr>
-          <w:hyperlink w:anchor="_Toc243774559" w:history="1">
+          <w:hyperlink w:anchor="_Toc243833877" w:history="1">
             <w:r>
               <w:rPr>
                 <w:rStyle w:val="Hyperlink"/>
@@ -5275,7 +5243,7 @@
               <w:rPr>
                 <w:noProof/>
               </w:rPr>
-              <w:instrText xml:space="preserve"> PAGEREF _Toc243774559 \h </w:instrText>
+              <w:instrText xml:space="preserve"> PAGEREF _Toc243833877 \h </w:instrText>
             </w:r>
             <w:r>
               <w:rPr>
@@ -5315,7 +5283,7 @@
               <w14:ligatures w14:val="standardContextual"/>
             </w:rPr>
           </w:pPr>
-          <w:hyperlink w:anchor="_Toc243774560" w:history="1">
+          <w:hyperlink w:anchor="_Toc243833878" w:history="1">
             <w:r>
               <w:rPr>
                 <w:rStyle w:val="Hyperlink"/>
@@ -5339,7 +5307,7 @@
               <w:rPr>
                 <w:noProof/>
               </w:rPr>
-              <w:instrText xml:space="preserve"> PAGEREF _Toc243774560 \h </w:instrText>
+              <w:instrText xml:space="preserve"> PAGEREF _Toc243833878 \h </w:instrText>
             </w:r>
             <w:r>
               <w:rPr>
@@ -5379,7 +5347,7 @@
               <w14:ligatures w14:val="standardContextual"/>
             </w:rPr>
           </w:pPr>
-          <w:hyperlink w:anchor="_Toc243774561" w:history="1">
+          <w:hyperlink w:anchor="_Toc243833879" w:history="1">
             <w:r>
               <w:rPr>
                 <w:rStyle w:val="Hyperlink"/>
@@ -5403,7 +5371,7 @@
               <w:rPr>
                 <w:noProof/>
               </w:rPr>
-              <w:instrText xml:space="preserve"> PAGEREF _Toc243774561 \h </w:instrText>
+              <w:instrText xml:space="preserve"> PAGEREF _Toc243833879 \h </w:instrText>
             </w:r>
             <w:r>
               <w:rPr>
@@ -5443,7 +5411,7 @@
               <w14:ligatures w14:val="standardContextual"/>
             </w:rPr>
           </w:pPr>
-          <w:hyperlink w:anchor="_Toc243774562" w:history="1">
+          <w:hyperlink w:anchor="_Toc243833880" w:history="1">
             <w:r>
               <w:rPr>
                 <w:rStyle w:val="Hyperlink"/>
@@ -5467,7 +5435,7 @@
               <w:rPr>
                 <w:noProof/>
               </w:rPr>
-              <w:instrText xml:space="preserve"> PAGEREF _Toc243774562 \h </w:instrText>
+              <w:instrText xml:space="preserve"> PAGEREF _Toc243833880 \h </w:instrText>
             </w:r>
             <w:r>
               <w:rPr>
@@ -5507,7 +5475,7 @@
               <w14:ligatures w14:val="standardContextual"/>
             </w:rPr>
           </w:pPr>
-          <w:hyperlink w:anchor="_Toc243774563" w:history="1">
+          <w:hyperlink w:anchor="_Toc243833881" w:history="1">
             <w:r>
               <w:rPr>
                 <w:rStyle w:val="Hyperlink"/>
@@ -5531,7 +5499,7 @@
               <w:rPr>
                 <w:noProof/>
               </w:rPr>
-              <w:instrText xml:space="preserve"> PAGEREF _Toc243774563 \h </w:instrText>
+              <w:instrText xml:space="preserve"> PAGEREF _Toc243833881 \h </w:instrText>
             </w:r>
             <w:r>
               <w:rPr>
@@ -5571,7 +5539,7 @@
               <w14:ligatures w14:val="standardContextual"/>
             </w:rPr>
           </w:pPr>
-          <w:hyperlink w:anchor="_Toc243774564" w:history="1">
+          <w:hyperlink w:anchor="_Toc243833882" w:history="1">
             <w:r>
               <w:rPr>
                 <w:rStyle w:val="Hyperlink"/>
@@ -5595,7 +5563,7 @@
               <w:rPr>
                 <w:noProof/>
               </w:rPr>
-              <w:instrText xml:space="preserve"> PAGEREF _Toc243774564 \h </w:instrText>
+              <w:instrText xml:space="preserve"> PAGEREF _Toc243833882 \h </w:instrText>
             </w:r>
             <w:r>
               <w:rPr>
@@ -5635,7 +5603,7 @@
               <w14:ligatures w14:val="standardContextual"/>
             </w:rPr>
           </w:pPr>
-          <w:hyperlink w:anchor="_Toc243774565" w:history="1">
+          <w:hyperlink w:anchor="_Toc243833883" w:history="1">
             <w:r>
               <w:rPr>
                 <w:rStyle w:val="Hyperlink"/>
@@ -5659,7 +5627,7 @@
               <w:rPr>
                 <w:noProof/>
               </w:rPr>
-              <w:instrText xml:space="preserve"> PAGEREF _Toc243774565 \h </w:instrText>
+              <w:instrText xml:space="preserve"> PAGEREF _Toc243833883 \h </w:instrText>
             </w:r>
             <w:r>
               <w:rPr>
@@ -5699,7 +5667,7 @@
               <w14:ligatures w14:val="standardContextual"/>
             </w:rPr>
           </w:pPr>
-          <w:hyperlink w:anchor="_Toc243774566" w:history="1">
+          <w:hyperlink w:anchor="_Toc243833884" w:history="1">
             <w:r>
               <w:rPr>
                 <w:rStyle w:val="Hyperlink"/>
@@ -5723,7 +5691,7 @@
               <w:rPr>
                 <w:noProof/>
               </w:rPr>
-              <w:instrText xml:space="preserve"> PAGEREF _Toc243774566 \h </w:instrText>
+              <w:instrText xml:space="preserve"> PAGEREF _Toc243833884 \h </w:instrText>
             </w:r>
             <w:r>
               <w:rPr>
@@ -5763,7 +5731,7 @@
               <w14:ligatures w14:val="standardContextual"/>
             </w:rPr>
           </w:pPr>
-          <w:hyperlink w:anchor="_Toc243774567" w:history="1">
+          <w:hyperlink w:anchor="_Toc243833885" w:history="1">
             <w:r>
               <w:rPr>
                 <w:rStyle w:val="Hyperlink"/>
@@ -5787,7 +5755,7 @@
               <w:rPr>
                 <w:noProof/>
               </w:rPr>
-              <w:instrText xml:space="preserve"> PAGEREF _Toc243774567 \h </w:instrText>
+              <w:instrText xml:space="preserve"> PAGEREF _Toc243833885 \h </w:instrText>
             </w:r>
             <w:r>
               <w:rPr>
@@ -5827,7 +5795,7 @@
               <w14:ligatures w14:val="standardContextual"/>
             </w:rPr>
           </w:pPr>
-          <w:hyperlink w:anchor="_Toc243774568" w:history="1">
+          <w:hyperlink w:anchor="_Toc243833886" w:history="1">
             <w:r>
               <w:rPr>
                 <w:rStyle w:val="Hyperlink"/>
@@ -5851,7 +5819,7 @@
               <w:rPr>
                 <w:noProof/>
               </w:rPr>
-              <w:instrText xml:space="preserve"> PAGEREF _Toc243774568 \h </w:instrText>
+              <w:instrText xml:space="preserve"> PAGEREF _Toc243833886 \h </w:instrText>
             </w:r>
             <w:r>
               <w:rPr>
@@ -5891,7 +5859,7 @@
               <w14:ligatures w14:val="standardContextual"/>
             </w:rPr>
           </w:pPr>
-          <w:hyperlink w:anchor="_Toc243774569" w:history="1">
+          <w:hyperlink w:anchor="_Toc243833887" w:history="1">
             <w:r>
               <w:rPr>
                 <w:rStyle w:val="Hyperlink"/>
@@ -5915,7 +5883,7 @@
               <w:rPr>
                 <w:noProof/>
               </w:rPr>
-              <w:instrText xml:space="preserve"> PAGEREF _Toc243774569 \h </w:instrText>
+              <w:instrText xml:space="preserve"> PAGEREF _Toc243833887 \h </w:instrText>
             </w:r>
             <w:r>
               <w:rPr>
@@ -5955,7 +5923,7 @@
               <w14:ligatures w14:val="standardContextual"/>
             </w:rPr>
           </w:pPr>
-          <w:hyperlink w:anchor="_Toc243774570" w:history="1">
+          <w:hyperlink w:anchor="_Toc243833888" w:history="1">
             <w:r>
               <w:rPr>
                 <w:rStyle w:val="Hyperlink"/>
@@ -5979,7 +5947,7 @@
               <w:rPr>
                 <w:noProof/>
               </w:rPr>
-              <w:instrText xml:space="preserve"> PAGEREF _Toc243774570 \h </w:instrText>
+              <w:instrText xml:space="preserve"> PAGEREF _Toc243833888 \h </w:instrText>
             </w:r>
             <w:r>
               <w:rPr>
@@ -6019,7 +5987,7 @@
               <w14:ligatures w14:val="standardContextual"/>
             </w:rPr>
           </w:pPr>
-          <w:hyperlink w:anchor="_Toc243774571" w:history="1">
+          <w:hyperlink w:anchor="_Toc243833889" w:history="1">
             <w:r>
               <w:rPr>
                 <w:rStyle w:val="Hyperlink"/>
@@ -6043,7 +6011,7 @@
               <w:rPr>
                 <w:noProof/>
               </w:rPr>
-              <w:instrText xml:space="preserve"> PAGEREF _Toc243774571 \h </w:instrText>
+              <w:instrText xml:space="preserve"> PAGEREF _Toc243833889 \h </w:instrText>
             </w:r>
             <w:r>
               <w:rPr>
@@ -6083,7 +6051,7 @@
               <w14:ligatures w14:val="standardContextual"/>
             </w:rPr>
           </w:pPr>
-          <w:hyperlink w:anchor="_Toc243774572" w:history="1">
+          <w:hyperlink w:anchor="_Toc243833890" w:history="1">
             <w:r>
               <w:rPr>
                 <w:rStyle w:val="Hyperlink"/>
@@ -6107,7 +6075,7 @@
               <w:rPr>
                 <w:noProof/>
               </w:rPr>
-              <w:instrText xml:space="preserve"> PAGEREF _Toc243774572 \h </w:instrText>
+              <w:instrText xml:space="preserve"> PAGEREF _Toc243833890 \h </w:instrText>
             </w:r>
             <w:r>
               <w:rPr>
@@ -6147,7 +6115,7 @@
               <w14:ligatures w14:val="standardContextual"/>
             </w:rPr>
           </w:pPr>
-          <w:hyperlink w:anchor="_Toc243774573" w:history="1">
+          <w:hyperlink w:anchor="_Toc243833891" w:history="1">
             <w:r>
               <w:rPr>
                 <w:rStyle w:val="Hyperlink"/>
@@ -6171,7 +6139,7 @@
               <w:rPr>
                 <w:noProof/>
               </w:rPr>
-              <w:instrText xml:space="preserve"> PAGEREF _Toc243774573 \h </w:instrText>
+              <w:instrText xml:space="preserve"> PAGEREF _Toc243833891 \h </w:instrText>
             </w:r>
             <w:r>
               <w:rPr>
@@ -6211,7 +6179,7 @@
               <w14:ligatures w14:val="standardContextual"/>
             </w:rPr>
           </w:pPr>
-          <w:hyperlink w:anchor="_Toc243774574" w:history="1">
+          <w:hyperlink w:anchor="_Toc243833892" w:history="1">
             <w:r>
               <w:rPr>
                 <w:rStyle w:val="Hyperlink"/>
@@ -6235,7 +6203,7 @@
               <w:rPr>
                 <w:noProof/>
               </w:rPr>
-              <w:instrText xml:space="preserve"> PAGEREF _Toc243774574 \h </w:instrText>
+              <w:instrText xml:space="preserve"> PAGEREF _Toc243833892 \h </w:instrText>
             </w:r>
             <w:r>
               <w:rPr>
@@ -6275,7 +6243,7 @@
               <w14:ligatures w14:val="standardContextual"/>
             </w:rPr>
           </w:pPr>
-          <w:hyperlink w:anchor="_Toc243774575" w:history="1">
+          <w:hyperlink w:anchor="_Toc243833893" w:history="1">
             <w:r>
               <w:rPr>
                 <w:rStyle w:val="Hyperlink"/>
@@ -6299,7 +6267,7 @@
               <w:rPr>
                 <w:noProof/>
               </w:rPr>
-              <w:instrText xml:space="preserve"> PAGEREF _Toc243774575 \h </w:instrText>
+              <w:instrText xml:space="preserve"> PAGEREF _Toc243833893 \h </w:instrText>
             </w:r>
             <w:r>
               <w:rPr>
@@ -6339,7 +6307,7 @@
               <w14:ligatures w14:val="standardContextual"/>
             </w:rPr>
           </w:pPr>
-          <w:hyperlink w:anchor="_Toc243774576" w:history="1">
+          <w:hyperlink w:anchor="_Toc243833894" w:history="1">
             <w:r>
               <w:rPr>
                 <w:rStyle w:val="Hyperlink"/>
@@ -6363,7 +6331,7 @@
               <w:rPr>
                 <w:noProof/>
               </w:rPr>
-              <w:instrText xml:space="preserve"> PAGEREF _Toc243774576 \h </w:instrText>
+              <w:instrText xml:space="preserve"> PAGEREF _Toc243833894 \h </w:instrText>
             </w:r>
             <w:r>
               <w:rPr>
@@ -6403,7 +6371,7 @@
               <w14:ligatures w14:val="standardContextual"/>
             </w:rPr>
           </w:pPr>
-          <w:hyperlink w:anchor="_Toc243774577" w:history="1">
+          <w:hyperlink w:anchor="_Toc243833895" w:history="1">
             <w:r>
               <w:rPr>
                 <w:rStyle w:val="Hyperlink"/>
@@ -6427,7 +6395,7 @@
               <w:rPr>
                 <w:noProof/>
               </w:rPr>
-              <w:instrText xml:space="preserve"> PAGEREF _Toc243774577 \h </w:instrText>
+              <w:instrText xml:space="preserve"> PAGEREF _Toc243833895 \h </w:instrText>
             </w:r>
             <w:r>
               <w:rPr>
@@ -6467,7 +6435,7 @@
               <w14:ligatures w14:val="standardContextual"/>
             </w:rPr>
           </w:pPr>
-          <w:hyperlink w:anchor="_Toc243774578" w:history="1">
+          <w:hyperlink w:anchor="_Toc243833896" w:history="1">
             <w:r>
               <w:rPr>
                 <w:rStyle w:val="Hyperlink"/>
@@ -6491,7 +6459,7 @@
               <w:rPr>
                 <w:noProof/>
               </w:rPr>
-              <w:instrText xml:space="preserve"> PAGEREF _Toc243774578 \h </w:instrText>
+              <w:instrText xml:space="preserve"> PAGEREF _Toc243833896 \h </w:instrText>
             </w:r>
             <w:r>
               <w:rPr>
@@ -6531,7 +6499,7 @@
               <w14:ligatures w14:val="standardContextual"/>
             </w:rPr>
           </w:pPr>
-          <w:hyperlink w:anchor="_Toc243774579" w:history="1">
+          <w:hyperlink w:anchor="_Toc243833897" w:history="1">
             <w:r>
               <w:rPr>
                 <w:rStyle w:val="Hyperlink"/>
@@ -6555,7 +6523,7 @@
               <w:rPr>
                 <w:noProof/>
               </w:rPr>
-              <w:instrText xml:space="preserve"> PAGEREF _Toc243774579 \h </w:instrText>
+              <w:instrText xml:space="preserve"> PAGEREF _Toc243833897 \h </w:instrText>
             </w:r>
             <w:r>
               <w:rPr>
@@ -6595,7 +6563,7 @@
               <w14:ligatures w14:val="standardContextual"/>
             </w:rPr>
           </w:pPr>
-          <w:hyperlink w:anchor="_Toc243774580" w:history="1">
+          <w:hyperlink w:anchor="_Toc243833898" w:history="1">
             <w:r>
               <w:rPr>
                 <w:rStyle w:val="Hyperlink"/>
@@ -6619,7 +6587,7 @@
               <w:rPr>
                 <w:noProof/>
               </w:rPr>
-              <w:instrText xml:space="preserve"> PAGEREF _Toc243774580 \h </w:instrText>
+              <w:instrText xml:space="preserve"> PAGEREF _Toc243833898 \h </w:instrText>
             </w:r>
             <w:r>
               <w:rPr>
@@ -6637,6 +6605,70 @@
                 <w:noProof/>
               </w:rPr>
               <w:t>38</w:t>
+            </w:r>
+            <w:r>
+              <w:rPr>
+                <w:noProof/>
+              </w:rPr>
+              <w:fldChar w:fldCharType="end"/>
+            </w:r>
+          </w:hyperlink>
+        </w:p>
+        <w:p>
+          <w:pPr>
+            <w:pStyle w:val="TOC1"/>
+            <w:tabs>
+              <w:tab w:val="right" w:leader="dot" w:pos="8656"/>
+            </w:tabs>
+            <w:rPr>
+              <w:rFonts w:asciiTheme="minorHAnsi" w:eastAsiaTheme="minorEastAsia" w:hAnsiTheme="minorHAnsi" w:cstheme="minorBidi"/>
+              <w:noProof/>
+              <w:kern w:val="2"/>
+              <w14:ligatures w14:val="standardContextual"/>
+            </w:rPr>
+          </w:pPr>
+          <w:hyperlink w:anchor="_Toc243833899" w:history="1">
+            <w:r>
+              <w:rPr>
+                <w:rStyle w:val="Hyperlink"/>
+                <w:noProof/>
+              </w:rPr>
+              <w:t>ANNEXURE V: PLAGIARISM REPORT</w:t>
+            </w:r>
+            <w:r>
+              <w:rPr>
+                <w:noProof/>
+              </w:rPr>
+              <w:tab/>
+            </w:r>
+            <w:r>
+              <w:rPr>
+                <w:noProof/>
+              </w:rPr>
+              <w:fldChar w:fldCharType="begin"/>
+            </w:r>
+            <w:r>
+              <w:rPr>
+                <w:noProof/>
+              </w:rPr>
+              <w:instrText xml:space="preserve"> PAGEREF _Toc243833899 \h </w:instrText>
+            </w:r>
+            <w:r>
+              <w:rPr>
+                <w:noProof/>
+              </w:rPr>
+            </w:r>
+            <w:r>
+              <w:rPr>
+                <w:noProof/>
+              </w:rPr>
+              <w:fldChar w:fldCharType="separate"/>
+            </w:r>
+            <w:r>
+              <w:rPr>
+                <w:noProof/>
+              </w:rPr>
+              <w:t>39</w:t>
             </w:r>
             <w:r>
               <w:rPr>
@@ -6659,9 +6691,8 @@
         <w:pageBreakBefore/>
         <w:jc w:val="center"/>
       </w:pPr>
-      <w:bookmarkStart w:id="5" w:name="_Toc243774493"/>
-      <w:r>
-        <w:lastRenderedPageBreak/>
+      <w:bookmarkStart w:id="5" w:name="_Toc243833811"/>
+      <w:r>
         <w:t>LIST OF FIGURES</w:t>
       </w:r>
       <w:bookmarkEnd w:id="5"/>
@@ -6710,7 +6741,7 @@
         <w:rPr>
           <w:noProof/>
         </w:rPr>
-        <w:instrText xml:space="preserve"> PAGEREF _Toc243774465 \h </w:instrText>
+        <w:instrText xml:space="preserve"> PAGEREF _Toc243833783 \h </w:instrText>
       </w:r>
       <w:r>
         <w:rPr>
@@ -6771,7 +6802,7 @@
         <w:rPr>
           <w:noProof/>
         </w:rPr>
-        <w:instrText xml:space="preserve"> PAGEREF _Toc243774466 \h </w:instrText>
+        <w:instrText xml:space="preserve"> PAGEREF _Toc243833784 \h </w:instrText>
       </w:r>
       <w:r>
         <w:rPr>
@@ -6832,7 +6863,7 @@
         <w:rPr>
           <w:noProof/>
         </w:rPr>
-        <w:instrText xml:space="preserve"> PAGEREF _Toc243774467 \h </w:instrText>
+        <w:instrText xml:space="preserve"> PAGEREF _Toc243833785 \h </w:instrText>
       </w:r>
       <w:r>
         <w:rPr>
@@ -6893,7 +6924,7 @@
         <w:rPr>
           <w:noProof/>
         </w:rPr>
-        <w:instrText xml:space="preserve"> PAGEREF _Toc243774468 \h </w:instrText>
+        <w:instrText xml:space="preserve"> PAGEREF _Toc243833786 \h </w:instrText>
       </w:r>
       <w:r>
         <w:rPr>
@@ -6954,7 +6985,7 @@
         <w:rPr>
           <w:noProof/>
         </w:rPr>
-        <w:instrText xml:space="preserve"> PAGEREF _Toc243774469 \h </w:instrText>
+        <w:instrText xml:space="preserve"> PAGEREF _Toc243833787 \h </w:instrText>
       </w:r>
       <w:r>
         <w:rPr>
@@ -7015,7 +7046,7 @@
         <w:rPr>
           <w:noProof/>
         </w:rPr>
-        <w:instrText xml:space="preserve"> PAGEREF _Toc243774470 \h </w:instrText>
+        <w:instrText xml:space="preserve"> PAGEREF _Toc243833788 \h </w:instrText>
       </w:r>
       <w:r>
         <w:rPr>
@@ -7052,9 +7083,8 @@
         <w:pageBreakBefore/>
         <w:jc w:val="center"/>
       </w:pPr>
-      <w:bookmarkStart w:id="6" w:name="_Toc243774494"/>
-      <w:r>
-        <w:lastRenderedPageBreak/>
+      <w:bookmarkStart w:id="6" w:name="_Toc243833812"/>
+      <w:r>
         <w:t>LIST OF TABLES</w:t>
       </w:r>
       <w:bookmarkEnd w:id="6"/>
@@ -7103,7 +7133,7 @@
         <w:rPr>
           <w:noProof/>
         </w:rPr>
-        <w:instrText xml:space="preserve"> PAGEREF _Toc243774471 \h </w:instrText>
+        <w:instrText xml:space="preserve"> PAGEREF _Toc243833789 \h </w:instrText>
       </w:r>
       <w:r>
         <w:rPr>
@@ -7164,7 +7194,7 @@
         <w:rPr>
           <w:noProof/>
         </w:rPr>
-        <w:instrText xml:space="preserve"> PAGEREF _Toc243774472 \h </w:instrText>
+        <w:instrText xml:space="preserve"> PAGEREF _Toc243833790 \h </w:instrText>
       </w:r>
       <w:r>
         <w:rPr>
@@ -7225,7 +7255,7 @@
         <w:rPr>
           <w:noProof/>
         </w:rPr>
-        <w:instrText xml:space="preserve"> PAGEREF _Toc243774473 \h </w:instrText>
+        <w:instrText xml:space="preserve"> PAGEREF _Toc243833791 \h </w:instrText>
       </w:r>
       <w:r>
         <w:rPr>
@@ -7286,7 +7316,7 @@
         <w:rPr>
           <w:noProof/>
         </w:rPr>
-        <w:instrText xml:space="preserve"> PAGEREF _Toc243774474 \h </w:instrText>
+        <w:instrText xml:space="preserve"> PAGEREF _Toc243833792 \h </w:instrText>
       </w:r>
       <w:r>
         <w:rPr>
@@ -7347,7 +7377,7 @@
         <w:rPr>
           <w:noProof/>
         </w:rPr>
-        <w:instrText xml:space="preserve"> PAGEREF _Toc243774475 \h </w:instrText>
+        <w:instrText xml:space="preserve"> PAGEREF _Toc243833793 \h </w:instrText>
       </w:r>
       <w:r>
         <w:rPr>
@@ -7408,7 +7438,7 @@
         <w:rPr>
           <w:noProof/>
         </w:rPr>
-        <w:instrText xml:space="preserve"> PAGEREF _Toc243774476 \h </w:instrText>
+        <w:instrText xml:space="preserve"> PAGEREF _Toc243833794 \h </w:instrText>
       </w:r>
       <w:r>
         <w:rPr>
@@ -7469,7 +7499,7 @@
         <w:rPr>
           <w:noProof/>
         </w:rPr>
-        <w:instrText xml:space="preserve"> PAGEREF _Toc243774477 \h </w:instrText>
+        <w:instrText xml:space="preserve"> PAGEREF _Toc243833795 \h </w:instrText>
       </w:r>
       <w:r>
         <w:rPr>
@@ -7530,7 +7560,7 @@
         <w:rPr>
           <w:noProof/>
         </w:rPr>
-        <w:instrText xml:space="preserve"> PAGEREF _Toc243774478 \h </w:instrText>
+        <w:instrText xml:space="preserve"> PAGEREF _Toc243833796 \h </w:instrText>
       </w:r>
       <w:r>
         <w:rPr>
@@ -7591,7 +7621,7 @@
         <w:rPr>
           <w:noProof/>
         </w:rPr>
-        <w:instrText xml:space="preserve"> PAGEREF _Toc243774479 \h </w:instrText>
+        <w:instrText xml:space="preserve"> PAGEREF _Toc243833797 \h </w:instrText>
       </w:r>
       <w:r>
         <w:rPr>
@@ -7652,7 +7682,7 @@
         <w:rPr>
           <w:noProof/>
         </w:rPr>
-        <w:instrText xml:space="preserve"> PAGEREF _Toc243774480 \h </w:instrText>
+        <w:instrText xml:space="preserve"> PAGEREF _Toc243833798 \h </w:instrText>
       </w:r>
       <w:r>
         <w:rPr>
@@ -7713,7 +7743,7 @@
         <w:rPr>
           <w:noProof/>
         </w:rPr>
-        <w:instrText xml:space="preserve"> PAGEREF _Toc243774481 \h </w:instrText>
+        <w:instrText xml:space="preserve"> PAGEREF _Toc243833799 \h </w:instrText>
       </w:r>
       <w:r>
         <w:rPr>
@@ -7774,7 +7804,7 @@
         <w:rPr>
           <w:noProof/>
         </w:rPr>
-        <w:instrText xml:space="preserve"> PAGEREF _Toc243774482 \h </w:instrText>
+        <w:instrText xml:space="preserve"> PAGEREF _Toc243833800 \h </w:instrText>
       </w:r>
       <w:r>
         <w:rPr>
@@ -7835,7 +7865,7 @@
         <w:rPr>
           <w:noProof/>
         </w:rPr>
-        <w:instrText xml:space="preserve"> PAGEREF _Toc243774483 \h </w:instrText>
+        <w:instrText xml:space="preserve"> PAGEREF _Toc243833801 \h </w:instrText>
       </w:r>
       <w:r>
         <w:rPr>
@@ -7896,7 +7926,7 @@
         <w:rPr>
           <w:noProof/>
         </w:rPr>
-        <w:instrText xml:space="preserve"> PAGEREF _Toc243774484 \h </w:instrText>
+        <w:instrText xml:space="preserve"> PAGEREF _Toc243833802 \h </w:instrText>
       </w:r>
       <w:r>
         <w:rPr>
@@ -7957,7 +7987,7 @@
         <w:rPr>
           <w:noProof/>
         </w:rPr>
-        <w:instrText xml:space="preserve"> PAGEREF _Toc243774485 \h </w:instrText>
+        <w:instrText xml:space="preserve"> PAGEREF _Toc243833803 \h </w:instrText>
       </w:r>
       <w:r>
         <w:rPr>
@@ -8018,7 +8048,7 @@
         <w:rPr>
           <w:noProof/>
         </w:rPr>
-        <w:instrText xml:space="preserve"> PAGEREF _Toc243774486 \h </w:instrText>
+        <w:instrText xml:space="preserve"> PAGEREF _Toc243833804 \h </w:instrText>
       </w:r>
       <w:r>
         <w:rPr>
@@ -8079,7 +8109,7 @@
         <w:rPr>
           <w:noProof/>
         </w:rPr>
-        <w:instrText xml:space="preserve"> PAGEREF _Toc243774487 \h </w:instrText>
+        <w:instrText xml:space="preserve"> PAGEREF _Toc243833805 \h </w:instrText>
       </w:r>
       <w:r>
         <w:rPr>
@@ -8126,9 +8156,8 @@
         <w:pageBreakBefore/>
         <w:jc w:val="center"/>
       </w:pPr>
-      <w:bookmarkStart w:id="7" w:name="_Toc243774495"/>
-      <w:r>
-        <w:lastRenderedPageBreak/>
+      <w:bookmarkStart w:id="7" w:name="_Toc243833813"/>
+      <w:r>
         <w:t>CHAPTER 1 INTRODUCTION</w:t>
       </w:r>
       <w:bookmarkEnd w:id="7"/>
@@ -8138,7 +8167,7 @@
         <w:pStyle w:val="Heading2"/>
         <w:keepNext/>
       </w:pPr>
-      <w:bookmarkStart w:id="8" w:name="_Toc243774496"/>
+      <w:bookmarkStart w:id="8" w:name="_Toc243833814"/>
       <w:r>
         <w:t>1.1 Internship Overview</w:t>
       </w:r>
@@ -8159,10 +8188,7 @@
         <w:jc w:val="both"/>
       </w:pPr>
       <w:r>
-        <w:t>The internship followed a clear path. In the first weeks I learned Python programming. I then learned how to read, summarize, manipulate and visualize data with Pandas and Matplotlib. After that I studied machine learning models used for predictive modelling and predictive analytics, and applied each of them to business problems. This was followed by deep learning, Artificial Neural Networks (ANN) and classification models, together with an introduction to Generative AI. In the last five weeks I used this k</w:t>
-      </w:r>
-      <w:r>
-        <w:t>nowledge to design and build a project called the SmartData AI Agent.</w:t>
+        <w:t>The internship followed a clear path. In the first weeks I learned Python programming. I then learned how to read, summarize, manipulate and visualize data with Pandas and Matplotlib. After that I studied machine learning models used for predictive modelling and predictive analytics, and applied each of them to business problems. This was followed by deep learning, Artificial Neural Networks (ANN) and classification models, together with an introduction to Generative AI. In the last five weeks I used this knowledge to design and build a project called the SmartData AI Agent.</w:t>
       </w:r>
     </w:p>
     <w:p>
@@ -8179,7 +8205,7 @@
         <w:pStyle w:val="Heading2"/>
         <w:keepNext/>
       </w:pPr>
-      <w:bookmarkStart w:id="9" w:name="_Toc243774497"/>
+      <w:bookmarkStart w:id="9" w:name="_Toc243833815"/>
       <w:r>
         <w:t>1.2 Objectives of the Internship</w:t>
       </w:r>
@@ -8283,9 +8309,8 @@
         <w:pStyle w:val="Heading2"/>
         <w:keepNext/>
       </w:pPr>
-      <w:bookmarkStart w:id="10" w:name="_Toc243774498"/>
-      <w:r>
-        <w:lastRenderedPageBreak/>
+      <w:bookmarkStart w:id="10" w:name="_Toc243833816"/>
+      <w:r>
         <w:t>1.3 Scope of the Internship</w:t>
       </w:r>
       <w:bookmarkEnd w:id="10"/>
@@ -8296,10 +8321,7 @@
         <w:jc w:val="both"/>
       </w:pPr>
       <w:r>
-        <w:t>The learning part of the internship covered the full path from Python basics to machine learning, deep learning and Generative AI. The project part is a basic AI agent that works on the Iris flower dataset. The dataset is small and well known, so the focus stays on how an agent works: how it understands a request, how it chooses a tool, how the tool does the work and how the answer is returned. The agent runs in the command line on a normal laptop and does not need the internet. The optional LLM brain needs</w:t>
-      </w:r>
-      <w:r>
-        <w:t xml:space="preserve"> an internet connection and an API key.</w:t>
+        <w:t>The learning part of the internship covered the full path from Python basics to machine learning, deep learning and Generative AI. The project part is a basic AI agent that works on the Iris flower dataset. The dataset is small and well known, so the focus stays on how an agent works: how it understands a request, how it chooses a tool, how the tool does the work and how the answer is returned. The agent runs in the command line on a normal laptop and does not need the internet. The optional LLM brain needs an internet connection and an API key.</w:t>
       </w:r>
     </w:p>
     <w:p>
@@ -8307,7 +8329,7 @@
         <w:pStyle w:val="Heading2"/>
         <w:keepNext/>
       </w:pPr>
-      <w:bookmarkStart w:id="11" w:name="_Toc243774499"/>
+      <w:bookmarkStart w:id="11" w:name="_Toc243833817"/>
       <w:r>
         <w:t>1.4 Technologies and Platforms Used</w:t>
       </w:r>
@@ -8320,7 +8342,7 @@
         <w:spacing w:before="80" w:after="240"/>
         <w:jc w:val="center"/>
       </w:pPr>
-      <w:bookmarkStart w:id="12" w:name="_Toc243774471"/>
+      <w:bookmarkStart w:id="12" w:name="_Toc243833789"/>
       <w:r>
         <w:t xml:space="preserve">Table </w:t>
       </w:r>
@@ -9213,7 +9235,7 @@
         <w:pStyle w:val="Heading2"/>
         <w:keepNext/>
       </w:pPr>
-      <w:bookmarkStart w:id="13" w:name="_Toc243774500"/>
+      <w:bookmarkStart w:id="13" w:name="_Toc243833818"/>
       <w:r>
         <w:t>1.5 Methodology</w:t>
       </w:r>
@@ -9238,7 +9260,6 @@
         <w:rPr>
           <w:noProof/>
         </w:rPr>
-        <w:lastRenderedPageBreak/>
         <w:drawing>
           <wp:inline distT="0" distB="0" distL="0" distR="0" wp14:anchorId="09FD710D" wp14:editId="09FD710E">
             <wp:extent cx="5715000" cy="1371600"/>
@@ -9285,7 +9306,7 @@
         <w:spacing w:before="80" w:after="240"/>
         <w:jc w:val="center"/>
       </w:pPr>
-      <w:bookmarkStart w:id="14" w:name="_Toc243774465"/>
+      <w:bookmarkStart w:id="14" w:name="_Toc243833783"/>
       <w:r>
         <w:t xml:space="preserve">Figure </w:t>
       </w:r>
@@ -9317,7 +9338,7 @@
         <w:pStyle w:val="Heading2"/>
         <w:keepNext/>
       </w:pPr>
-      <w:bookmarkStart w:id="15" w:name="_Toc243774501"/>
+      <w:bookmarkStart w:id="15" w:name="_Toc243833819"/>
       <w:r>
         <w:t>1.6 Organization of the Report</w:t>
       </w:r>
@@ -9338,9 +9359,8 @@
         <w:pageBreakBefore/>
         <w:jc w:val="center"/>
       </w:pPr>
-      <w:bookmarkStart w:id="16" w:name="_Toc243774502"/>
-      <w:r>
-        <w:lastRenderedPageBreak/>
+      <w:bookmarkStart w:id="16" w:name="_Toc243833820"/>
+      <w:r>
         <w:t>CHAPTER 2 ORGANIZATION AND INTERNSHIP BACKGROUND</w:t>
       </w:r>
       <w:bookmarkEnd w:id="16"/>
@@ -9350,7 +9370,7 @@
         <w:pStyle w:val="Heading2"/>
         <w:keepNext/>
       </w:pPr>
-      <w:bookmarkStart w:id="17" w:name="_Toc243774503"/>
+      <w:bookmarkStart w:id="17" w:name="_Toc243833821"/>
       <w:r>
         <w:t>2.1 Organization Overview</w:t>
       </w:r>
@@ -9370,7 +9390,7 @@
         <w:pStyle w:val="Heading2"/>
         <w:keepNext/>
       </w:pPr>
-      <w:bookmarkStart w:id="18" w:name="_Toc243774504"/>
+      <w:bookmarkStart w:id="18" w:name="_Toc243833822"/>
       <w:r>
         <w:t>2.2 My Role and Way of Working</w:t>
       </w:r>
@@ -9382,10 +9402,7 @@
         <w:jc w:val="both"/>
       </w:pPr>
       <w:r>
-        <w:t xml:space="preserve">I joined as an intern in the Artificial Intelligence and Generative AI domain on 18 June 2026. Each week had five working days, and each day had a defined task. I studied the topic of the day, practised it in a notebook and applied it to an example problem. At the end of every week YBI Foundation issued a weekly internship report listing the tasks of that week, signed by the HR Manager. In the final phase, project work was combined with regular discussions with my mentor, Dr. Alok Yadav, and I incorporated </w:t>
-      </w:r>
-      <w:r>
-        <w:t>the mentor's suggestions into the project.</w:t>
+        <w:t>I joined as an intern in the Artificial Intelligence and Generative AI domain on 18 June 2026. Each week had five working days, and each day had a defined task. I studied the topic of the day, practised it in a notebook and applied it to an example problem. At the end of every week YBI Foundation issued a weekly internship report listing the tasks of that week, signed by the HR Manager. In the final phase, project work was combined with regular discussions with my mentor, Dr. Alok Yadav, and I incorporated the mentor's suggestions into the project.</w:t>
       </w:r>
     </w:p>
     <w:p>
@@ -9393,7 +9410,7 @@
         <w:pStyle w:val="Heading2"/>
         <w:keepNext/>
       </w:pPr>
-      <w:bookmarkStart w:id="19" w:name="_Toc243774505"/>
+      <w:bookmarkStart w:id="19" w:name="_Toc243833823"/>
       <w:r>
         <w:t>2.3 Internship Curriculum</w:t>
       </w:r>
@@ -9415,7 +9432,7 @@
         <w:spacing w:before="80" w:after="240"/>
         <w:jc w:val="center"/>
       </w:pPr>
-      <w:bookmarkStart w:id="20" w:name="_Toc243774472"/>
+      <w:bookmarkStart w:id="20" w:name="_Toc243833790"/>
       <w:r>
         <w:t xml:space="preserve">Table </w:t>
       </w:r>
@@ -10050,7 +10067,6 @@
                 <w:sz w:val="21"/>
                 <w:szCs w:val="21"/>
               </w:rPr>
-              <w:lastRenderedPageBreak/>
               <w:t>6</w:t>
             </w:r>
           </w:p>
@@ -10401,7 +10417,7 @@
         <w:pStyle w:val="Heading2"/>
         <w:keepNext/>
       </w:pPr>
-      <w:bookmarkStart w:id="21" w:name="_Toc243774506"/>
+      <w:bookmarkStart w:id="21" w:name="_Toc243833824"/>
       <w:r>
         <w:t>2.4 Why an AI Agent Project</w:t>
       </w:r>
@@ -10422,9 +10438,8 @@
         <w:pageBreakBefore/>
         <w:jc w:val="center"/>
       </w:pPr>
-      <w:bookmarkStart w:id="22" w:name="_Toc243774507"/>
-      <w:r>
-        <w:lastRenderedPageBreak/>
+      <w:bookmarkStart w:id="22" w:name="_Toc243833825"/>
+      <w:r>
         <w:t>CHAPTER 3 PYTHON PROGRAMMING FOUNDATIONS</w:t>
       </w:r>
       <w:bookmarkEnd w:id="22"/>
@@ -10443,7 +10458,7 @@
         <w:pStyle w:val="Heading2"/>
         <w:keepNext/>
       </w:pPr>
-      <w:bookmarkStart w:id="23" w:name="_Toc243774508"/>
+      <w:bookmarkStart w:id="23" w:name="_Toc243833826"/>
       <w:r>
         <w:t>3.1 Python Setup and Installation</w:t>
       </w:r>
@@ -10463,7 +10478,7 @@
         <w:pStyle w:val="Heading2"/>
         <w:keepNext/>
       </w:pPr>
-      <w:bookmarkStart w:id="24" w:name="_Toc243774509"/>
+      <w:bookmarkStart w:id="24" w:name="_Toc243833827"/>
       <w:r>
         <w:t>3.2 Python Basics</w:t>
       </w:r>
@@ -10483,7 +10498,7 @@
         <w:pStyle w:val="Heading2"/>
         <w:keepNext/>
       </w:pPr>
-      <w:bookmarkStart w:id="25" w:name="_Toc243774510"/>
+      <w:bookmarkStart w:id="25" w:name="_Toc243833828"/>
       <w:r>
         <w:t>3.3 Python Operators</w:t>
       </w:r>
@@ -10503,7 +10518,7 @@
         <w:pStyle w:val="Heading2"/>
         <w:keepNext/>
       </w:pPr>
-      <w:bookmarkStart w:id="26" w:name="_Toc243774511"/>
+      <w:bookmarkStart w:id="26" w:name="_Toc243833829"/>
       <w:r>
         <w:t>3.4 Conditional Statements</w:t>
       </w:r>
@@ -10523,7 +10538,7 @@
         <w:pStyle w:val="Heading2"/>
         <w:keepNext/>
       </w:pPr>
-      <w:bookmarkStart w:id="27" w:name="_Toc243774512"/>
+      <w:bookmarkStart w:id="27" w:name="_Toc243833830"/>
       <w:r>
         <w:t>3.5 Loops</w:t>
       </w:r>
@@ -10543,9 +10558,8 @@
         <w:pStyle w:val="Heading2"/>
         <w:keepNext/>
       </w:pPr>
-      <w:bookmarkStart w:id="28" w:name="_Toc243774513"/>
-      <w:r>
-        <w:lastRenderedPageBreak/>
+      <w:bookmarkStart w:id="28" w:name="_Toc243833831"/>
+      <w:r>
         <w:t>3.6 Functions</w:t>
       </w:r>
       <w:bookmarkEnd w:id="28"/>
@@ -10616,9 +10630,8 @@
         <w:pageBreakBefore/>
         <w:jc w:val="center"/>
       </w:pPr>
-      <w:bookmarkStart w:id="29" w:name="_Toc243774514"/>
-      <w:r>
-        <w:lastRenderedPageBreak/>
+      <w:bookmarkStart w:id="29" w:name="_Toc243833832"/>
+      <w:r>
         <w:t>CHAPTER 4 DATA ANALYSIS AND VISUALIZATION</w:t>
       </w:r>
       <w:bookmarkEnd w:id="29"/>
@@ -10637,7 +10650,7 @@
         <w:pStyle w:val="Heading2"/>
         <w:keepNext/>
       </w:pPr>
-      <w:bookmarkStart w:id="30" w:name="_Toc243774515"/>
+      <w:bookmarkStart w:id="30" w:name="_Toc243833833"/>
       <w:r>
         <w:t>4.1 External Data Read and Write</w:t>
       </w:r>
@@ -10657,7 +10670,7 @@
         <w:pStyle w:val="Heading2"/>
         <w:keepNext/>
       </w:pPr>
-      <w:bookmarkStart w:id="31" w:name="_Toc243774516"/>
+      <w:bookmarkStart w:id="31" w:name="_Toc243833834"/>
       <w:r>
         <w:t>4.2 Data Summarization</w:t>
       </w:r>
@@ -10677,7 +10690,7 @@
         <w:pStyle w:val="Heading2"/>
         <w:keepNext/>
       </w:pPr>
-      <w:bookmarkStart w:id="32" w:name="_Toc243774517"/>
+      <w:bookmarkStart w:id="32" w:name="_Toc243833835"/>
       <w:r>
         <w:t>4.3 Data Manipulation</w:t>
       </w:r>
@@ -10697,7 +10710,7 @@
         <w:pStyle w:val="Heading2"/>
         <w:keepNext/>
       </w:pPr>
-      <w:bookmarkStart w:id="33" w:name="_Toc243774518"/>
+      <w:bookmarkStart w:id="33" w:name="_Toc243833836"/>
       <w:r>
         <w:t>4.4 Data Visualization and Dashboards</w:t>
       </w:r>
@@ -10722,7 +10735,6 @@
         <w:rPr>
           <w:noProof/>
         </w:rPr>
-        <w:lastRenderedPageBreak/>
         <w:drawing>
           <wp:inline distT="0" distB="0" distL="0" distR="0" wp14:anchorId="09FD710F" wp14:editId="09FD7110">
             <wp:extent cx="5334000" cy="2133600"/>
@@ -10769,7 +10781,7 @@
         <w:spacing w:before="80" w:after="240"/>
         <w:jc w:val="center"/>
       </w:pPr>
-      <w:bookmarkStart w:id="34" w:name="_Toc243774466"/>
+      <w:bookmarkStart w:id="34" w:name="_Toc243833784"/>
       <w:r>
         <w:t xml:space="preserve">Figure </w:t>
       </w:r>
@@ -10802,9 +10814,8 @@
         <w:pageBreakBefore/>
         <w:jc w:val="center"/>
       </w:pPr>
-      <w:bookmarkStart w:id="35" w:name="_Toc243774519"/>
-      <w:r>
-        <w:lastRenderedPageBreak/>
+      <w:bookmarkStart w:id="35" w:name="_Toc243833837"/>
+      <w:r>
         <w:t>CHAPTER 5 MACHINE LEARNING AND PREDICTIVE MODELLING</w:t>
       </w:r>
       <w:bookmarkEnd w:id="35"/>
@@ -10823,7 +10834,7 @@
         <w:pStyle w:val="Heading2"/>
         <w:keepNext/>
       </w:pPr>
-      <w:bookmarkStart w:id="36" w:name="_Toc243774520"/>
+      <w:bookmarkStart w:id="36" w:name="_Toc243833838"/>
       <w:r>
         <w:t>5.1 Types of Machine Learning</w:t>
       </w:r>
@@ -10876,7 +10887,7 @@
         <w:pStyle w:val="Heading2"/>
         <w:keepNext/>
       </w:pPr>
-      <w:bookmarkStart w:id="37" w:name="_Toc243774521"/>
+      <w:bookmarkStart w:id="37" w:name="_Toc243833839"/>
       <w:r>
         <w:t>5.2 Standard Workflow for a Business Problem</w:t>
       </w:r>
@@ -10896,7 +10907,7 @@
         <w:pStyle w:val="Heading2"/>
         <w:keepNext/>
       </w:pPr>
-      <w:bookmarkStart w:id="38" w:name="_Toc243774522"/>
+      <w:bookmarkStart w:id="38" w:name="_Toc243833840"/>
       <w:r>
         <w:t>5.3 Logistic Regression</w:t>
       </w:r>
@@ -10916,7 +10927,7 @@
         <w:pStyle w:val="Heading2"/>
         <w:keepNext/>
       </w:pPr>
-      <w:bookmarkStart w:id="39" w:name="_Toc243774523"/>
+      <w:bookmarkStart w:id="39" w:name="_Toc243833841"/>
       <w:r>
         <w:t>5.4 K-Nearest Neighbours (KNN)</w:t>
       </w:r>
@@ -10936,9 +10947,8 @@
         <w:pStyle w:val="Heading2"/>
         <w:keepNext/>
       </w:pPr>
-      <w:bookmarkStart w:id="40" w:name="_Toc243774524"/>
-      <w:r>
-        <w:lastRenderedPageBreak/>
+      <w:bookmarkStart w:id="40" w:name="_Toc243833842"/>
+      <w:r>
         <w:t>5.5 Decision Trees</w:t>
       </w:r>
       <w:bookmarkEnd w:id="40"/>
@@ -10957,7 +10967,7 @@
         <w:pStyle w:val="Heading2"/>
         <w:keepNext/>
       </w:pPr>
-      <w:bookmarkStart w:id="41" w:name="_Toc243774525"/>
+      <w:bookmarkStart w:id="41" w:name="_Toc243833843"/>
       <w:r>
         <w:t>5.6 Random Forest</w:t>
       </w:r>
@@ -10977,7 +10987,7 @@
         <w:pStyle w:val="Heading2"/>
         <w:keepNext/>
       </w:pPr>
-      <w:bookmarkStart w:id="42" w:name="_Toc243774526"/>
+      <w:bookmarkStart w:id="42" w:name="_Toc243833844"/>
       <w:r>
         <w:t>5.7 K-Means and Clustering</w:t>
       </w:r>
@@ -10999,7 +11009,7 @@
         <w:spacing w:before="80" w:after="240"/>
         <w:jc w:val="center"/>
       </w:pPr>
-      <w:bookmarkStart w:id="43" w:name="_Toc243774473"/>
+      <w:bookmarkStart w:id="43" w:name="_Toc243833791"/>
       <w:r>
         <w:t xml:space="preserve">Table </w:t>
       </w:r>
@@ -11794,9 +11804,8 @@
         <w:pStyle w:val="Heading2"/>
         <w:keepNext/>
       </w:pPr>
-      <w:bookmarkStart w:id="44" w:name="_Toc243774527"/>
-      <w:r>
-        <w:lastRenderedPageBreak/>
+      <w:bookmarkStart w:id="44" w:name="_Toc243833845"/>
+      <w:r>
         <w:t>5.8 Review and Feedback</w:t>
       </w:r>
       <w:bookmarkEnd w:id="44"/>
@@ -11816,9 +11825,8 @@
         <w:pageBreakBefore/>
         <w:jc w:val="center"/>
       </w:pPr>
-      <w:bookmarkStart w:id="45" w:name="_Toc243774528"/>
-      <w:r>
-        <w:lastRenderedPageBreak/>
+      <w:bookmarkStart w:id="45" w:name="_Toc243833846"/>
+      <w:r>
         <w:t>CHAPTER 6 DEEP LEARNING, CLASSIFICATION AND GENERATIVE AI</w:t>
       </w:r>
       <w:bookmarkEnd w:id="45"/>
@@ -11837,7 +11845,7 @@
         <w:pStyle w:val="Heading2"/>
         <w:keepNext/>
       </w:pPr>
-      <w:bookmarkStart w:id="46" w:name="_Toc243774529"/>
+      <w:bookmarkStart w:id="46" w:name="_Toc243833847"/>
       <w:r>
         <w:t>6.1 Deep Learning</w:t>
       </w:r>
@@ -11857,7 +11865,7 @@
         <w:pStyle w:val="Heading2"/>
         <w:keepNext/>
       </w:pPr>
-      <w:bookmarkStart w:id="47" w:name="_Toc243774530"/>
+      <w:bookmarkStart w:id="47" w:name="_Toc243833848"/>
       <w:r>
         <w:t>6.2 Artificial Neural Networks for Regression</w:t>
       </w:r>
@@ -11869,10 +11877,7 @@
         <w:jc w:val="both"/>
       </w:pPr>
       <w:r>
-        <w:t>An Artificial Neural Network (ANN) is made of an input layer, one or more hidden layers and an output layer. Each neuron calculates a weighted sum of its inputs and applies an activation function such as ReLU. The network learns by comparing its output with the correct answer using a loss function and adjusting the weights through backpropagation and gradient descent. For regression, the output layer has a single neuron without activation and the loss is the mean squared error. Advantages are the ability to</w:t>
-      </w:r>
-      <w:r>
-        <w:t xml:space="preserve"> model non-linear relationships; disadvantages are the need for more data, tuning of many settings and the risk of overfitting.</w:t>
+        <w:t>An Artificial Neural Network (ANN) is made of an input layer, one or more hidden layers and an output layer. Each neuron calculates a weighted sum of its inputs and applies an activation function such as ReLU. The network learns by comparing its output with the correct answer using a loss function and adjusting the weights through backpropagation and gradient descent. For regression, the output layer has a single neuron without activation and the loss is the mean squared error. Advantages are the ability to model non-linear relationships; disadvantages are the need for more data, tuning of many settings and the risk of overfitting.</w:t>
       </w:r>
     </w:p>
     <w:p>
@@ -11880,7 +11885,7 @@
         <w:pStyle w:val="Heading2"/>
         <w:keepNext/>
       </w:pPr>
-      <w:bookmarkStart w:id="48" w:name="_Toc243774531"/>
+      <w:bookmarkStart w:id="48" w:name="_Toc243833849"/>
       <w:r>
         <w:t>6.3 Binary Classification</w:t>
       </w:r>
@@ -11900,7 +11905,7 @@
         <w:pStyle w:val="Heading2"/>
         <w:keepNext/>
       </w:pPr>
-      <w:bookmarkStart w:id="49" w:name="_Toc243774532"/>
+      <w:bookmarkStart w:id="49" w:name="_Toc243833850"/>
       <w:r>
         <w:t>6.4 Multi-Class Classification</w:t>
       </w:r>
@@ -11912,11 +11917,7 @@
         <w:jc w:val="both"/>
       </w:pPr>
       <w:r>
-        <w:t>Multi-class classification predicts one of three or more classes, such as the three Iris species used in my project. In an ANN, the output layer has one neuron per class with a softmax activation, which gives a probability for each class, and the loss is categorical cross-</w:t>
-      </w:r>
-      <w:r>
-        <w:lastRenderedPageBreak/>
-        <w:t>entropy. Applications include product categorization, handwritten digit recognition and document classification. Its limitations are that it needs enough examples of every class and that similar classes are easily confused.</w:t>
+        <w:t>Multi-class classification predicts one of three or more classes, such as the three Iris species used in my project. In an ANN, the output layer has one neuron per class with a softmax activation, which gives a probability for each class, and the loss is categorical cross-entropy. Applications include product categorization, handwritten digit recognition and document classification. Its limitations are that it needs enough examples of every class and that similar classes are easily confused.</w:t>
       </w:r>
     </w:p>
     <w:p>
@@ -11926,7 +11927,7 @@
         <w:spacing w:before="80" w:after="240"/>
         <w:jc w:val="center"/>
       </w:pPr>
-      <w:bookmarkStart w:id="50" w:name="_Toc243774474"/>
+      <w:bookmarkStart w:id="50" w:name="_Toc243833792"/>
       <w:r>
         <w:t xml:space="preserve">Table </w:t>
       </w:r>
@@ -12600,7 +12601,7 @@
         <w:pStyle w:val="Heading2"/>
         <w:keepNext/>
       </w:pPr>
-      <w:bookmarkStart w:id="51" w:name="_Toc243774533"/>
+      <w:bookmarkStart w:id="51" w:name="_Toc243833851"/>
       <w:r>
         <w:t>6.5 Generative AI and Large Language Models</w:t>
       </w:r>
@@ -12612,10 +12613,7 @@
         <w:jc w:val="both"/>
       </w:pPr>
       <w:r>
-        <w:t>Generative AI creates new content such as text, images or code. A Large Language Model (LLM), such as ChatGPT or Google Gemini, is trained on a very large amount of text and generates an answer one word piece (token) at a time. I learned prompt engineering: writing clear instructions, giving examples, asking for a fixed output format such as JSON, and checking the answer, because an LLM can produce confident but wrong answers. I also studied responsible use of AI: privacy, bias and the need for human checki</w:t>
-      </w:r>
-      <w:r>
-        <w:t>ng.</w:t>
+        <w:t>Generative AI creates new content such as text, images or code. A Large Language Model (LLM), such as ChatGPT or Google Gemini, is trained on a very large amount of text and generates an answer one word piece (token) at a time. I learned prompt engineering: writing clear instructions, giving examples, asking for a fixed output format such as JSON, and checking the answer, because an LLM can produce confident but wrong answers. I also studied responsible use of AI: privacy, bias and the need for human checking.</w:t>
       </w:r>
     </w:p>
     <w:p>
@@ -12623,7 +12621,7 @@
         <w:pStyle w:val="Heading2"/>
         <w:keepNext/>
       </w:pPr>
-      <w:bookmarkStart w:id="52" w:name="_Toc243774534"/>
+      <w:bookmarkStart w:id="52" w:name="_Toc243833852"/>
       <w:r>
         <w:t>6.6 From Models to Agents</w:t>
       </w:r>
@@ -12644,9 +12642,8 @@
         <w:pageBreakBefore/>
         <w:jc w:val="center"/>
       </w:pPr>
-      <w:bookmarkStart w:id="53" w:name="_Toc243774535"/>
-      <w:r>
-        <w:lastRenderedPageBreak/>
+      <w:bookmarkStart w:id="53" w:name="_Toc243833853"/>
+      <w:r>
         <w:t>CHAPTER 7 PROJECT DESIGN: SMARTDATA AI AGENT</w:t>
       </w:r>
       <w:bookmarkEnd w:id="53"/>
@@ -12656,7 +12653,7 @@
         <w:pStyle w:val="Heading2"/>
         <w:keepNext/>
       </w:pPr>
-      <w:bookmarkStart w:id="54" w:name="_Toc243774536"/>
+      <w:bookmarkStart w:id="54" w:name="_Toc243833854"/>
       <w:r>
         <w:t>7.1 Problem Statement</w:t>
       </w:r>
@@ -12676,7 +12673,7 @@
         <w:pStyle w:val="Heading2"/>
         <w:keepNext/>
       </w:pPr>
-      <w:bookmarkStart w:id="55" w:name="_Toc243774537"/>
+      <w:bookmarkStart w:id="55" w:name="_Toc243833855"/>
       <w:r>
         <w:t>7.2 Project Objectives</w:t>
       </w:r>
@@ -12771,7 +12768,7 @@
         <w:pStyle w:val="Heading2"/>
         <w:keepNext/>
       </w:pPr>
-      <w:bookmarkStart w:id="56" w:name="_Toc243774538"/>
+      <w:bookmarkStart w:id="56" w:name="_Toc243833856"/>
       <w:r>
         <w:t>7.3 What Is an AI Agent? (Simple Explanation)</w:t>
       </w:r>
@@ -12842,7 +12839,7 @@
         <w:spacing w:before="80" w:after="240"/>
         <w:jc w:val="center"/>
       </w:pPr>
-      <w:bookmarkStart w:id="57" w:name="_Toc243774467"/>
+      <w:bookmarkStart w:id="57" w:name="_Toc243833785"/>
       <w:r>
         <w:t xml:space="preserve">Figure </w:t>
       </w:r>
@@ -12874,7 +12871,7 @@
         <w:pStyle w:val="Heading2"/>
         <w:keepNext/>
       </w:pPr>
-      <w:bookmarkStart w:id="58" w:name="_Toc243774539"/>
+      <w:bookmarkStart w:id="58" w:name="_Toc243833857"/>
       <w:r>
         <w:t>7.4 System Architecture</w:t>
       </w:r>
@@ -12904,7 +12901,6 @@
           <w:b/>
           <w:bCs/>
         </w:rPr>
-        <w:lastRenderedPageBreak/>
         <w:t xml:space="preserve">agent.py (the agent loop): </w:t>
       </w:r>
       <w:r>
@@ -13009,7 +13005,7 @@
         <w:spacing w:before="80" w:after="240"/>
         <w:jc w:val="center"/>
       </w:pPr>
-      <w:bookmarkStart w:id="59" w:name="_Toc243774468"/>
+      <w:bookmarkStart w:id="59" w:name="_Toc243833786"/>
       <w:r>
         <w:t xml:space="preserve">Figure </w:t>
       </w:r>
@@ -13041,7 +13037,7 @@
         <w:pStyle w:val="Heading2"/>
         <w:keepNext/>
       </w:pPr>
-      <w:bookmarkStart w:id="60" w:name="_Toc243774540"/>
+      <w:bookmarkStart w:id="60" w:name="_Toc243833858"/>
       <w:r>
         <w:t>7.5 Tools of the Agent</w:t>
       </w:r>
@@ -13054,7 +13050,7 @@
         <w:spacing w:before="80" w:after="240"/>
         <w:jc w:val="center"/>
       </w:pPr>
-      <w:bookmarkStart w:id="61" w:name="_Toc243774475"/>
+      <w:bookmarkStart w:id="61" w:name="_Toc243833793"/>
       <w:r>
         <w:t xml:space="preserve">Table </w:t>
       </w:r>
@@ -13763,9 +13759,8 @@
         <w:pStyle w:val="Heading2"/>
         <w:keepNext/>
       </w:pPr>
-      <w:bookmarkStart w:id="62" w:name="_Toc243774541"/>
-      <w:r>
-        <w:lastRenderedPageBreak/>
+      <w:bookmarkStart w:id="62" w:name="_Toc243833859"/>
+      <w:r>
         <w:t>7.6 The Brain: Rule-Based and LLM</w:t>
       </w:r>
       <w:bookmarkEnd w:id="62"/>
@@ -13793,7 +13788,7 @@
         <w:pStyle w:val="Heading2"/>
         <w:keepNext/>
       </w:pPr>
-      <w:bookmarkStart w:id="63" w:name="_Toc243774542"/>
+      <w:bookmarkStart w:id="63" w:name="_Toc243833860"/>
       <w:r>
         <w:t>7.7 Dataset</w:t>
       </w:r>
@@ -13814,9 +13809,8 @@
         <w:pageBreakBefore/>
         <w:jc w:val="center"/>
       </w:pPr>
-      <w:bookmarkStart w:id="64" w:name="_Toc243774543"/>
-      <w:r>
-        <w:lastRenderedPageBreak/>
+      <w:bookmarkStart w:id="64" w:name="_Toc243833861"/>
+      <w:r>
         <w:t>CHAPTER 8 IMPLEMENTATION</w:t>
       </w:r>
       <w:bookmarkEnd w:id="64"/>
@@ -13826,7 +13820,7 @@
         <w:pStyle w:val="Heading2"/>
         <w:keepNext/>
       </w:pPr>
-      <w:bookmarkStart w:id="65" w:name="_Toc243774544"/>
+      <w:bookmarkStart w:id="65" w:name="_Toc243833862"/>
       <w:r>
         <w:t>8.1 Project Structure</w:t>
       </w:r>
@@ -13944,7 +13938,7 @@
         <w:pStyle w:val="Heading2"/>
         <w:keepNext/>
       </w:pPr>
-      <w:bookmarkStart w:id="66" w:name="_Toc243774545"/>
+      <w:bookmarkStart w:id="66" w:name="_Toc243833863"/>
       <w:r>
         <w:t>8.2 The Tool Registry</w:t>
       </w:r>
@@ -14085,7 +14079,7 @@
         <w:pStyle w:val="Heading2"/>
         <w:keepNext/>
       </w:pPr>
-      <w:bookmarkStart w:id="67" w:name="_Toc243774546"/>
+      <w:bookmarkStart w:id="67" w:name="_Toc243833864"/>
       <w:r>
         <w:t>8.3 Model Comparison Tool</w:t>
       </w:r>
@@ -14254,7 +14248,7 @@
         <w:pStyle w:val="Heading2"/>
         <w:keepNext/>
       </w:pPr>
-      <w:bookmarkStart w:id="68" w:name="_Toc243774547"/>
+      <w:bookmarkStart w:id="68" w:name="_Toc243833865"/>
       <w:r>
         <w:t>8.4 The Rule-Based Brain</w:t>
       </w:r>
@@ -14400,7 +14394,7 @@
         <w:pStyle w:val="Heading2"/>
         <w:keepNext/>
       </w:pPr>
-      <w:bookmarkStart w:id="69" w:name="_Toc243774548"/>
+      <w:bookmarkStart w:id="69" w:name="_Toc243833866"/>
       <w:r>
         <w:t>8.5 The Agent Loop</w:t>
       </w:r>
@@ -14611,7 +14605,7 @@
         <w:pStyle w:val="Heading2"/>
         <w:keepNext/>
       </w:pPr>
-      <w:bookmarkStart w:id="70" w:name="_Toc243774549"/>
+      <w:bookmarkStart w:id="70" w:name="_Toc243833867"/>
       <w:r>
         <w:t>8.6 Safe Calculator</w:t>
       </w:r>
@@ -14631,7 +14625,7 @@
         <w:pStyle w:val="Heading2"/>
         <w:keepNext/>
       </w:pPr>
-      <w:bookmarkStart w:id="71" w:name="_Toc243774550"/>
+      <w:bookmarkStart w:id="71" w:name="_Toc243833868"/>
       <w:r>
         <w:t>8.7 Running the Project</w:t>
       </w:r>
@@ -14694,9 +14688,8 @@
         <w:pageBreakBefore/>
         <w:jc w:val="center"/>
       </w:pPr>
-      <w:bookmarkStart w:id="72" w:name="_Toc243774551"/>
-      <w:r>
-        <w:lastRenderedPageBreak/>
+      <w:bookmarkStart w:id="72" w:name="_Toc243833869"/>
+      <w:r>
         <w:t>CHAPTER 9 TESTING, RESULTS AND DISCUSSION</w:t>
       </w:r>
       <w:bookmarkEnd w:id="72"/>
@@ -14706,7 +14699,7 @@
         <w:pStyle w:val="Heading2"/>
         <w:keepNext/>
       </w:pPr>
-      <w:bookmarkStart w:id="73" w:name="_Toc243774552"/>
+      <w:bookmarkStart w:id="73" w:name="_Toc243833870"/>
       <w:r>
         <w:t>9.1 Testing Approach</w:t>
       </w:r>
@@ -14726,7 +14719,7 @@
         <w:pStyle w:val="Heading2"/>
         <w:keepNext/>
       </w:pPr>
-      <w:bookmarkStart w:id="74" w:name="_Toc243774553"/>
+      <w:bookmarkStart w:id="74" w:name="_Toc243833871"/>
       <w:r>
         <w:t>9.2 Functional Test Cases</w:t>
       </w:r>
@@ -14739,7 +14732,7 @@
         <w:spacing w:before="80" w:after="240"/>
         <w:jc w:val="center"/>
       </w:pPr>
-      <w:bookmarkStart w:id="75" w:name="_Toc243774476"/>
+      <w:bookmarkStart w:id="75" w:name="_Toc243833794"/>
       <w:r>
         <w:t xml:space="preserve">Table </w:t>
       </w:r>
@@ -16621,9 +16614,8 @@
         <w:pStyle w:val="Heading2"/>
         <w:keepNext/>
       </w:pPr>
-      <w:bookmarkStart w:id="76" w:name="_Toc243774554"/>
-      <w:r>
-        <w:lastRenderedPageBreak/>
+      <w:bookmarkStart w:id="76" w:name="_Toc243833872"/>
+      <w:r>
         <w:t>9.3 Model Comparison Results</w:t>
       </w:r>
       <w:bookmarkEnd w:id="76"/>
@@ -16635,7 +16627,7 @@
         <w:spacing w:before="80" w:after="240"/>
         <w:jc w:val="center"/>
       </w:pPr>
-      <w:bookmarkStart w:id="77" w:name="_Toc243774477"/>
+      <w:bookmarkStart w:id="77" w:name="_Toc243833795"/>
       <w:r>
         <w:t xml:space="preserve">Table </w:t>
       </w:r>
@@ -17211,7 +17203,7 @@
         <w:spacing w:before="80" w:after="240"/>
         <w:jc w:val="center"/>
       </w:pPr>
-      <w:bookmarkStart w:id="78" w:name="_Toc243774469"/>
+      <w:bookmarkStart w:id="78" w:name="_Toc243833787"/>
       <w:r>
         <w:t xml:space="preserve">Figure </w:t>
       </w:r>
@@ -17257,7 +17249,6 @@
         <w:rPr>
           <w:noProof/>
         </w:rPr>
-        <w:lastRenderedPageBreak/>
         <w:drawing>
           <wp:inline distT="0" distB="0" distL="0" distR="0" wp14:anchorId="09FD7117" wp14:editId="09FD7118">
             <wp:extent cx="3143250" cy="2619375"/>
@@ -17304,7 +17295,7 @@
         <w:spacing w:before="80" w:after="240"/>
         <w:jc w:val="center"/>
       </w:pPr>
-      <w:bookmarkStart w:id="79" w:name="_Toc243774470"/>
+      <w:bookmarkStart w:id="79" w:name="_Toc243833788"/>
       <w:r>
         <w:t xml:space="preserve">Figure </w:t>
       </w:r>
@@ -17336,7 +17327,7 @@
         <w:pStyle w:val="Heading2"/>
         <w:keepNext/>
       </w:pPr>
-      <w:bookmarkStart w:id="80" w:name="_Toc243774555"/>
+      <w:bookmarkStart w:id="80" w:name="_Toc243833873"/>
       <w:r>
         <w:t>9.4 Clustering Result</w:t>
       </w:r>
@@ -17349,7 +17340,7 @@
         <w:spacing w:before="80" w:after="240"/>
         <w:jc w:val="center"/>
       </w:pPr>
-      <w:bookmarkStart w:id="81" w:name="_Toc243774478"/>
+      <w:bookmarkStart w:id="81" w:name="_Toc243833796"/>
       <w:r>
         <w:t xml:space="preserve">Table </w:t>
       </w:r>
@@ -17911,7 +17902,7 @@
         <w:pStyle w:val="Heading2"/>
         <w:keepNext/>
       </w:pPr>
-      <w:bookmarkStart w:id="82" w:name="_Toc243774556"/>
+      <w:bookmarkStart w:id="82" w:name="_Toc243833874"/>
       <w:r>
         <w:t>9.5 Discussion</w:t>
       </w:r>
@@ -17931,9 +17922,8 @@
         <w:pStyle w:val="Heading2"/>
         <w:keepNext/>
       </w:pPr>
-      <w:bookmarkStart w:id="83" w:name="_Toc243774557"/>
-      <w:r>
-        <w:lastRenderedPageBreak/>
+      <w:bookmarkStart w:id="83" w:name="_Toc243833875"/>
+      <w:r>
         <w:t>9.6 Limitations</w:t>
       </w:r>
       <w:bookmarkEnd w:id="83"/>
@@ -18014,9 +18004,8 @@
         <w:pageBreakBefore/>
         <w:jc w:val="center"/>
       </w:pPr>
-      <w:bookmarkStart w:id="84" w:name="_Toc243774558"/>
-      <w:r>
-        <w:lastRenderedPageBreak/>
+      <w:bookmarkStart w:id="84" w:name="_Toc243833876"/>
+      <w:r>
         <w:t>CHAPTER 10 WEEK-WISE INTERNSHIP SUMMARY</w:t>
       </w:r>
       <w:bookmarkEnd w:id="84"/>
@@ -18026,7 +18015,7 @@
         <w:pStyle w:val="Heading2"/>
         <w:keepNext/>
       </w:pPr>
-      <w:bookmarkStart w:id="85" w:name="_Toc243774559"/>
+      <w:bookmarkStart w:id="85" w:name="_Toc243833877"/>
       <w:r>
         <w:t>10.1 Overview</w:t>
       </w:r>
@@ -18046,7 +18035,7 @@
         <w:pStyle w:val="Heading2"/>
         <w:keepNext/>
       </w:pPr>
-      <w:bookmarkStart w:id="86" w:name="_Toc243774560"/>
+      <w:bookmarkStart w:id="86" w:name="_Toc243833878"/>
       <w:r>
         <w:t>10.2 Phase 1: Python Foundations (Weeks 1-2)</w:t>
       </w:r>
@@ -18059,7 +18048,7 @@
         <w:spacing w:before="80" w:after="240"/>
         <w:jc w:val="center"/>
       </w:pPr>
-      <w:bookmarkStart w:id="87" w:name="_Toc243774479"/>
+      <w:bookmarkStart w:id="87" w:name="_Toc243833797"/>
       <w:r>
         <w:t xml:space="preserve">Table </w:t>
       </w:r>
@@ -18400,7 +18389,7 @@
         <w:pStyle w:val="Heading2"/>
         <w:keepNext/>
       </w:pPr>
-      <w:bookmarkStart w:id="88" w:name="_Toc243774561"/>
+      <w:bookmarkStart w:id="88" w:name="_Toc243833879"/>
       <w:r>
         <w:t>10.3 Phase 2: Data Analysis and Visualization (Weeks 3-4)</w:t>
       </w:r>
@@ -18413,7 +18402,7 @@
         <w:spacing w:before="80" w:after="240"/>
         <w:jc w:val="center"/>
       </w:pPr>
-      <w:bookmarkStart w:id="89" w:name="_Toc243774480"/>
+      <w:bookmarkStart w:id="89" w:name="_Toc243833798"/>
       <w:r>
         <w:t xml:space="preserve">Table </w:t>
       </w:r>
@@ -18754,7 +18743,7 @@
         <w:pStyle w:val="Heading2"/>
         <w:keepNext/>
       </w:pPr>
-      <w:bookmarkStart w:id="90" w:name="_Toc243774562"/>
+      <w:bookmarkStart w:id="90" w:name="_Toc243833880"/>
       <w:r>
         <w:t>10.4 Phase 3: Machine Learning (Weeks 5-8)</w:t>
       </w:r>
@@ -18767,7 +18756,7 @@
         <w:spacing w:before="80" w:after="240"/>
         <w:jc w:val="center"/>
       </w:pPr>
-      <w:bookmarkStart w:id="91" w:name="_Toc243774481"/>
+      <w:bookmarkStart w:id="91" w:name="_Toc243833799"/>
       <w:r>
         <w:t xml:space="preserve">Table </w:t>
       </w:r>
@@ -19126,7 +19115,6 @@
                 <w:sz w:val="21"/>
                 <w:szCs w:val="21"/>
               </w:rPr>
-              <w:lastRenderedPageBreak/>
               <w:t>7</w:t>
             </w:r>
           </w:p>
@@ -19293,7 +19281,7 @@
         <w:pStyle w:val="Heading2"/>
         <w:keepNext/>
       </w:pPr>
-      <w:bookmarkStart w:id="92" w:name="_Toc243774563"/>
+      <w:bookmarkStart w:id="92" w:name="_Toc243833881"/>
       <w:r>
         <w:t>10.5 Phase 4: Deep Learning, Classification and Generative AI (Weeks 9-14)</w:t>
       </w:r>
@@ -19306,7 +19294,7 @@
         <w:spacing w:before="80" w:after="240"/>
         <w:jc w:val="center"/>
       </w:pPr>
-      <w:bookmarkStart w:id="93" w:name="_Toc243774482"/>
+      <w:bookmarkStart w:id="93" w:name="_Toc243833800"/>
       <w:r>
         <w:t xml:space="preserve">Table </w:t>
       </w:r>
@@ -20015,7 +20003,7 @@
         <w:pStyle w:val="Heading2"/>
         <w:keepNext/>
       </w:pPr>
-      <w:bookmarkStart w:id="94" w:name="_Toc243774564"/>
+      <w:bookmarkStart w:id="94" w:name="_Toc243833882"/>
       <w:r>
         <w:t>10.6 Phase 5: AI Agent Project (Weeks 15-18)</w:t>
       </w:r>
@@ -20028,7 +20016,7 @@
         <w:spacing w:before="80" w:after="240"/>
         <w:jc w:val="center"/>
       </w:pPr>
-      <w:bookmarkStart w:id="95" w:name="_Toc243774483"/>
+      <w:bookmarkStart w:id="95" w:name="_Toc243833801"/>
       <w:r>
         <w:t xml:space="preserve">Table </w:t>
       </w:r>
@@ -20295,7 +20283,6 @@
                 <w:sz w:val="21"/>
                 <w:szCs w:val="21"/>
               </w:rPr>
-              <w:lastRenderedPageBreak/>
               <w:t>16</w:t>
             </w:r>
           </w:p>
@@ -20555,9 +20542,8 @@
         <w:pageBreakBefore/>
         <w:jc w:val="center"/>
       </w:pPr>
-      <w:bookmarkStart w:id="96" w:name="_Toc243774565"/>
-      <w:r>
-        <w:lastRenderedPageBreak/>
+      <w:bookmarkStart w:id="96" w:name="_Toc243833883"/>
+      <w:r>
         <w:t>CHAPTER 11 SKILLS, CHALLENGES AND LEARNING OUTCOMES</w:t>
       </w:r>
       <w:bookmarkEnd w:id="96"/>
@@ -20567,7 +20553,7 @@
         <w:pStyle w:val="Heading2"/>
         <w:keepNext/>
       </w:pPr>
-      <w:bookmarkStart w:id="97" w:name="_Toc243774566"/>
+      <w:bookmarkStart w:id="97" w:name="_Toc243833884"/>
       <w:r>
         <w:t>11.1 Technical Skills Gained</w:t>
       </w:r>
@@ -20580,7 +20566,7 @@
         <w:spacing w:before="80" w:after="240"/>
         <w:jc w:val="center"/>
       </w:pPr>
-      <w:bookmarkStart w:id="98" w:name="_Toc243774484"/>
+      <w:bookmarkStart w:id="98" w:name="_Toc243833802"/>
       <w:r>
         <w:t xml:space="preserve">Table </w:t>
       </w:r>
@@ -21208,7 +21194,7 @@
         <w:pStyle w:val="Heading2"/>
         <w:keepNext/>
       </w:pPr>
-      <w:bookmarkStart w:id="99" w:name="_Toc243774567"/>
+      <w:bookmarkStart w:id="99" w:name="_Toc243833885"/>
       <w:r>
         <w:t>11.2 Professional Skills Gained</w:t>
       </w:r>
@@ -21275,7 +21261,7 @@
         <w:pStyle w:val="Heading2"/>
         <w:keepNext/>
       </w:pPr>
-      <w:bookmarkStart w:id="100" w:name="_Toc243774568"/>
+      <w:bookmarkStart w:id="100" w:name="_Toc243833886"/>
       <w:r>
         <w:t>11.3 Performance Evaluation by the Organization</w:t>
       </w:r>
@@ -21297,9 +21283,8 @@
         <w:spacing w:before="80" w:after="240"/>
         <w:jc w:val="center"/>
       </w:pPr>
-      <w:bookmarkStart w:id="101" w:name="_Toc243774485"/>
-      <w:r>
-        <w:lastRenderedPageBreak/>
+      <w:bookmarkStart w:id="101" w:name="_Toc243833803"/>
+      <w:r>
         <w:t xml:space="preserve">Table </w:t>
       </w:r>
       <w:r>
@@ -22375,7 +22360,7 @@
         <w:pStyle w:val="Heading2"/>
         <w:keepNext/>
       </w:pPr>
-      <w:bookmarkStart w:id="102" w:name="_Toc243774569"/>
+      <w:bookmarkStart w:id="102" w:name="_Toc243833887"/>
       <w:r>
         <w:t>11.4 Challenges and How They Were Solved</w:t>
       </w:r>
@@ -22388,7 +22373,7 @@
         <w:spacing w:before="80" w:after="240"/>
         <w:jc w:val="center"/>
       </w:pPr>
-      <w:bookmarkStart w:id="103" w:name="_Toc243774486"/>
+      <w:bookmarkStart w:id="103" w:name="_Toc243833804"/>
       <w:r>
         <w:t xml:space="preserve">Table </w:t>
       </w:r>
@@ -22890,7 +22875,7 @@
         <w:pStyle w:val="Heading2"/>
         <w:keepNext/>
       </w:pPr>
-      <w:bookmarkStart w:id="104" w:name="_Toc243774570"/>
+      <w:bookmarkStart w:id="104" w:name="_Toc243833888"/>
       <w:r>
         <w:t>11.5 Learning Outcomes</w:t>
       </w:r>
@@ -22902,11 +22887,7 @@
         <w:jc w:val="both"/>
       </w:pPr>
       <w:r>
-        <w:t xml:space="preserve">By the end of the internship I am able to write Python programs, analyze and visualize a dataset, choose and evaluate a suitable machine learning model for a business problem, explain the working, advantages and limitations of neural networks and classification </w:t>
-      </w:r>
-      <w:r>
-        <w:lastRenderedPageBreak/>
-        <w:t>models, use LLMs with good prompts, and combine all of these skills into a working AI agent.</w:t>
+        <w:t>By the end of the internship I am able to write Python programs, analyze and visualize a dataset, choose and evaluate a suitable machine learning model for a business problem, explain the working, advantages and limitations of neural networks and classification models, use LLMs with good prompts, and combine all of these skills into a working AI agent.</w:t>
       </w:r>
     </w:p>
     <w:p>
@@ -22915,9 +22896,8 @@
         <w:pageBreakBefore/>
         <w:jc w:val="center"/>
       </w:pPr>
-      <w:bookmarkStart w:id="105" w:name="_Toc243774571"/>
-      <w:r>
-        <w:lastRenderedPageBreak/>
+      <w:bookmarkStart w:id="105" w:name="_Toc243833889"/>
+      <w:r>
         <w:t>CHAPTER 12 CONCLUSION AND FUTURE SCOPE</w:t>
       </w:r>
       <w:bookmarkEnd w:id="105"/>
@@ -22927,7 +22907,7 @@
         <w:pStyle w:val="Heading2"/>
         <w:keepNext/>
       </w:pPr>
-      <w:bookmarkStart w:id="106" w:name="_Toc243774572"/>
+      <w:bookmarkStart w:id="106" w:name="_Toc243833890"/>
       <w:r>
         <w:t>12.1 Conclusion</w:t>
       </w:r>
@@ -22939,10 +22919,7 @@
         <w:jc w:val="both"/>
       </w:pPr>
       <w:r>
-        <w:t>The four-month internship at YBI Foundation gave me a complete, step-by-step path into Artificial Intelligence and Generative AI, from Python basics to data analysis, machine learning, deep learning and large language models. The SmartData AI Agent brought these skills together. It understands simple English requests, chooses the right tool, performs data analysis and prediction, remembers the conversation and handles unclear requests safely. It passed all eleven test cases, and its best model, KNN, reached</w:t>
-      </w:r>
-      <w:r>
-        <w:t xml:space="preserve"> 97.4% accuracy on unseen data. The project showed me that an AI agent is not magic: it is a clear loop of perceiving, thinking, acting, observing and responding, built from the same Python and machine learning skills learned during the internship.</w:t>
+        <w:t>The four-month internship at YBI Foundation gave me a complete, step-by-step path into Artificial Intelligence and Generative AI, from Python basics to data analysis, machine learning, deep learning and large language models. The SmartData AI Agent brought these skills together. It understands simple English requests, chooses the right tool, performs data analysis and prediction, remembers the conversation and handles unclear requests safely. It passed all eleven test cases, and its best model, KNN, reached 97.4% accuracy on unseen data. The project showed me that an AI agent is not magic: it is a clear loop of perceiving, thinking, acting, observing and responding, built from the same Python and machine learning skills learned during the internship.</w:t>
       </w:r>
     </w:p>
     <w:p>
@@ -22950,7 +22927,7 @@
         <w:pStyle w:val="Heading2"/>
         <w:keepNext/>
       </w:pPr>
-      <w:bookmarkStart w:id="107" w:name="_Toc243774573"/>
+      <w:bookmarkStart w:id="107" w:name="_Toc243833891"/>
       <w:r>
         <w:t>12.2 Future Scope</w:t>
       </w:r>
@@ -23046,9 +23023,8 @@
         <w:pageBreakBefore/>
         <w:jc w:val="center"/>
       </w:pPr>
-      <w:bookmarkStart w:id="108" w:name="_Toc243774574"/>
-      <w:r>
-        <w:lastRenderedPageBreak/>
+      <w:bookmarkStart w:id="108" w:name="_Toc243833892"/>
+      <w:r>
         <w:t>REFERENCES</w:t>
       </w:r>
       <w:bookmarkEnd w:id="108"/>
@@ -23158,9 +23134,8 @@
         <w:pageBreakBefore/>
         <w:jc w:val="center"/>
       </w:pPr>
-      <w:bookmarkStart w:id="109" w:name="_Toc243774575"/>
-      <w:r>
-        <w:lastRenderedPageBreak/>
+      <w:bookmarkStart w:id="109" w:name="_Toc243833893"/>
+      <w:r>
         <w:t>APPENDIX A: SAMPLE RUN OF THE AGENT</w:t>
       </w:r>
       <w:bookmarkEnd w:id="109"/>
@@ -23900,7 +23875,6 @@
           <w:sz w:val="18"/>
           <w:szCs w:val="18"/>
         </w:rPr>
-        <w:lastRenderedPageBreak/>
         <w:t>1            50           0          0</w:t>
       </w:r>
     </w:p>
@@ -24184,9 +24158,8 @@
         <w:pageBreakBefore/>
         <w:jc w:val="center"/>
       </w:pPr>
-      <w:bookmarkStart w:id="110" w:name="_Toc243774576"/>
-      <w:r>
-        <w:lastRenderedPageBreak/>
+      <w:bookmarkStart w:id="110" w:name="_Toc243833894"/>
+      <w:r>
         <w:t>APPENDIX B: GLOSSARY</w:t>
       </w:r>
       <w:bookmarkEnd w:id="110"/>
@@ -24198,7 +24171,7 @@
         <w:spacing w:before="80" w:after="240"/>
         <w:jc w:val="center"/>
       </w:pPr>
-      <w:bookmarkStart w:id="111" w:name="_Toc243774487"/>
+      <w:bookmarkStart w:id="111" w:name="_Toc243833805"/>
       <w:r>
         <w:t xml:space="preserve">Table </w:t>
       </w:r>
@@ -25205,9 +25178,8 @@
         <w:pageBreakBefore/>
         <w:jc w:val="center"/>
       </w:pPr>
-      <w:bookmarkStart w:id="112" w:name="_Toc243774577"/>
-      <w:r>
-        <w:lastRenderedPageBreak/>
+      <w:bookmarkStart w:id="112" w:name="_Toc243833895"/>
+      <w:r>
         <w:t>ANNEXURE I: INTERNSHIP JOINING / OFFER LETTER</w:t>
       </w:r>
       <w:bookmarkEnd w:id="112"/>
@@ -25232,9 +25204,8 @@
         <w:pageBreakBefore/>
         <w:jc w:val="center"/>
       </w:pPr>
-      <w:bookmarkStart w:id="113" w:name="_Toc243774578"/>
-      <w:r>
-        <w:lastRenderedPageBreak/>
+      <w:bookmarkStart w:id="113" w:name="_Toc243833896"/>
+      <w:r>
         <w:t>ANNEXURE II: INTERNSHIP COMPLETION CERTIFICATE</w:t>
       </w:r>
       <w:bookmarkEnd w:id="113"/>
@@ -25259,9 +25230,8 @@
         <w:pageBreakBefore/>
         <w:jc w:val="center"/>
       </w:pPr>
-      <w:bookmarkStart w:id="114" w:name="_Toc243774579"/>
-      <w:r>
-        <w:lastRenderedPageBreak/>
+      <w:bookmarkStart w:id="114" w:name="_Toc243833897"/>
+      <w:r>
         <w:t>ANNEXURE III: WEEKLY INTERNSHIP REPORTS</w:t>
       </w:r>
       <w:bookmarkEnd w:id="114"/>
@@ -25286,9 +25256,8 @@
         <w:pageBreakBefore/>
         <w:jc w:val="center"/>
       </w:pPr>
-      <w:bookmarkStart w:id="115" w:name="_Toc243774580"/>
-      <w:r>
-        <w:lastRenderedPageBreak/>
+      <w:bookmarkStart w:id="115" w:name="_Toc243833898"/>
+      <w:r>
         <w:t>ANNEXURE IV: INTERNSHIP PERFORMANCE REPORT</w:t>
       </w:r>
       <w:bookmarkEnd w:id="115"/>
@@ -25307,6 +25276,900 @@
         <w:t>Attach the internship performance report dated 16 October 2026.</w:t>
       </w:r>
     </w:p>
+    <w:p>
+      <w:pPr>
+        <w:pStyle w:val="Heading1"/>
+        <w:pageBreakBefore/>
+        <w:jc w:val="center"/>
+      </w:pPr>
+      <w:bookmarkStart w:id="116" w:name="_Toc243833899"/>
+      <w:r>
+        <w:t>ANNEXURE V: PLAGIARISM REPORT</w:t>
+      </w:r>
+      <w:bookmarkEnd w:id="116"/>
+    </w:p>
+    <w:p>
+      <w:pPr>
+        <w:spacing w:after="240" w:line="360" w:lineRule="auto"/>
+        <w:jc w:val="both"/>
+      </w:pPr>
+      <w:r>
+        <w:t xml:space="preserve">This is to certify that </w:t>
+      </w:r>
+      <w:r>
+        <w:t>this internship report has</w:t>
+      </w:r>
+      <w:r>
+        <w:t xml:space="preserve"> been checked for similarity using plagiarism detection software. The similarity index obtained is within the permissible limit, and the report is accepted for submission. The details of the check are given below.</w:t>
+      </w:r>
+    </w:p>
+    <w:tbl>
+      <w:tblPr>
+        <w:tblW w:w="8666" w:type="dxa"/>
+        <w:jc w:val="center"/>
+        <w:tblLook w:val="04A0" w:firstRow="1" w:lastRow="0" w:firstColumn="1" w:lastColumn="0" w:noHBand="0" w:noVBand="1"/>
+      </w:tblPr>
+      <w:tblGrid>
+        <w:gridCol w:w="3400"/>
+        <w:gridCol w:w="5266"/>
+      </w:tblGrid>
+      <w:tr>
+        <w:trPr>
+          <w:jc w:val="center"/>
+        </w:trPr>
+        <w:tc>
+          <w:tcPr>
+            <w:tcW w:w="3400" w:type="dxa"/>
+            <w:tcBorders>
+              <w:top w:val="single" w:sz="4" w:space="0" w:color="808080"/>
+              <w:left w:val="single" w:sz="4" w:space="0" w:color="808080"/>
+              <w:bottom w:val="single" w:sz="4" w:space="0" w:color="808080"/>
+              <w:right w:val="single" w:sz="4" w:space="0" w:color="808080"/>
+            </w:tcBorders>
+            <w:shd w:val="clear" w:color="auto" w:fill="D9E2F3"/>
+            <w:tcMar>
+              <w:top w:w="80" w:type="dxa"/>
+              <w:left w:w="120" w:type="dxa"/>
+              <w:bottom w:w="80" w:type="dxa"/>
+              <w:right w:w="120" w:type="dxa"/>
+            </w:tcMar>
+            <w:vAlign w:val="center"/>
+          </w:tcPr>
+          <w:p>
+            <w:pPr>
+              <w:spacing w:line="276" w:lineRule="auto"/>
+            </w:pPr>
+            <w:r>
+              <w:rPr>
+                <w:b/>
+                <w:bCs/>
+                <w:sz w:val="22"/>
+                <w:szCs w:val="22"/>
+              </w:rPr>
+              <w:t>Particulars</w:t>
+            </w:r>
+          </w:p>
+        </w:tc>
+        <w:tc>
+          <w:tcPr>
+            <w:tcW w:w="5266" w:type="dxa"/>
+            <w:tcBorders>
+              <w:top w:val="single" w:sz="4" w:space="0" w:color="808080"/>
+              <w:left w:val="single" w:sz="4" w:space="0" w:color="808080"/>
+              <w:bottom w:val="single" w:sz="4" w:space="0" w:color="808080"/>
+              <w:right w:val="single" w:sz="4" w:space="0" w:color="808080"/>
+            </w:tcBorders>
+            <w:shd w:val="clear" w:color="auto" w:fill="D9E2F3"/>
+            <w:tcMar>
+              <w:top w:w="80" w:type="dxa"/>
+              <w:left w:w="120" w:type="dxa"/>
+              <w:bottom w:w="80" w:type="dxa"/>
+              <w:right w:w="120" w:type="dxa"/>
+            </w:tcMar>
+            <w:vAlign w:val="center"/>
+          </w:tcPr>
+          <w:p>
+            <w:pPr>
+              <w:spacing w:line="276" w:lineRule="auto"/>
+            </w:pPr>
+            <w:r>
+              <w:rPr>
+                <w:b/>
+                <w:bCs/>
+                <w:sz w:val="22"/>
+                <w:szCs w:val="22"/>
+              </w:rPr>
+              <w:t>Details</w:t>
+            </w:r>
+          </w:p>
+        </w:tc>
+      </w:tr>
+      <w:tr>
+        <w:trPr>
+          <w:trHeight w:val="440"/>
+          <w:jc w:val="center"/>
+        </w:trPr>
+        <w:tc>
+          <w:tcPr>
+            <w:tcW w:w="3400" w:type="dxa"/>
+            <w:tcBorders>
+              <w:top w:val="single" w:sz="4" w:space="0" w:color="808080"/>
+              <w:left w:val="single" w:sz="4" w:space="0" w:color="808080"/>
+              <w:bottom w:val="single" w:sz="4" w:space="0" w:color="808080"/>
+              <w:right w:val="single" w:sz="4" w:space="0" w:color="808080"/>
+            </w:tcBorders>
+            <w:tcMar>
+              <w:top w:w="80" w:type="dxa"/>
+              <w:left w:w="120" w:type="dxa"/>
+              <w:bottom w:w="80" w:type="dxa"/>
+              <w:right w:w="120" w:type="dxa"/>
+            </w:tcMar>
+            <w:vAlign w:val="center"/>
+          </w:tcPr>
+          <w:p>
+            <w:pPr>
+              <w:spacing w:line="276" w:lineRule="auto"/>
+            </w:pPr>
+            <w:r>
+              <w:rPr>
+                <w:b/>
+                <w:bCs/>
+                <w:sz w:val="22"/>
+                <w:szCs w:val="22"/>
+              </w:rPr>
+              <w:t>Name of the Student</w:t>
+            </w:r>
+          </w:p>
+        </w:tc>
+        <w:tc>
+          <w:tcPr>
+            <w:tcW w:w="5266" w:type="dxa"/>
+            <w:tcBorders>
+              <w:top w:val="single" w:sz="4" w:space="0" w:color="808080"/>
+              <w:left w:val="single" w:sz="4" w:space="0" w:color="808080"/>
+              <w:bottom w:val="single" w:sz="4" w:space="0" w:color="808080"/>
+              <w:right w:val="single" w:sz="4" w:space="0" w:color="808080"/>
+            </w:tcBorders>
+            <w:tcMar>
+              <w:top w:w="80" w:type="dxa"/>
+              <w:left w:w="120" w:type="dxa"/>
+              <w:bottom w:w="80" w:type="dxa"/>
+              <w:right w:w="120" w:type="dxa"/>
+            </w:tcMar>
+            <w:vAlign w:val="center"/>
+          </w:tcPr>
+          <w:p>
+            <w:pPr>
+              <w:spacing w:line="276" w:lineRule="auto"/>
+            </w:pPr>
+            <w:r>
+              <w:rPr>
+                <w:sz w:val="22"/>
+                <w:szCs w:val="22"/>
+              </w:rPr>
+              <w:t>Rutuja Devanand Soundale</w:t>
+            </w:r>
+          </w:p>
+        </w:tc>
+      </w:tr>
+      <w:tr>
+        <w:trPr>
+          <w:trHeight w:val="440"/>
+          <w:jc w:val="center"/>
+        </w:trPr>
+        <w:tc>
+          <w:tcPr>
+            <w:tcW w:w="3400" w:type="dxa"/>
+            <w:tcBorders>
+              <w:top w:val="single" w:sz="4" w:space="0" w:color="808080"/>
+              <w:left w:val="single" w:sz="4" w:space="0" w:color="808080"/>
+              <w:bottom w:val="single" w:sz="4" w:space="0" w:color="808080"/>
+              <w:right w:val="single" w:sz="4" w:space="0" w:color="808080"/>
+            </w:tcBorders>
+            <w:tcMar>
+              <w:top w:w="80" w:type="dxa"/>
+              <w:left w:w="120" w:type="dxa"/>
+              <w:bottom w:w="80" w:type="dxa"/>
+              <w:right w:w="120" w:type="dxa"/>
+            </w:tcMar>
+            <w:vAlign w:val="center"/>
+          </w:tcPr>
+          <w:p>
+            <w:pPr>
+              <w:spacing w:line="276" w:lineRule="auto"/>
+            </w:pPr>
+            <w:r>
+              <w:rPr>
+                <w:b/>
+                <w:bCs/>
+                <w:sz w:val="22"/>
+                <w:szCs w:val="22"/>
+              </w:rPr>
+              <w:t>Roll No.</w:t>
+            </w:r>
+          </w:p>
+        </w:tc>
+        <w:tc>
+          <w:tcPr>
+            <w:tcW w:w="5266" w:type="dxa"/>
+            <w:tcBorders>
+              <w:top w:val="single" w:sz="4" w:space="0" w:color="808080"/>
+              <w:left w:val="single" w:sz="4" w:space="0" w:color="808080"/>
+              <w:bottom w:val="single" w:sz="4" w:space="0" w:color="808080"/>
+              <w:right w:val="single" w:sz="4" w:space="0" w:color="808080"/>
+            </w:tcBorders>
+            <w:tcMar>
+              <w:top w:w="80" w:type="dxa"/>
+              <w:left w:w="120" w:type="dxa"/>
+              <w:bottom w:w="80" w:type="dxa"/>
+              <w:right w:w="120" w:type="dxa"/>
+            </w:tcMar>
+            <w:vAlign w:val="center"/>
+          </w:tcPr>
+          <w:p>
+            <w:pPr>
+              <w:spacing w:line="276" w:lineRule="auto"/>
+            </w:pPr>
+            <w:r>
+              <w:rPr>
+                <w:sz w:val="22"/>
+                <w:szCs w:val="22"/>
+              </w:rPr>
+              <w:t>EN23102062</w:t>
+            </w:r>
+          </w:p>
+        </w:tc>
+      </w:tr>
+      <w:tr>
+        <w:trPr>
+          <w:trHeight w:val="440"/>
+          <w:jc w:val="center"/>
+        </w:trPr>
+        <w:tc>
+          <w:tcPr>
+            <w:tcW w:w="3400" w:type="dxa"/>
+            <w:tcBorders>
+              <w:top w:val="single" w:sz="4" w:space="0" w:color="808080"/>
+              <w:left w:val="single" w:sz="4" w:space="0" w:color="808080"/>
+              <w:bottom w:val="single" w:sz="4" w:space="0" w:color="808080"/>
+              <w:right w:val="single" w:sz="4" w:space="0" w:color="808080"/>
+            </w:tcBorders>
+            <w:tcMar>
+              <w:top w:w="80" w:type="dxa"/>
+              <w:left w:w="120" w:type="dxa"/>
+              <w:bottom w:w="80" w:type="dxa"/>
+              <w:right w:w="120" w:type="dxa"/>
+            </w:tcMar>
+            <w:vAlign w:val="center"/>
+          </w:tcPr>
+          <w:p>
+            <w:pPr>
+              <w:spacing w:line="276" w:lineRule="auto"/>
+            </w:pPr>
+            <w:r>
+              <w:rPr>
+                <w:b/>
+                <w:bCs/>
+                <w:sz w:val="22"/>
+                <w:szCs w:val="22"/>
+              </w:rPr>
+              <w:t>Title of the Report</w:t>
+            </w:r>
+          </w:p>
+        </w:tc>
+        <w:tc>
+          <w:tcPr>
+            <w:tcW w:w="5266" w:type="dxa"/>
+            <w:tcBorders>
+              <w:top w:val="single" w:sz="4" w:space="0" w:color="808080"/>
+              <w:left w:val="single" w:sz="4" w:space="0" w:color="808080"/>
+              <w:bottom w:val="single" w:sz="4" w:space="0" w:color="808080"/>
+              <w:right w:val="single" w:sz="4" w:space="0" w:color="808080"/>
+            </w:tcBorders>
+            <w:tcMar>
+              <w:top w:w="80" w:type="dxa"/>
+              <w:left w:w="120" w:type="dxa"/>
+              <w:bottom w:w="80" w:type="dxa"/>
+              <w:right w:w="120" w:type="dxa"/>
+            </w:tcMar>
+            <w:vAlign w:val="center"/>
+          </w:tcPr>
+          <w:p>
+            <w:pPr>
+              <w:spacing w:line="276" w:lineRule="auto"/>
+            </w:pPr>
+            <w:r>
+              <w:rPr>
+                <w:sz w:val="22"/>
+                <w:szCs w:val="22"/>
+              </w:rPr>
+              <w:t>SmartData AI Agent: A Tool-Using Assistant for Data Analysis and Prediction</w:t>
+            </w:r>
+          </w:p>
+        </w:tc>
+      </w:tr>
+      <w:tr>
+        <w:trPr>
+          <w:trHeight w:val="440"/>
+          <w:jc w:val="center"/>
+        </w:trPr>
+        <w:tc>
+          <w:tcPr>
+            <w:tcW w:w="3400" w:type="dxa"/>
+            <w:tcBorders>
+              <w:top w:val="single" w:sz="4" w:space="0" w:color="808080"/>
+              <w:left w:val="single" w:sz="4" w:space="0" w:color="808080"/>
+              <w:bottom w:val="single" w:sz="4" w:space="0" w:color="808080"/>
+              <w:right w:val="single" w:sz="4" w:space="0" w:color="808080"/>
+            </w:tcBorders>
+            <w:tcMar>
+              <w:top w:w="80" w:type="dxa"/>
+              <w:left w:w="120" w:type="dxa"/>
+              <w:bottom w:w="80" w:type="dxa"/>
+              <w:right w:w="120" w:type="dxa"/>
+            </w:tcMar>
+            <w:vAlign w:val="center"/>
+          </w:tcPr>
+          <w:p>
+            <w:pPr>
+              <w:spacing w:line="276" w:lineRule="auto"/>
+            </w:pPr>
+            <w:r>
+              <w:rPr>
+                <w:b/>
+                <w:bCs/>
+                <w:sz w:val="22"/>
+                <w:szCs w:val="22"/>
+              </w:rPr>
+              <w:t>Department</w:t>
+            </w:r>
+          </w:p>
+        </w:tc>
+        <w:tc>
+          <w:tcPr>
+            <w:tcW w:w="5266" w:type="dxa"/>
+            <w:tcBorders>
+              <w:top w:val="single" w:sz="4" w:space="0" w:color="808080"/>
+              <w:left w:val="single" w:sz="4" w:space="0" w:color="808080"/>
+              <w:bottom w:val="single" w:sz="4" w:space="0" w:color="808080"/>
+              <w:right w:val="single" w:sz="4" w:space="0" w:color="808080"/>
+            </w:tcBorders>
+            <w:tcMar>
+              <w:top w:w="80" w:type="dxa"/>
+              <w:left w:w="120" w:type="dxa"/>
+              <w:bottom w:w="80" w:type="dxa"/>
+              <w:right w:w="120" w:type="dxa"/>
+            </w:tcMar>
+            <w:vAlign w:val="center"/>
+          </w:tcPr>
+          <w:p>
+            <w:pPr>
+              <w:spacing w:line="276" w:lineRule="auto"/>
+            </w:pPr>
+            <w:r>
+              <w:rPr>
+                <w:sz w:val="22"/>
+                <w:szCs w:val="22"/>
+              </w:rPr>
+              <w:t>Electronics and Telecommunication Engineering</w:t>
+            </w:r>
+          </w:p>
+        </w:tc>
+      </w:tr>
+      <w:tr>
+        <w:trPr>
+          <w:trHeight w:val="440"/>
+          <w:jc w:val="center"/>
+        </w:trPr>
+        <w:tc>
+          <w:tcPr>
+            <w:tcW w:w="3400" w:type="dxa"/>
+            <w:tcBorders>
+              <w:top w:val="single" w:sz="4" w:space="0" w:color="808080"/>
+              <w:left w:val="single" w:sz="4" w:space="0" w:color="808080"/>
+              <w:bottom w:val="single" w:sz="4" w:space="0" w:color="808080"/>
+              <w:right w:val="single" w:sz="4" w:space="0" w:color="808080"/>
+            </w:tcBorders>
+            <w:tcMar>
+              <w:top w:w="80" w:type="dxa"/>
+              <w:left w:w="120" w:type="dxa"/>
+              <w:bottom w:w="80" w:type="dxa"/>
+              <w:right w:w="120" w:type="dxa"/>
+            </w:tcMar>
+            <w:vAlign w:val="center"/>
+          </w:tcPr>
+          <w:p>
+            <w:pPr>
+              <w:spacing w:line="276" w:lineRule="auto"/>
+            </w:pPr>
+            <w:r>
+              <w:rPr>
+                <w:b/>
+                <w:bCs/>
+                <w:sz w:val="22"/>
+                <w:szCs w:val="22"/>
+              </w:rPr>
+              <w:t>Faculty Guide</w:t>
+            </w:r>
+          </w:p>
+        </w:tc>
+        <w:tc>
+          <w:tcPr>
+            <w:tcW w:w="5266" w:type="dxa"/>
+            <w:tcBorders>
+              <w:top w:val="single" w:sz="4" w:space="0" w:color="808080"/>
+              <w:left w:val="single" w:sz="4" w:space="0" w:color="808080"/>
+              <w:bottom w:val="single" w:sz="4" w:space="0" w:color="808080"/>
+              <w:right w:val="single" w:sz="4" w:space="0" w:color="808080"/>
+            </w:tcBorders>
+            <w:tcMar>
+              <w:top w:w="80" w:type="dxa"/>
+              <w:left w:w="120" w:type="dxa"/>
+              <w:bottom w:w="80" w:type="dxa"/>
+              <w:right w:w="120" w:type="dxa"/>
+            </w:tcMar>
+            <w:vAlign w:val="center"/>
+          </w:tcPr>
+          <w:p>
+            <w:pPr>
+              <w:spacing w:line="276" w:lineRule="auto"/>
+            </w:pPr>
+            <w:r>
+              <w:rPr>
+                <w:sz w:val="22"/>
+                <w:szCs w:val="22"/>
+              </w:rPr>
+              <w:t>Dr. Parshuram Arotale</w:t>
+            </w:r>
+          </w:p>
+        </w:tc>
+      </w:tr>
+      <w:tr>
+        <w:trPr>
+          <w:trHeight w:val="440"/>
+          <w:jc w:val="center"/>
+        </w:trPr>
+        <w:tc>
+          <w:tcPr>
+            <w:tcW w:w="3400" w:type="dxa"/>
+            <w:tcBorders>
+              <w:top w:val="single" w:sz="4" w:space="0" w:color="808080"/>
+              <w:left w:val="single" w:sz="4" w:space="0" w:color="808080"/>
+              <w:bottom w:val="single" w:sz="4" w:space="0" w:color="808080"/>
+              <w:right w:val="single" w:sz="4" w:space="0" w:color="808080"/>
+            </w:tcBorders>
+            <w:tcMar>
+              <w:top w:w="80" w:type="dxa"/>
+              <w:left w:w="120" w:type="dxa"/>
+              <w:bottom w:w="80" w:type="dxa"/>
+              <w:right w:w="120" w:type="dxa"/>
+            </w:tcMar>
+            <w:vAlign w:val="center"/>
+          </w:tcPr>
+          <w:p>
+            <w:pPr>
+              <w:spacing w:line="276" w:lineRule="auto"/>
+            </w:pPr>
+            <w:r>
+              <w:rPr>
+                <w:b/>
+                <w:bCs/>
+                <w:sz w:val="22"/>
+                <w:szCs w:val="22"/>
+              </w:rPr>
+              <w:t>Plagiarism Checking Tool</w:t>
+            </w:r>
+          </w:p>
+        </w:tc>
+        <w:tc>
+          <w:tcPr>
+            <w:tcW w:w="5266" w:type="dxa"/>
+            <w:tcBorders>
+              <w:top w:val="single" w:sz="4" w:space="0" w:color="808080"/>
+              <w:left w:val="single" w:sz="4" w:space="0" w:color="808080"/>
+              <w:bottom w:val="single" w:sz="4" w:space="0" w:color="808080"/>
+              <w:right w:val="single" w:sz="4" w:space="0" w:color="808080"/>
+            </w:tcBorders>
+            <w:tcMar>
+              <w:top w:w="80" w:type="dxa"/>
+              <w:left w:w="120" w:type="dxa"/>
+              <w:bottom w:w="80" w:type="dxa"/>
+              <w:right w:w="120" w:type="dxa"/>
+            </w:tcMar>
+            <w:vAlign w:val="center"/>
+          </w:tcPr>
+          <w:p>
+            <w:pPr>
+              <w:spacing w:line="276" w:lineRule="auto"/>
+            </w:pPr>
+          </w:p>
+        </w:tc>
+      </w:tr>
+      <w:tr>
+        <w:trPr>
+          <w:trHeight w:val="440"/>
+          <w:jc w:val="center"/>
+        </w:trPr>
+        <w:tc>
+          <w:tcPr>
+            <w:tcW w:w="3400" w:type="dxa"/>
+            <w:tcBorders>
+              <w:top w:val="single" w:sz="4" w:space="0" w:color="808080"/>
+              <w:left w:val="single" w:sz="4" w:space="0" w:color="808080"/>
+              <w:bottom w:val="single" w:sz="4" w:space="0" w:color="808080"/>
+              <w:right w:val="single" w:sz="4" w:space="0" w:color="808080"/>
+            </w:tcBorders>
+            <w:tcMar>
+              <w:top w:w="80" w:type="dxa"/>
+              <w:left w:w="120" w:type="dxa"/>
+              <w:bottom w:w="80" w:type="dxa"/>
+              <w:right w:w="120" w:type="dxa"/>
+            </w:tcMar>
+            <w:vAlign w:val="center"/>
+          </w:tcPr>
+          <w:p>
+            <w:pPr>
+              <w:spacing w:line="276" w:lineRule="auto"/>
+            </w:pPr>
+            <w:r>
+              <w:rPr>
+                <w:b/>
+                <w:bCs/>
+                <w:sz w:val="22"/>
+                <w:szCs w:val="22"/>
+              </w:rPr>
+              <w:t>Date of Checking</w:t>
+            </w:r>
+          </w:p>
+        </w:tc>
+        <w:tc>
+          <w:tcPr>
+            <w:tcW w:w="5266" w:type="dxa"/>
+            <w:tcBorders>
+              <w:top w:val="single" w:sz="4" w:space="0" w:color="808080"/>
+              <w:left w:val="single" w:sz="4" w:space="0" w:color="808080"/>
+              <w:bottom w:val="single" w:sz="4" w:space="0" w:color="808080"/>
+              <w:right w:val="single" w:sz="4" w:space="0" w:color="808080"/>
+            </w:tcBorders>
+            <w:tcMar>
+              <w:top w:w="80" w:type="dxa"/>
+              <w:left w:w="120" w:type="dxa"/>
+              <w:bottom w:w="80" w:type="dxa"/>
+              <w:right w:w="120" w:type="dxa"/>
+            </w:tcMar>
+            <w:vAlign w:val="center"/>
+          </w:tcPr>
+          <w:p>
+            <w:pPr>
+              <w:spacing w:line="276" w:lineRule="auto"/>
+            </w:pPr>
+          </w:p>
+        </w:tc>
+      </w:tr>
+      <w:tr>
+        <w:trPr>
+          <w:trHeight w:val="440"/>
+          <w:jc w:val="center"/>
+        </w:trPr>
+        <w:tc>
+          <w:tcPr>
+            <w:tcW w:w="3400" w:type="dxa"/>
+            <w:tcBorders>
+              <w:top w:val="single" w:sz="4" w:space="0" w:color="808080"/>
+              <w:left w:val="single" w:sz="4" w:space="0" w:color="808080"/>
+              <w:bottom w:val="single" w:sz="4" w:space="0" w:color="808080"/>
+              <w:right w:val="single" w:sz="4" w:space="0" w:color="808080"/>
+            </w:tcBorders>
+            <w:tcMar>
+              <w:top w:w="80" w:type="dxa"/>
+              <w:left w:w="120" w:type="dxa"/>
+              <w:bottom w:w="80" w:type="dxa"/>
+              <w:right w:w="120" w:type="dxa"/>
+            </w:tcMar>
+            <w:vAlign w:val="center"/>
+          </w:tcPr>
+          <w:p>
+            <w:pPr>
+              <w:spacing w:line="276" w:lineRule="auto"/>
+            </w:pPr>
+            <w:r>
+              <w:rPr>
+                <w:b/>
+                <w:bCs/>
+                <w:sz w:val="22"/>
+                <w:szCs w:val="22"/>
+              </w:rPr>
+              <w:t>Similarity Index (%)</w:t>
+            </w:r>
+          </w:p>
+        </w:tc>
+        <w:tc>
+          <w:tcPr>
+            <w:tcW w:w="5266" w:type="dxa"/>
+            <w:tcBorders>
+              <w:top w:val="single" w:sz="4" w:space="0" w:color="808080"/>
+              <w:left w:val="single" w:sz="4" w:space="0" w:color="808080"/>
+              <w:bottom w:val="single" w:sz="4" w:space="0" w:color="808080"/>
+              <w:right w:val="single" w:sz="4" w:space="0" w:color="808080"/>
+            </w:tcBorders>
+            <w:tcMar>
+              <w:top w:w="80" w:type="dxa"/>
+              <w:left w:w="120" w:type="dxa"/>
+              <w:bottom w:w="80" w:type="dxa"/>
+              <w:right w:w="120" w:type="dxa"/>
+            </w:tcMar>
+            <w:vAlign w:val="center"/>
+          </w:tcPr>
+          <w:p>
+            <w:pPr>
+              <w:spacing w:line="276" w:lineRule="auto"/>
+            </w:pPr>
+          </w:p>
+        </w:tc>
+      </w:tr>
+      <w:tr>
+        <w:trPr>
+          <w:trHeight w:val="440"/>
+          <w:jc w:val="center"/>
+        </w:trPr>
+        <w:tc>
+          <w:tcPr>
+            <w:tcW w:w="3400" w:type="dxa"/>
+            <w:tcBorders>
+              <w:top w:val="single" w:sz="4" w:space="0" w:color="808080"/>
+              <w:left w:val="single" w:sz="4" w:space="0" w:color="808080"/>
+              <w:bottom w:val="single" w:sz="4" w:space="0" w:color="808080"/>
+              <w:right w:val="single" w:sz="4" w:space="0" w:color="808080"/>
+            </w:tcBorders>
+            <w:tcMar>
+              <w:top w:w="80" w:type="dxa"/>
+              <w:left w:w="120" w:type="dxa"/>
+              <w:bottom w:w="80" w:type="dxa"/>
+              <w:right w:w="120" w:type="dxa"/>
+            </w:tcMar>
+            <w:vAlign w:val="center"/>
+          </w:tcPr>
+          <w:p>
+            <w:pPr>
+              <w:spacing w:line="276" w:lineRule="auto"/>
+            </w:pPr>
+            <w:r>
+              <w:rPr>
+                <w:b/>
+                <w:bCs/>
+                <w:sz w:val="22"/>
+                <w:szCs w:val="22"/>
+              </w:rPr>
+              <w:t>Permissible Limit</w:t>
+            </w:r>
+          </w:p>
+        </w:tc>
+        <w:tc>
+          <w:tcPr>
+            <w:tcW w:w="5266" w:type="dxa"/>
+            <w:tcBorders>
+              <w:top w:val="single" w:sz="4" w:space="0" w:color="808080"/>
+              <w:left w:val="single" w:sz="4" w:space="0" w:color="808080"/>
+              <w:bottom w:val="single" w:sz="4" w:space="0" w:color="808080"/>
+              <w:right w:val="single" w:sz="4" w:space="0" w:color="808080"/>
+            </w:tcBorders>
+            <w:tcMar>
+              <w:top w:w="80" w:type="dxa"/>
+              <w:left w:w="120" w:type="dxa"/>
+              <w:bottom w:w="80" w:type="dxa"/>
+              <w:right w:w="120" w:type="dxa"/>
+            </w:tcMar>
+            <w:vAlign w:val="center"/>
+          </w:tcPr>
+          <w:p>
+            <w:pPr>
+              <w:spacing w:line="276" w:lineRule="auto"/>
+            </w:pPr>
+            <w:r>
+              <w:rPr>
+                <w:sz w:val="22"/>
+                <w:szCs w:val="22"/>
+              </w:rPr>
+              <w:t>Up to 10% (UGC Regulations, 2018)</w:t>
+            </w:r>
+          </w:p>
+        </w:tc>
+      </w:tr>
+      <w:tr>
+        <w:trPr>
+          <w:trHeight w:val="440"/>
+          <w:jc w:val="center"/>
+        </w:trPr>
+        <w:tc>
+          <w:tcPr>
+            <w:tcW w:w="3400" w:type="dxa"/>
+            <w:tcBorders>
+              <w:top w:val="single" w:sz="4" w:space="0" w:color="808080"/>
+              <w:left w:val="single" w:sz="4" w:space="0" w:color="808080"/>
+              <w:bottom w:val="single" w:sz="4" w:space="0" w:color="808080"/>
+              <w:right w:val="single" w:sz="4" w:space="0" w:color="808080"/>
+            </w:tcBorders>
+            <w:tcMar>
+              <w:top w:w="80" w:type="dxa"/>
+              <w:left w:w="120" w:type="dxa"/>
+              <w:bottom w:w="80" w:type="dxa"/>
+              <w:right w:w="120" w:type="dxa"/>
+            </w:tcMar>
+            <w:vAlign w:val="center"/>
+          </w:tcPr>
+          <w:p>
+            <w:pPr>
+              <w:spacing w:line="276" w:lineRule="auto"/>
+            </w:pPr>
+            <w:r>
+              <w:rPr>
+                <w:b/>
+                <w:bCs/>
+                <w:sz w:val="22"/>
+                <w:szCs w:val="22"/>
+              </w:rPr>
+              <w:t>Result (Accepted / Not Accepted)</w:t>
+            </w:r>
+          </w:p>
+        </w:tc>
+        <w:tc>
+          <w:tcPr>
+            <w:tcW w:w="5266" w:type="dxa"/>
+            <w:tcBorders>
+              <w:top w:val="single" w:sz="4" w:space="0" w:color="808080"/>
+              <w:left w:val="single" w:sz="4" w:space="0" w:color="808080"/>
+              <w:bottom w:val="single" w:sz="4" w:space="0" w:color="808080"/>
+              <w:right w:val="single" w:sz="4" w:space="0" w:color="808080"/>
+            </w:tcBorders>
+            <w:tcMar>
+              <w:top w:w="80" w:type="dxa"/>
+              <w:left w:w="120" w:type="dxa"/>
+              <w:bottom w:w="80" w:type="dxa"/>
+              <w:right w:w="120" w:type="dxa"/>
+            </w:tcMar>
+            <w:vAlign w:val="center"/>
+          </w:tcPr>
+          <w:p>
+            <w:pPr>
+              <w:spacing w:line="276" w:lineRule="auto"/>
+            </w:pPr>
+          </w:p>
+        </w:tc>
+      </w:tr>
+    </w:tbl>
+    <w:p>
+      <w:pPr>
+        <w:spacing w:before="240" w:line="360" w:lineRule="auto"/>
+        <w:jc w:val="center"/>
+      </w:pPr>
+      <w:r>
+        <w:rPr>
+          <w:i/>
+          <w:iCs/>
+          <w:color w:val="808080"/>
+          <w:sz w:val="22"/>
+          <w:szCs w:val="22"/>
+        </w:rPr>
+        <w:t>The originality report generated by the plagiarism checking tool is attached after this page.</w:t>
+      </w:r>
+    </w:p>
+    <w:p>
+      <w:pPr>
+        <w:spacing w:before="600" w:line="360" w:lineRule="auto"/>
+        <w:jc w:val="both"/>
+      </w:pPr>
+    </w:p>
+    <w:tbl>
+      <w:tblPr>
+        <w:tblW w:w="8666" w:type="dxa"/>
+        <w:jc w:val="center"/>
+        <w:tblLook w:val="0000" w:firstRow="0" w:lastRow="0" w:firstColumn="0" w:lastColumn="0" w:noHBand="0" w:noVBand="0"/>
+      </w:tblPr>
+      <w:tblGrid>
+        <w:gridCol w:w="2888"/>
+        <w:gridCol w:w="2889"/>
+        <w:gridCol w:w="2889"/>
+      </w:tblGrid>
+      <w:tr>
+        <w:trPr>
+          <w:jc w:val="center"/>
+        </w:trPr>
+        <w:tc>
+          <w:tcPr>
+            <w:tcW w:w="2888" w:type="dxa"/>
+            <w:tcBorders>
+              <w:top w:val="nil"/>
+              <w:left w:val="nil"/>
+              <w:bottom w:val="nil"/>
+              <w:right w:val="nil"/>
+            </w:tcBorders>
+          </w:tcPr>
+          <w:p>
+            <w:pPr>
+              <w:jc w:val="center"/>
+            </w:pPr>
+            <w:r>
+              <w:t>______________________</w:t>
+            </w:r>
+          </w:p>
+          <w:p>
+            <w:pPr>
+              <w:jc w:val="center"/>
+            </w:pPr>
+            <w:r>
+              <w:rPr>
+                <w:b/>
+                <w:bCs/>
+              </w:rPr>
+              <w:t>Student</w:t>
+            </w:r>
+          </w:p>
+        </w:tc>
+        <w:tc>
+          <w:tcPr>
+            <w:tcW w:w="2888" w:type="dxa"/>
+            <w:tcBorders>
+              <w:top w:val="nil"/>
+              <w:left w:val="nil"/>
+              <w:bottom w:val="nil"/>
+              <w:right w:val="nil"/>
+            </w:tcBorders>
+          </w:tcPr>
+          <w:p>
+            <w:pPr>
+              <w:jc w:val="center"/>
+            </w:pPr>
+            <w:r>
+              <w:t>______________________</w:t>
+            </w:r>
+          </w:p>
+          <w:p>
+            <w:pPr>
+              <w:jc w:val="center"/>
+            </w:pPr>
+            <w:r>
+              <w:rPr>
+                <w:b/>
+                <w:bCs/>
+              </w:rPr>
+              <w:t>Faculty Guide</w:t>
+            </w:r>
+          </w:p>
+        </w:tc>
+        <w:tc>
+          <w:tcPr>
+            <w:tcW w:w="2888" w:type="dxa"/>
+            <w:tcBorders>
+              <w:top w:val="nil"/>
+              <w:left w:val="nil"/>
+              <w:bottom w:val="nil"/>
+              <w:right w:val="nil"/>
+            </w:tcBorders>
+          </w:tcPr>
+          <w:p>
+            <w:pPr>
+              <w:jc w:val="center"/>
+            </w:pPr>
+            <w:r>
+              <w:t>______________________</w:t>
+            </w:r>
+          </w:p>
+          <w:p>
+            <w:pPr>
+              <w:jc w:val="center"/>
+            </w:pPr>
+            <w:r>
+              <w:rPr>
+                <w:b/>
+                <w:bCs/>
+              </w:rPr>
+              <w:t>Head of Department</w:t>
+            </w:r>
+          </w:p>
+        </w:tc>
+      </w:tr>
+    </w:tbl>
+    <w:p/>
     <w:sectPr>
       <w:footerReference w:type="default" r:id="rId14"/>
       <w:pgSz w:w="11906" w:h="16838"/>

</xml_diff>